<commit_message>
V3.1.0 - added in customer known issues and RAG priority/critical issues, also added indicative cost summary on front page of report along with executive reasoning
</commit_message>
<xml_diff>
--- a/security_maturity_executive_snapshot_template.docx
+++ b/security_maturity_executive_snapshot_template.docx
@@ -6,9 +6,14 @@
       <w:pPr>
         <w:pStyle w:val="Title"/>
         <w:shd w:val="clear" w:color="auto" w:fill="00516B"/>
+        <w:spacing w:line="400" w:lineRule="atLeast"/>
         <w:jc w:val="center"/>
         <w:rPr>
-          <w:color w:val="0F4761"/>
+          <w:kern w:val="0"/>
+          <w:sz w:val="72"/>
+          <w:szCs w:val="72"/>
+          <w:lang w:eastAsia="en-GB"/>
+          <w14:ligatures w14:val="none"/>
         </w:rPr>
       </w:pPr>
       <w:r>
@@ -16,6 +21,8 @@
           <w:b/>
           <w:bCs/>
           <w:color w:val="FFFFFF"/>
+          <w:sz w:val="44"/>
+          <w:szCs w:val="44"/>
         </w:rPr>
         <w:t>EXECUTIVE SECURITY PRIORITIES SNAPSHOT</w:t>
       </w:r>
@@ -23,17 +30,11 @@
     <w:p>
       <w:pPr>
         <w:pStyle w:val="Subtitle"/>
-        <w:pBdr>
-          <w:top w:val="single" w:sz="2" w:space="0" w:color="F7D117"/>
-          <w:left w:val="single" w:sz="2" w:space="0" w:color="F7D117"/>
-          <w:bottom w:val="single" w:sz="24" w:space="0" w:color="F7D117"/>
-          <w:right w:val="single" w:sz="2" w:space="0" w:color="F7D117"/>
-        </w:pBdr>
         <w:jc w:val="center"/>
         <w:rPr>
           <w:kern w:val="0"/>
-          <w:sz w:val="24"/>
-          <w:szCs w:val="24"/>
+          <w:sz w:val="36"/>
+          <w:szCs w:val="36"/>
           <w:lang w:eastAsia="en-GB"/>
           <w14:ligatures w14:val="none"/>
         </w:rPr>
@@ -41,6 +42,8 @@
       <w:r>
         <w:rPr>
           <w:color w:val="00516B"/>
+          <w:sz w:val="21"/>
+          <w:szCs w:val="21"/>
         </w:rPr>
         <w:t>Board-level summary template aligned to the full Cybersecurity Maturity Assessment report.</w:t>
       </w:r>
@@ -52,12 +55,12 @@
         <w:tblLook w:val="04A0" w:firstRow="1" w:lastRow="0" w:firstColumn="1" w:lastColumn="0" w:noHBand="0" w:noVBand="1"/>
       </w:tblPr>
       <w:tblGrid>
-        <w:gridCol w:w="884"/>
-        <w:gridCol w:w="1657"/>
-        <w:gridCol w:w="925"/>
-        <w:gridCol w:w="2959"/>
-        <w:gridCol w:w="1455"/>
-        <w:gridCol w:w="1136"/>
+        <w:gridCol w:w="768"/>
+        <w:gridCol w:w="2692"/>
+        <w:gridCol w:w="813"/>
+        <w:gridCol w:w="3135"/>
+        <w:gridCol w:w="1417"/>
+        <w:gridCol w:w="1631"/>
       </w:tblGrid>
       <w:tr>
         <w:trPr>
@@ -67,17 +70,27 @@
           <w:tcPr>
             <w:cnfStyle w:val="001000000000" w:firstRow="0" w:lastRow="0" w:firstColumn="1" w:lastColumn="0" w:oddVBand="0" w:evenVBand="0" w:oddHBand="0" w:evenHBand="0" w:firstRowFirstColumn="0" w:firstRowLastColumn="0" w:lastRowFirstColumn="0" w:lastRowLastColumn="0"/>
             <w:tcW w:w="0" w:type="auto"/>
+            <w:tcBorders>
+              <w:top w:val="single" w:sz="4" w:space="0" w:color="156082"/>
+              <w:left w:val="single" w:sz="4" w:space="0" w:color="156082"/>
+              <w:bottom w:val="single" w:sz="4" w:space="0" w:color="156082"/>
+            </w:tcBorders>
             <w:shd w:val="clear" w:color="auto" w:fill="00516B"/>
-            <w:hideMark/>
-          </w:tcPr>
-          <w:p>
-            <w:pPr>
-              <w:spacing w:after="160"/>
-              <w:rPr>
-                <w:color w:val="FFFFFF"/>
+            <w:tcMar>
+              <w:top w:w="0" w:type="dxa"/>
+              <w:left w:w="40" w:type="dxa"/>
+              <w:bottom w:w="0" w:type="dxa"/>
+              <w:right w:w="40" w:type="dxa"/>
+            </w:tcMar>
+            <w:hideMark/>
+          </w:tcPr>
+          <w:p>
+            <w:pPr>
+              <w:spacing w:after="0" w:line="160" w:lineRule="atLeast"/>
+              <w:rPr>
                 <w:kern w:val="0"/>
-                <w:sz w:val="16"/>
-                <w:szCs w:val="16"/>
+                <w:sz w:val="22"/>
+                <w:szCs w:val="22"/>
                 <w:lang w:eastAsia="en-GB"/>
                 <w14:ligatures w14:val="none"/>
               </w:rPr>
@@ -85,8 +98,8 @@
             <w:r>
               <w:rPr>
                 <w:color w:val="FFFFFF"/>
-                <w:sz w:val="16"/>
-                <w:szCs w:val="16"/>
+                <w:sz w:val="22"/>
+                <w:szCs w:val="22"/>
               </w:rPr>
               <w:t>Client</w:t>
             </w:r>
@@ -95,121 +108,176 @@
         <w:tc>
           <w:tcPr>
             <w:tcW w:w="0" w:type="auto"/>
-            <w:hideMark/>
-          </w:tcPr>
-          <w:p>
-            <w:pPr>
-              <w:spacing w:after="160"/>
+            <w:tcBorders>
+              <w:top w:val="single" w:sz="4" w:space="0" w:color="156082"/>
+              <w:bottom w:val="single" w:sz="4" w:space="0" w:color="156082"/>
+            </w:tcBorders>
+            <w:shd w:val="clear" w:color="auto" w:fill="156082"/>
+            <w:tcMar>
+              <w:top w:w="0" w:type="dxa"/>
+              <w:left w:w="40" w:type="dxa"/>
+              <w:bottom w:w="0" w:type="dxa"/>
+              <w:right w:w="40" w:type="dxa"/>
+            </w:tcMar>
+            <w:hideMark/>
+          </w:tcPr>
+          <w:p>
+            <w:pPr>
+              <w:spacing w:after="0"/>
               <w:cnfStyle w:val="100000000000" w:firstRow="1" w:lastRow="0" w:firstColumn="0" w:lastColumn="0" w:oddVBand="0" w:evenVBand="0" w:oddHBand="0" w:evenHBand="0" w:firstRowFirstColumn="0" w:firstRowLastColumn="0" w:lastRowFirstColumn="0" w:lastRowLastColumn="0"/>
               <w:rPr>
-                <w:sz w:val="16"/>
-                <w:szCs w:val="16"/>
-              </w:rPr>
-            </w:pPr>
-            <w:r>
-              <w:rPr>
-                <w:sz w:val="16"/>
-                <w:szCs w:val="16"/>
-              </w:rPr>
-              <w:t>[Client Name]</w:t>
-            </w:r>
-          </w:p>
-        </w:tc>
-        <w:tc>
-          <w:tcPr>
-            <w:tcW w:w="0" w:type="auto"/>
+                <w:kern w:val="0"/>
+                <w:sz w:val="22"/>
+                <w:szCs w:val="18"/>
+                <w:lang w:eastAsia="en-GB"/>
+                <w14:ligatures w14:val="none"/>
+              </w:rPr>
+            </w:pPr>
+            <w:r>
+              <w:rPr>
+                <w:sz w:val="22"/>
+                <w:szCs w:val="22"/>
+              </w:rPr>
+              <w:t>Northbridge Trading Ltd</w:t>
+            </w:r>
+          </w:p>
+        </w:tc>
+        <w:tc>
+          <w:tcPr>
+            <w:tcW w:w="0" w:type="auto"/>
+            <w:tcBorders>
+              <w:top w:val="single" w:sz="4" w:space="0" w:color="156082"/>
+              <w:bottom w:val="single" w:sz="4" w:space="0" w:color="156082"/>
+            </w:tcBorders>
             <w:shd w:val="clear" w:color="auto" w:fill="00516B"/>
-            <w:hideMark/>
-          </w:tcPr>
-          <w:p>
-            <w:pPr>
-              <w:spacing w:after="160"/>
+            <w:tcMar>
+              <w:top w:w="0" w:type="dxa"/>
+              <w:left w:w="40" w:type="dxa"/>
+              <w:bottom w:w="0" w:type="dxa"/>
+              <w:right w:w="40" w:type="dxa"/>
+            </w:tcMar>
+            <w:hideMark/>
+          </w:tcPr>
+          <w:p>
+            <w:pPr>
+              <w:spacing w:after="0" w:line="160" w:lineRule="atLeast"/>
               <w:cnfStyle w:val="100000000000" w:firstRow="1" w:lastRow="0" w:firstColumn="0" w:lastColumn="0" w:oddVBand="0" w:evenVBand="0" w:oddHBand="0" w:evenHBand="0" w:firstRowFirstColumn="0" w:firstRowLastColumn="0" w:lastRowFirstColumn="0" w:lastRowLastColumn="0"/>
               <w:rPr>
+                <w:sz w:val="22"/>
+                <w:szCs w:val="22"/>
+              </w:rPr>
+            </w:pPr>
+            <w:r>
+              <w:rPr>
                 <w:color w:val="FFFFFF"/>
-                <w:sz w:val="16"/>
-                <w:szCs w:val="16"/>
+                <w:sz w:val="22"/>
+                <w:szCs w:val="22"/>
+              </w:rPr>
+              <w:t>Status</w:t>
+            </w:r>
+          </w:p>
+        </w:tc>
+        <w:tc>
+          <w:tcPr>
+            <w:tcW w:w="0" w:type="auto"/>
+            <w:tcBorders>
+              <w:top w:val="single" w:sz="4" w:space="0" w:color="156082"/>
+              <w:bottom w:val="single" w:sz="4" w:space="0" w:color="156082"/>
+            </w:tcBorders>
+            <w:shd w:val="clear" w:color="auto" w:fill="156082"/>
+            <w:tcMar>
+              <w:top w:w="0" w:type="dxa"/>
+              <w:left w:w="40" w:type="dxa"/>
+              <w:bottom w:w="0" w:type="dxa"/>
+              <w:right w:w="40" w:type="dxa"/>
+            </w:tcMar>
+            <w:hideMark/>
+          </w:tcPr>
+          <w:p>
+            <w:pPr>
+              <w:spacing w:after="0" w:line="160" w:lineRule="atLeast"/>
+              <w:cnfStyle w:val="100000000000" w:firstRow="1" w:lastRow="0" w:firstColumn="0" w:lastColumn="0" w:oddVBand="0" w:evenVBand="0" w:oddHBand="0" w:evenHBand="0" w:firstRowFirstColumn="0" w:firstRowLastColumn="0" w:lastRowFirstColumn="0" w:lastRowLastColumn="0"/>
+              <w:rPr>
+                <w:sz w:val="22"/>
+                <w:szCs w:val="22"/>
+              </w:rPr>
+            </w:pPr>
+            <w:r>
+              <w:rPr>
+                <w:sz w:val="22"/>
+                <w:szCs w:val="22"/>
+              </w:rPr>
+              <w:t>Executive Summary Extract</w:t>
+            </w:r>
+          </w:p>
+        </w:tc>
+        <w:tc>
+          <w:tcPr>
+            <w:tcW w:w="0" w:type="auto"/>
+            <w:tcBorders>
+              <w:top w:val="single" w:sz="4" w:space="0" w:color="156082"/>
+              <w:bottom w:val="single" w:sz="4" w:space="0" w:color="156082"/>
+            </w:tcBorders>
+            <w:shd w:val="clear" w:color="auto" w:fill="00516B"/>
+            <w:tcMar>
+              <w:top w:w="0" w:type="dxa"/>
+              <w:left w:w="40" w:type="dxa"/>
+              <w:bottom w:w="0" w:type="dxa"/>
+              <w:right w:w="40" w:type="dxa"/>
+            </w:tcMar>
+            <w:hideMark/>
+          </w:tcPr>
+          <w:p>
+            <w:pPr>
+              <w:spacing w:after="0" w:line="160" w:lineRule="atLeast"/>
+              <w:cnfStyle w:val="100000000000" w:firstRow="1" w:lastRow="0" w:firstColumn="0" w:lastColumn="0" w:oddVBand="0" w:evenVBand="0" w:oddHBand="0" w:evenHBand="0" w:firstRowFirstColumn="0" w:firstRowLastColumn="0" w:lastRowFirstColumn="0" w:lastRowLastColumn="0"/>
+              <w:rPr>
+                <w:sz w:val="22"/>
+                <w:szCs w:val="22"/>
               </w:rPr>
             </w:pPr>
             <w:r>
               <w:rPr>
                 <w:color w:val="FFFFFF"/>
-                <w:sz w:val="16"/>
-                <w:szCs w:val="16"/>
-              </w:rPr>
-              <w:t>Status</w:t>
-            </w:r>
-          </w:p>
-        </w:tc>
-        <w:tc>
-          <w:tcPr>
-            <w:tcW w:w="0" w:type="auto"/>
-            <w:hideMark/>
-          </w:tcPr>
-          <w:p>
-            <w:pPr>
-              <w:spacing w:after="160"/>
+                <w:sz w:val="22"/>
+                <w:szCs w:val="22"/>
+              </w:rPr>
+              <w:t>Prepared by</w:t>
+            </w:r>
+          </w:p>
+        </w:tc>
+        <w:tc>
+          <w:tcPr>
+            <w:tcW w:w="0" w:type="auto"/>
+            <w:tcBorders>
+              <w:top w:val="single" w:sz="4" w:space="0" w:color="156082"/>
+              <w:bottom w:val="single" w:sz="4" w:space="0" w:color="156082"/>
+              <w:right w:val="single" w:sz="4" w:space="0" w:color="156082"/>
+            </w:tcBorders>
+            <w:shd w:val="clear" w:color="auto" w:fill="156082"/>
+            <w:tcMar>
+              <w:top w:w="0" w:type="dxa"/>
+              <w:left w:w="40" w:type="dxa"/>
+              <w:bottom w:w="0" w:type="dxa"/>
+              <w:right w:w="40" w:type="dxa"/>
+            </w:tcMar>
+            <w:hideMark/>
+          </w:tcPr>
+          <w:p>
+            <w:pPr>
+              <w:spacing w:after="0" w:line="160" w:lineRule="atLeast"/>
               <w:cnfStyle w:val="100000000000" w:firstRow="1" w:lastRow="0" w:firstColumn="0" w:lastColumn="0" w:oddVBand="0" w:evenVBand="0" w:oddHBand="0" w:evenHBand="0" w:firstRowFirstColumn="0" w:firstRowLastColumn="0" w:lastRowFirstColumn="0" w:lastRowLastColumn="0"/>
               <w:rPr>
-                <w:sz w:val="16"/>
-                <w:szCs w:val="16"/>
-              </w:rPr>
-            </w:pPr>
-            <w:r>
-              <w:rPr>
-                <w:sz w:val="16"/>
-                <w:szCs w:val="16"/>
-              </w:rPr>
-              <w:t>Executive Summary Extract</w:t>
-            </w:r>
-          </w:p>
-        </w:tc>
-        <w:tc>
-          <w:tcPr>
-            <w:tcW w:w="0" w:type="auto"/>
-            <w:shd w:val="clear" w:color="auto" w:fill="00516B"/>
-            <w:hideMark/>
-          </w:tcPr>
-          <w:p>
-            <w:pPr>
-              <w:spacing w:after="160"/>
-              <w:cnfStyle w:val="100000000000" w:firstRow="1" w:lastRow="0" w:firstColumn="0" w:lastColumn="0" w:oddVBand="0" w:evenVBand="0" w:oddHBand="0" w:evenHBand="0" w:firstRowFirstColumn="0" w:firstRowLastColumn="0" w:lastRowFirstColumn="0" w:lastRowLastColumn="0"/>
-              <w:rPr>
-                <w:color w:val="FFFFFF"/>
-                <w:sz w:val="16"/>
-                <w:szCs w:val="16"/>
-              </w:rPr>
-            </w:pPr>
-            <w:r>
-              <w:rPr>
-                <w:color w:val="FFFFFF"/>
-                <w:sz w:val="16"/>
-                <w:szCs w:val="16"/>
-              </w:rPr>
-              <w:t>Prepared by</w:t>
-            </w:r>
-          </w:p>
-        </w:tc>
-        <w:tc>
-          <w:tcPr>
-            <w:tcW w:w="0" w:type="auto"/>
-            <w:hideMark/>
-          </w:tcPr>
-          <w:p>
-            <w:pPr>
-              <w:spacing w:after="160"/>
-              <w:cnfStyle w:val="100000000000" w:firstRow="1" w:lastRow="0" w:firstColumn="0" w:lastColumn="0" w:oddVBand="0" w:evenVBand="0" w:oddHBand="0" w:evenHBand="0" w:firstRowFirstColumn="0" w:firstRowLastColumn="0" w:lastRowFirstColumn="0" w:lastRowLastColumn="0"/>
-              <w:rPr>
-                <w:sz w:val="16"/>
-                <w:szCs w:val="16"/>
-              </w:rPr>
-            </w:pPr>
-            <w:r>
-              <w:rPr>
-                <w:sz w:val="16"/>
-                <w:szCs w:val="16"/>
-              </w:rPr>
-              <w:t>Planet IT</w:t>
+                <w:sz w:val="22"/>
+                <w:szCs w:val="22"/>
+              </w:rPr>
+            </w:pPr>
+            <w:r>
+              <w:rPr>
+                <w:sz w:val="22"/>
+                <w:szCs w:val="22"/>
+              </w:rPr>
+              <w:t>Bradley Collis</w:t>
             </w:r>
           </w:p>
         </w:tc>
@@ -217,43 +285,32 @@
     </w:tbl>
     <w:p>
       <w:pPr>
-        <w:rPr>
-          <w:kern w:val="0"/>
+        <w:pStyle w:val="Heading1"/>
+        <w:rPr>
+          <w:rFonts w:asciiTheme="minorHAnsi" w:hAnsiTheme="minorHAnsi" w:cstheme="minorBidi"/>
+          <w:kern w:val="36"/>
+          <w:sz w:val="56"/>
+          <w:szCs w:val="56"/>
           <w:lang w:eastAsia="en-GB"/>
           <w14:ligatures w14:val="none"/>
         </w:rPr>
       </w:pPr>
-    </w:p>
-    <w:p>
-      <w:pPr>
-        <w:pStyle w:val="Heading1"/>
+      <w:r>
         <w:rPr>
           <w:rFonts w:asciiTheme="minorHAnsi" w:hAnsiTheme="minorHAnsi" w:cstheme="minorBidi"/>
-          <w:kern w:val="36"/>
-          <w:sz w:val="48"/>
+          <w:sz w:val="32"/>
           <w:szCs w:val="48"/>
-          <w:lang w:eastAsia="en-GB"/>
-          <w14:ligatures w14:val="none"/>
-        </w:rPr>
-      </w:pPr>
-      <w:r>
-        <w:rPr>
-          <w:rFonts w:asciiTheme="minorHAnsi" w:hAnsiTheme="minorHAnsi" w:cstheme="minorBidi"/>
         </w:rPr>
         <w:t>Executive Summary</w:t>
       </w:r>
     </w:p>
     <w:p>
       <w:pPr>
-        <w:pBdr>
-          <w:top w:val="single" w:sz="8" w:space="0" w:color="0F4761"/>
-          <w:left w:val="single" w:sz="8" w:space="0" w:color="0F4761"/>
-          <w:bottom w:val="single" w:sz="8" w:space="0" w:color="0F4761"/>
-          <w:right w:val="single" w:sz="8" w:space="0" w:color="0F4761"/>
-        </w:pBdr>
         <w:shd w:val="clear" w:color="auto" w:fill="EAF3F8"/>
+        <w:spacing w:after="0"/>
         <w:rPr>
           <w:kern w:val="0"/>
+          <w:szCs w:val="18"/>
           <w:lang w:eastAsia="en-GB"/>
           <w14:ligatures w14:val="none"/>
         </w:rPr>
@@ -264,79 +321,35 @@
           <w:sz w:val="20"/>
           <w:szCs w:val="20"/>
         </w:rPr>
-        <w:t xml:space="preserve">The assessment shows a stable security foundation, but three risks </w:t>
+        <w:t>Northbridge Trading Ltd has a credible security baseline, supported by Fortinet-managed perimeter controls, Webroot EDR, Kanji/</w:t>
       </w:r>
+      <w:proofErr w:type="spellStart"/>
       <w:r>
         <w:rPr>
           <w:color w:val="000000"/>
           <w:sz w:val="20"/>
           <w:szCs w:val="20"/>
         </w:rPr>
-        <w:t xml:space="preserve">now </w:t>
+        <w:t>Iru</w:t>
       </w:r>
+      <w:proofErr w:type="spellEnd"/>
       <w:r>
         <w:rPr>
           <w:color w:val="000000"/>
           <w:sz w:val="20"/>
           <w:szCs w:val="20"/>
         </w:rPr>
-        <w:t xml:space="preserve">require </w:t>
-      </w:r>
-      <w:r>
-        <w:rPr>
-          <w:color w:val="000000"/>
-          <w:sz w:val="20"/>
-          <w:szCs w:val="20"/>
-        </w:rPr>
-        <w:t xml:space="preserve">decisive </w:t>
-      </w:r>
-      <w:r>
-        <w:rPr>
-          <w:color w:val="000000"/>
-          <w:sz w:val="20"/>
-          <w:szCs w:val="20"/>
-        </w:rPr>
-        <w:t xml:space="preserve">executive </w:t>
-      </w:r>
-      <w:r>
-        <w:rPr>
-          <w:color w:val="000000"/>
-          <w:sz w:val="20"/>
-          <w:szCs w:val="20"/>
-        </w:rPr>
-        <w:t>action</w:t>
-      </w:r>
-      <w:r>
-        <w:rPr>
-          <w:color w:val="000000"/>
-          <w:sz w:val="20"/>
-          <w:szCs w:val="20"/>
-        </w:rPr>
-        <w:t xml:space="preserve">: Microsoft 365 recovery resilience, phishing-led identity compromise, and incident response readiness. </w:t>
-      </w:r>
-      <w:r>
-        <w:rPr>
-          <w:color w:val="000000"/>
-          <w:sz w:val="20"/>
-          <w:szCs w:val="20"/>
-        </w:rPr>
-        <w:t>These are not cosmetic improvements; left unchanged, they create avoidable exposure to operational disruption, data recovery uncertainty and slower containment during a material incident. Focused investment in these areas is required to reduce business risk, improve assurance and give leadership confidence that the organisation can recover quickly and evidence control under pressure.</w:t>
+        <w:t xml:space="preserve"> patching, Veeam and QNAP recovery foundations, annual penetration testing, Cyber Essentials Plus activity and broad Google SSO adoption. The assessment identifies three executive priorities that now require focused action: out-of-hours monitoring and response, incident and recovery readiness, and FTP and privileged-access controls. These gaps do not indicate a need for wholesale replacement, but they do create avoidable uncertainty around containment speed, recovery sequencing and customer-data protection during a material incident.</w:t>
       </w:r>
     </w:p>
     <w:p>
       <w:pPr>
-        <w:pBdr>
-          <w:top w:val="single" w:sz="8" w:space="0" w:color="C00000"/>
-          <w:left w:val="single" w:sz="8" w:space="0" w:color="C00000"/>
-          <w:bottom w:val="single" w:sz="8" w:space="0" w:color="C00000"/>
-          <w:right w:val="single" w:sz="8" w:space="0" w:color="C00000"/>
-        </w:pBdr>
         <w:shd w:val="clear" w:color="auto" w:fill="FCE4D6"/>
-        <w:rPr>
-          <w:color w:val="000000"/>
+        <w:spacing w:after="0" w:line="180" w:lineRule="atLeast"/>
+        <w:rPr>
           <w:kern w:val="0"/>
-          <w:sz w:val="18"/>
-          <w:szCs w:val="18"/>
+          <w:sz w:val="21"/>
+          <w:szCs w:val="21"/>
           <w:lang w:eastAsia="en-GB"/>
           <w14:ligatures w14:val="none"/>
         </w:rPr>
@@ -346,28 +359,147 @@
           <w:b/>
           <w:bCs/>
           <w:color w:val="000000"/>
-          <w:sz w:val="18"/>
-          <w:szCs w:val="18"/>
+          <w:sz w:val="20"/>
+          <w:szCs w:val="20"/>
         </w:rPr>
         <w:t>Executive decision required:</w:t>
       </w:r>
       <w:r>
         <w:rPr>
           <w:color w:val="000000"/>
-          <w:sz w:val="18"/>
-          <w:szCs w:val="18"/>
-        </w:rPr>
-        <w:t xml:space="preserve"> approve immediate remediation planning and funding for the three priority risks. Delaying action leaves a known exposure in recovery, compromise detection and incident response capability.</w:t>
+          <w:sz w:val="20"/>
+          <w:szCs w:val="20"/>
+        </w:rPr>
+        <w:t xml:space="preserve"> approve a scoped discovery and remediation planning exercise covering MDR readiness, incident-response rehearsal, FTP remediation, vulnerability visibility and Google Workspace recovery assurance. This will confirm costs, sequencing, ownership and decision points for funded change.</w:t>
+      </w:r>
+    </w:p>
+    <w:p>
+      <w:pPr>
+        <w:spacing w:after="0" w:line="180" w:lineRule="atLeast"/>
+        <w:rPr>
+          <w:b/>
+          <w:bCs/>
+          <w:sz w:val="20"/>
+          <w:szCs w:val="20"/>
+        </w:rPr>
+      </w:pPr>
+    </w:p>
+    <w:p>
+      <w:pPr>
+        <w:spacing w:after="0" w:line="180" w:lineRule="atLeast"/>
+        <w:jc w:val="center"/>
+        <w:rPr>
+          <w:b/>
+          <w:bCs/>
+          <w:sz w:val="20"/>
+          <w:szCs w:val="20"/>
+        </w:rPr>
+      </w:pPr>
+      <w:r>
+        <w:rPr>
+          <w:rFonts w:asciiTheme="minorHAnsi" w:hAnsiTheme="minorHAnsi"/>
+          <w:noProof/>
+          <w:sz w:val="21"/>
+          <w:szCs w:val="32"/>
+        </w:rPr>
+        <w:drawing>
+          <wp:inline distT="0" distB="0" distL="0" distR="0" wp14:anchorId="011C836A" wp14:editId="0CF9AC7C">
+            <wp:extent cx="2224044" cy="1482962"/>
+            <wp:effectExtent l="0" t="0" r="0" b="3175"/>
+            <wp:docPr id="1" name="Picture 1"/>
+            <wp:cNvGraphicFramePr>
+              <a:graphicFrameLocks xmlns:a="http://schemas.openxmlformats.org/drawingml/2006/main" noChangeAspect="1"/>
+            </wp:cNvGraphicFramePr>
+            <a:graphic xmlns:a="http://schemas.openxmlformats.org/drawingml/2006/main">
+              <a:graphicData uri="http://schemas.openxmlformats.org/drawingml/2006/picture">
+                <pic:pic xmlns:pic="http://schemas.openxmlformats.org/drawingml/2006/picture">
+                  <pic:nvPicPr>
+                    <pic:cNvPr id="0" name="Picture 1"/>
+                    <pic:cNvPicPr>
+                      <a:picLocks noChangeAspect="1" noChangeArrowheads="1"/>
+                    </pic:cNvPicPr>
+                  </pic:nvPicPr>
+                  <pic:blipFill>
+                    <a:blip r:embed="rId6" cstate="print">
+                      <a:extLst>
+                        <a:ext uri="{28A0092B-C50C-407E-A947-70E740481C1C}">
+                          <a14:useLocalDpi xmlns:a14="http://schemas.microsoft.com/office/drawing/2010/main" val="0"/>
+                        </a:ext>
+                      </a:extLst>
+                    </a:blip>
+                    <a:srcRect/>
+                    <a:stretch>
+                      <a:fillRect/>
+                    </a:stretch>
+                  </pic:blipFill>
+                  <pic:spPr bwMode="auto">
+                    <a:xfrm>
+                      <a:off x="0" y="0"/>
+                      <a:ext cx="2269934" cy="1513561"/>
+                    </a:xfrm>
+                    <a:prstGeom prst="rect">
+                      <a:avLst/>
+                    </a:prstGeom>
+                    <a:noFill/>
+                    <a:ln>
+                      <a:noFill/>
+                    </a:ln>
+                  </pic:spPr>
+                </pic:pic>
+              </a:graphicData>
+            </a:graphic>
+          </wp:inline>
+        </w:drawing>
+      </w:r>
+    </w:p>
+    <w:p>
+      <w:pPr>
+        <w:spacing w:after="0" w:line="180" w:lineRule="atLeast"/>
+        <w:rPr>
+          <w:kern w:val="0"/>
+          <w:sz w:val="21"/>
+          <w:szCs w:val="21"/>
+          <w:lang w:eastAsia="en-GB"/>
+          <w14:ligatures w14:val="none"/>
+        </w:rPr>
+      </w:pPr>
+      <w:r>
+        <w:rPr>
+          <w:b/>
+          <w:bCs/>
+          <w:sz w:val="20"/>
+          <w:szCs w:val="20"/>
+        </w:rPr>
+        <w:t>Overall indicative weighted score: 60/100 – Established, with targeted gaps requiring validation</w:t>
+      </w:r>
+    </w:p>
+    <w:p>
+      <w:pPr>
+        <w:spacing w:line="180" w:lineRule="atLeast"/>
+        <w:rPr>
+          <w:kern w:val="0"/>
+          <w:sz w:val="21"/>
+          <w:szCs w:val="21"/>
+          <w:lang w:eastAsia="en-GB"/>
+          <w14:ligatures w14:val="none"/>
+        </w:rPr>
+      </w:pPr>
+      <w:r>
+        <w:rPr>
+          <w:sz w:val="20"/>
+          <w:szCs w:val="20"/>
+        </w:rPr>
+        <w:t>This score is a consultant-led, point-in-time maturity judgement based on the assessment discussion and supporting notes. It is not a certification score or an independently tested technical rating. The weighting gives greater emphasis to controls that affect operational continuity, incident response, identity compromise and client-data exposure; individual domain scores should therefore be used to prioritise assurance work rather than as precise measures of control effectiveness.</w:t>
       </w:r>
     </w:p>
     <w:p>
       <w:pPr>
         <w:pStyle w:val="Heading1"/>
         <w:rPr>
-          <w:rFonts w:asciiTheme="minorHAnsi" w:hAnsiTheme="minorHAnsi" w:cstheme="minorBidi"/>
+          <w:rFonts w:cstheme="minorBidi"/>
           <w:kern w:val="36"/>
-          <w:sz w:val="48"/>
-          <w:szCs w:val="48"/>
+          <w:sz w:val="28"/>
+          <w:szCs w:val="28"/>
           <w:lang w:eastAsia="en-GB"/>
           <w14:ligatures w14:val="none"/>
         </w:rPr>
@@ -375,6 +507,8 @@
       <w:r>
         <w:rPr>
           <w:rFonts w:cstheme="minorBidi"/>
+          <w:sz w:val="28"/>
+          <w:szCs w:val="44"/>
         </w:rPr>
         <w:t>Top Three Risks: RAG Prioritisation</w:t>
       </w:r>
@@ -386,11 +520,11 @@
         <w:tblLook w:val="04A0" w:firstRow="1" w:lastRow="0" w:firstColumn="1" w:lastColumn="0" w:noHBand="0" w:noVBand="1"/>
       </w:tblPr>
       <w:tblGrid>
-        <w:gridCol w:w="806"/>
-        <w:gridCol w:w="788"/>
-        <w:gridCol w:w="1485"/>
+        <w:gridCol w:w="870"/>
+        <w:gridCol w:w="852"/>
+        <w:gridCol w:w="1484"/>
+        <w:gridCol w:w="3980"/>
         <w:gridCol w:w="3270"/>
-        <w:gridCol w:w="2667"/>
       </w:tblGrid>
       <w:tr>
         <w:trPr>
@@ -408,8 +542,8 @@
               <w:rPr>
                 <w:color w:val="FFFFFF"/>
                 <w:kern w:val="0"/>
-                <w:sz w:val="18"/>
-                <w:szCs w:val="18"/>
+                <w:sz w:val="20"/>
+                <w:szCs w:val="20"/>
                 <w:lang w:eastAsia="en-GB"/>
                 <w14:ligatures w14:val="none"/>
               </w:rPr>
@@ -417,8 +551,8 @@
             <w:r>
               <w:rPr>
                 <w:color w:val="FFFFFF"/>
-                <w:sz w:val="18"/>
-                <w:szCs w:val="18"/>
+                <w:sz w:val="20"/>
+                <w:szCs w:val="20"/>
               </w:rPr>
               <w:t>RAG</w:t>
             </w:r>
@@ -435,15 +569,15 @@
               <w:cnfStyle w:val="100000000000" w:firstRow="1" w:lastRow="0" w:firstColumn="0" w:lastColumn="0" w:oddVBand="0" w:evenVBand="0" w:oddHBand="0" w:evenHBand="0" w:firstRowFirstColumn="0" w:firstRowLastColumn="0" w:lastRowFirstColumn="0" w:lastRowLastColumn="0"/>
               <w:rPr>
                 <w:color w:val="FFFFFF"/>
-                <w:sz w:val="18"/>
-                <w:szCs w:val="18"/>
+                <w:sz w:val="20"/>
+                <w:szCs w:val="20"/>
               </w:rPr>
             </w:pPr>
             <w:r>
               <w:rPr>
                 <w:color w:val="FFFFFF"/>
-                <w:sz w:val="18"/>
-                <w:szCs w:val="18"/>
+                <w:sz w:val="20"/>
+                <w:szCs w:val="20"/>
               </w:rPr>
               <w:t>Weight</w:t>
             </w:r>
@@ -460,15 +594,15 @@
               <w:cnfStyle w:val="100000000000" w:firstRow="1" w:lastRow="0" w:firstColumn="0" w:lastColumn="0" w:oddVBand="0" w:evenVBand="0" w:oddHBand="0" w:evenHBand="0" w:firstRowFirstColumn="0" w:firstRowLastColumn="0" w:lastRowFirstColumn="0" w:lastRowLastColumn="0"/>
               <w:rPr>
                 <w:color w:val="FFFFFF"/>
-                <w:sz w:val="18"/>
-                <w:szCs w:val="18"/>
+                <w:sz w:val="20"/>
+                <w:szCs w:val="20"/>
               </w:rPr>
             </w:pPr>
             <w:r>
               <w:rPr>
                 <w:color w:val="FFFFFF"/>
-                <w:sz w:val="18"/>
-                <w:szCs w:val="18"/>
+                <w:sz w:val="20"/>
+                <w:szCs w:val="20"/>
               </w:rPr>
               <w:t>Risk</w:t>
             </w:r>
@@ -485,15 +619,15 @@
               <w:cnfStyle w:val="100000000000" w:firstRow="1" w:lastRow="0" w:firstColumn="0" w:lastColumn="0" w:oddVBand="0" w:evenVBand="0" w:oddHBand="0" w:evenHBand="0" w:firstRowFirstColumn="0" w:firstRowLastColumn="0" w:lastRowFirstColumn="0" w:lastRowLastColumn="0"/>
               <w:rPr>
                 <w:color w:val="FFFFFF"/>
-                <w:sz w:val="18"/>
-                <w:szCs w:val="18"/>
+                <w:sz w:val="20"/>
+                <w:szCs w:val="20"/>
               </w:rPr>
             </w:pPr>
             <w:r>
               <w:rPr>
                 <w:color w:val="FFFFFF"/>
-                <w:sz w:val="18"/>
-                <w:szCs w:val="18"/>
+                <w:sz w:val="20"/>
+                <w:szCs w:val="20"/>
               </w:rPr>
               <w:t>Current Position / Impact</w:t>
             </w:r>
@@ -510,15 +644,15 @@
               <w:cnfStyle w:val="100000000000" w:firstRow="1" w:lastRow="0" w:firstColumn="0" w:lastColumn="0" w:oddVBand="0" w:evenVBand="0" w:oddHBand="0" w:evenHBand="0" w:firstRowFirstColumn="0" w:firstRowLastColumn="0" w:lastRowFirstColumn="0" w:lastRowLastColumn="0"/>
               <w:rPr>
                 <w:color w:val="FFFFFF"/>
-                <w:sz w:val="18"/>
-                <w:szCs w:val="18"/>
+                <w:sz w:val="20"/>
+                <w:szCs w:val="20"/>
               </w:rPr>
             </w:pPr>
             <w:r>
               <w:rPr>
                 <w:color w:val="FFFFFF"/>
-                <w:sz w:val="18"/>
-                <w:szCs w:val="18"/>
+                <w:sz w:val="20"/>
+                <w:szCs w:val="20"/>
               </w:rPr>
               <w:t>Recommended Solution</w:t>
             </w:r>
@@ -533,6 +667,19 @@
           <w:tcPr>
             <w:cnfStyle w:val="001000000000" w:firstRow="0" w:lastRow="0" w:firstColumn="1" w:lastColumn="0" w:oddVBand="0" w:evenVBand="0" w:oddHBand="0" w:evenHBand="0" w:firstRowFirstColumn="0" w:firstRowLastColumn="0" w:lastRowFirstColumn="0" w:lastRowLastColumn="0"/>
             <w:tcW w:w="0" w:type="auto"/>
+            <w:tcBorders>
+              <w:top w:val="single" w:sz="4" w:space="0" w:color="7F0000"/>
+              <w:left w:val="single" w:sz="4" w:space="0" w:color="7F0000"/>
+              <w:bottom w:val="single" w:sz="4" w:space="0" w:color="7F0000"/>
+              <w:right w:val="single" w:sz="4" w:space="0" w:color="7F0000"/>
+            </w:tcBorders>
+            <w:shd w:val="clear" w:color="auto" w:fill="C00000"/>
+            <w:tcMar>
+              <w:top w:w="0" w:type="dxa"/>
+              <w:left w:w="108" w:type="dxa"/>
+              <w:bottom w:w="0" w:type="dxa"/>
+              <w:right w:w="108" w:type="dxa"/>
+            </w:tcMar>
             <w:hideMark/>
           </w:tcPr>
           <w:p>
@@ -540,16 +687,16 @@
               <w:spacing w:after="160"/>
               <w:jc w:val="center"/>
               <w:rPr>
+                <w:color w:val="FFFFFF" w:themeColor="background1"/>
+                <w:sz w:val="20"/>
+                <w:szCs w:val="20"/>
+              </w:rPr>
+            </w:pPr>
+            <w:r>
+              <w:rPr>
                 <w:color w:val="FFFFFF"/>
-                <w:sz w:val="18"/>
-                <w:szCs w:val="18"/>
-              </w:rPr>
-            </w:pPr>
-            <w:r>
-              <w:rPr>
-                <w:color w:val="FFFFFF"/>
-                <w:sz w:val="18"/>
-                <w:szCs w:val="18"/>
+                <w:sz w:val="20"/>
+                <w:szCs w:val="20"/>
               </w:rPr>
               <w:t>RED</w:t>
             </w:r>
@@ -558,238 +705,379 @@
         <w:tc>
           <w:tcPr>
             <w:tcW w:w="0" w:type="auto"/>
+            <w:tcBorders>
+              <w:top w:val="single" w:sz="4" w:space="0" w:color="7F0000"/>
+              <w:left w:val="single" w:sz="4" w:space="0" w:color="7F0000"/>
+              <w:bottom w:val="single" w:sz="4" w:space="0" w:color="7F0000"/>
+              <w:right w:val="single" w:sz="4" w:space="0" w:color="7F0000"/>
+            </w:tcBorders>
+            <w:shd w:val="clear" w:color="auto" w:fill="F4CCCC"/>
+            <w:tcMar>
+              <w:top w:w="0" w:type="dxa"/>
+              <w:left w:w="108" w:type="dxa"/>
+              <w:bottom w:w="0" w:type="dxa"/>
+              <w:right w:w="108" w:type="dxa"/>
+            </w:tcMar>
+            <w:hideMark/>
+          </w:tcPr>
+          <w:p>
+            <w:pPr>
+              <w:jc w:val="center"/>
+              <w:cnfStyle w:val="000000100000" w:firstRow="0" w:lastRow="0" w:firstColumn="0" w:lastColumn="0" w:oddVBand="0" w:evenVBand="0" w:oddHBand="1" w:evenHBand="0" w:firstRowFirstColumn="0" w:firstRowLastColumn="0" w:lastRowFirstColumn="0" w:lastRowLastColumn="0"/>
+              <w:rPr>
+                <w:color w:val="FFFFFF" w:themeColor="background1"/>
+                <w:sz w:val="20"/>
+                <w:szCs w:val="20"/>
+              </w:rPr>
+            </w:pPr>
+            <w:r>
+              <w:rPr>
+                <w:b/>
+                <w:bCs/>
+                <w:color w:val="000000"/>
+                <w:sz w:val="20"/>
+                <w:szCs w:val="20"/>
+              </w:rPr>
+              <w:t>40%</w:t>
+            </w:r>
+          </w:p>
+        </w:tc>
+        <w:tc>
+          <w:tcPr>
+            <w:tcW w:w="0" w:type="auto"/>
+            <w:tcBorders>
+              <w:top w:val="single" w:sz="4" w:space="0" w:color="7F0000"/>
+              <w:left w:val="single" w:sz="4" w:space="0" w:color="7F0000"/>
+              <w:bottom w:val="single" w:sz="4" w:space="0" w:color="7F0000"/>
+              <w:right w:val="single" w:sz="4" w:space="0" w:color="7F0000"/>
+            </w:tcBorders>
+            <w:shd w:val="clear" w:color="auto" w:fill="F4CCCC"/>
+            <w:tcMar>
+              <w:top w:w="0" w:type="dxa"/>
+              <w:left w:w="108" w:type="dxa"/>
+              <w:bottom w:w="0" w:type="dxa"/>
+              <w:right w:w="108" w:type="dxa"/>
+            </w:tcMar>
+            <w:hideMark/>
+          </w:tcPr>
+          <w:p>
+            <w:pPr>
+              <w:cnfStyle w:val="000000100000" w:firstRow="0" w:lastRow="0" w:firstColumn="0" w:lastColumn="0" w:oddVBand="0" w:evenVBand="0" w:oddHBand="1" w:evenHBand="0" w:firstRowFirstColumn="0" w:firstRowLastColumn="0" w:lastRowFirstColumn="0" w:lastRowLastColumn="0"/>
+              <w:rPr>
+                <w:color w:val="FFFFFF" w:themeColor="background1"/>
+                <w:sz w:val="20"/>
+                <w:szCs w:val="20"/>
+              </w:rPr>
+            </w:pPr>
+            <w:r>
+              <w:rPr>
+                <w:b/>
+                <w:bCs/>
+                <w:color w:val="000000"/>
+                <w:sz w:val="20"/>
+                <w:szCs w:val="20"/>
+              </w:rPr>
+              <w:t>Out-of-hours monitoring and response</w:t>
+            </w:r>
+          </w:p>
+        </w:tc>
+        <w:tc>
+          <w:tcPr>
+            <w:tcW w:w="0" w:type="auto"/>
+            <w:tcBorders>
+              <w:top w:val="single" w:sz="4" w:space="0" w:color="7F0000"/>
+              <w:left w:val="single" w:sz="4" w:space="0" w:color="7F0000"/>
+              <w:bottom w:val="single" w:sz="4" w:space="0" w:color="7F0000"/>
+              <w:right w:val="single" w:sz="4" w:space="0" w:color="7F0000"/>
+            </w:tcBorders>
+            <w:shd w:val="clear" w:color="auto" w:fill="F4CCCC"/>
+            <w:tcMar>
+              <w:top w:w="0" w:type="dxa"/>
+              <w:left w:w="108" w:type="dxa"/>
+              <w:bottom w:w="0" w:type="dxa"/>
+              <w:right w:w="108" w:type="dxa"/>
+            </w:tcMar>
+            <w:hideMark/>
+          </w:tcPr>
+          <w:p>
+            <w:pPr>
+              <w:cnfStyle w:val="000000100000" w:firstRow="0" w:lastRow="0" w:firstColumn="0" w:lastColumn="0" w:oddVBand="0" w:evenVBand="0" w:oddHBand="1" w:evenHBand="0" w:firstRowFirstColumn="0" w:firstRowLastColumn="0" w:lastRowFirstColumn="0" w:lastRowLastColumn="0"/>
+              <w:rPr>
+                <w:color w:val="FFFFFF" w:themeColor="background1"/>
+                <w:sz w:val="20"/>
+                <w:szCs w:val="20"/>
+              </w:rPr>
+            </w:pPr>
+            <w:r>
+              <w:rPr>
+                <w:color w:val="000000"/>
+                <w:sz w:val="20"/>
+                <w:szCs w:val="20"/>
+              </w:rPr>
+              <w:t>Working-hours review is in place through Freshdesk, Webroot and Google Workspace, but there is no dedicated 24/7 SOC or MDR coverage. Overnight or weekend incidents may therefore take longer to identify, investigate and contain.</w:t>
+            </w:r>
+          </w:p>
+        </w:tc>
+        <w:tc>
+          <w:tcPr>
+            <w:tcW w:w="0" w:type="auto"/>
+            <w:tcBorders>
+              <w:top w:val="single" w:sz="4" w:space="0" w:color="7F0000"/>
+              <w:left w:val="single" w:sz="4" w:space="0" w:color="7F0000"/>
+              <w:bottom w:val="single" w:sz="4" w:space="0" w:color="7F0000"/>
+              <w:right w:val="single" w:sz="4" w:space="0" w:color="7F0000"/>
+            </w:tcBorders>
+            <w:shd w:val="clear" w:color="auto" w:fill="F4CCCC"/>
+            <w:tcMar>
+              <w:top w:w="0" w:type="dxa"/>
+              <w:left w:w="108" w:type="dxa"/>
+              <w:bottom w:w="0" w:type="dxa"/>
+              <w:right w:w="108" w:type="dxa"/>
+            </w:tcMar>
+            <w:hideMark/>
+          </w:tcPr>
+          <w:p>
+            <w:pPr>
+              <w:cnfStyle w:val="000000100000" w:firstRow="0" w:lastRow="0" w:firstColumn="0" w:lastColumn="0" w:oddVBand="0" w:evenVBand="0" w:oddHBand="1" w:evenHBand="0" w:firstRowFirstColumn="0" w:firstRowLastColumn="0" w:lastRowFirstColumn="0" w:lastRowLastColumn="0"/>
+              <w:rPr>
+                <w:color w:val="FFFFFF" w:themeColor="background1"/>
+                <w:sz w:val="20"/>
+                <w:szCs w:val="20"/>
+              </w:rPr>
+            </w:pPr>
+            <w:r>
+              <w:rPr>
+                <w:color w:val="000000"/>
+                <w:sz w:val="20"/>
+                <w:szCs w:val="20"/>
+              </w:rPr>
+              <w:t xml:space="preserve">Validate endpoint, firewall, Google Workspace, Freshdesk, email and cloud telemetry; define escalation and containment authority; and compare internal, </w:t>
+            </w:r>
+            <w:proofErr w:type="gramStart"/>
+            <w:r>
+              <w:rPr>
+                <w:color w:val="000000"/>
+                <w:sz w:val="20"/>
+                <w:szCs w:val="20"/>
+              </w:rPr>
+              <w:t>retained-response</w:t>
+            </w:r>
+            <w:proofErr w:type="gramEnd"/>
+            <w:r>
+              <w:rPr>
+                <w:color w:val="000000"/>
+                <w:sz w:val="20"/>
+                <w:szCs w:val="20"/>
+              </w:rPr>
+              <w:t xml:space="preserve"> and MDR options.</w:t>
+            </w:r>
+          </w:p>
+        </w:tc>
+      </w:tr>
+      <w:tr>
+        <w:tc>
+          <w:tcPr>
+            <w:cnfStyle w:val="001000000000" w:firstRow="0" w:lastRow="0" w:firstColumn="1" w:lastColumn="0" w:oddVBand="0" w:evenVBand="0" w:oddHBand="0" w:evenHBand="0" w:firstRowFirstColumn="0" w:firstRowLastColumn="0" w:lastRowFirstColumn="0" w:lastRowLastColumn="0"/>
+            <w:tcW w:w="0" w:type="auto"/>
+            <w:tcBorders>
+              <w:top w:val="single" w:sz="4" w:space="0" w:color="D9A300"/>
+              <w:left w:val="single" w:sz="4" w:space="0" w:color="D9A300"/>
+              <w:bottom w:val="single" w:sz="4" w:space="0" w:color="D9A300"/>
+              <w:right w:val="single" w:sz="4" w:space="0" w:color="D9A300"/>
+            </w:tcBorders>
+            <w:shd w:val="clear" w:color="auto" w:fill="FFC000"/>
+            <w:tcMar>
+              <w:top w:w="0" w:type="dxa"/>
+              <w:left w:w="108" w:type="dxa"/>
+              <w:bottom w:w="0" w:type="dxa"/>
+              <w:right w:w="108" w:type="dxa"/>
+            </w:tcMar>
             <w:hideMark/>
           </w:tcPr>
           <w:p>
             <w:pPr>
               <w:spacing w:after="160"/>
               <w:jc w:val="center"/>
-              <w:cnfStyle w:val="000000100000" w:firstRow="0" w:lastRow="0" w:firstColumn="0" w:lastColumn="0" w:oddVBand="0" w:evenVBand="0" w:oddHBand="1" w:evenHBand="0" w:firstRowFirstColumn="0" w:firstRowLastColumn="0" w:lastRowFirstColumn="0" w:lastRowLastColumn="0"/>
-              <w:rPr>
-                <w:sz w:val="18"/>
-                <w:szCs w:val="18"/>
+              <w:rPr>
+                <w:color w:val="000000"/>
+                <w:sz w:val="20"/>
+                <w:szCs w:val="20"/>
+              </w:rPr>
+            </w:pPr>
+            <w:r>
+              <w:rPr>
+                <w:color w:val="000000"/>
+                <w:sz w:val="20"/>
+                <w:szCs w:val="20"/>
+              </w:rPr>
+              <w:t>AMBER</w:t>
+            </w:r>
+          </w:p>
+        </w:tc>
+        <w:tc>
+          <w:tcPr>
+            <w:tcW w:w="0" w:type="auto"/>
+            <w:tcBorders>
+              <w:top w:val="single" w:sz="4" w:space="0" w:color="D9A300"/>
+              <w:left w:val="single" w:sz="4" w:space="0" w:color="D9A300"/>
+              <w:bottom w:val="single" w:sz="4" w:space="0" w:color="D9A300"/>
+              <w:right w:val="single" w:sz="4" w:space="0" w:color="D9A300"/>
+            </w:tcBorders>
+            <w:shd w:val="clear" w:color="auto" w:fill="FFF2CC"/>
+            <w:tcMar>
+              <w:top w:w="0" w:type="dxa"/>
+              <w:left w:w="108" w:type="dxa"/>
+              <w:bottom w:w="0" w:type="dxa"/>
+              <w:right w:w="108" w:type="dxa"/>
+            </w:tcMar>
+            <w:hideMark/>
+          </w:tcPr>
+          <w:p>
+            <w:pPr>
+              <w:jc w:val="center"/>
+              <w:cnfStyle w:val="000000000000" w:firstRow="0" w:lastRow="0" w:firstColumn="0" w:lastColumn="0" w:oddVBand="0" w:evenVBand="0" w:oddHBand="0" w:evenHBand="0" w:firstRowFirstColumn="0" w:firstRowLastColumn="0" w:lastRowFirstColumn="0" w:lastRowLastColumn="0"/>
+              <w:rPr>
+                <w:sz w:val="20"/>
+                <w:szCs w:val="20"/>
               </w:rPr>
             </w:pPr>
             <w:r>
               <w:rPr>
                 <w:b/>
                 <w:bCs/>
-                <w:sz w:val="18"/>
-                <w:szCs w:val="18"/>
-              </w:rPr>
-              <w:t>40%</w:t>
-            </w:r>
-          </w:p>
-        </w:tc>
-        <w:tc>
-          <w:tcPr>
-            <w:tcW w:w="0" w:type="auto"/>
-            <w:hideMark/>
-          </w:tcPr>
-          <w:p>
-            <w:pPr>
-              <w:spacing w:after="160"/>
-              <w:cnfStyle w:val="000000100000" w:firstRow="0" w:lastRow="0" w:firstColumn="0" w:lastColumn="0" w:oddVBand="0" w:evenVBand="0" w:oddHBand="1" w:evenHBand="0" w:firstRowFirstColumn="0" w:firstRowLastColumn="0" w:lastRowFirstColumn="0" w:lastRowLastColumn="0"/>
-              <w:rPr>
-                <w:sz w:val="18"/>
-                <w:szCs w:val="18"/>
+                <w:color w:val="000000"/>
+                <w:sz w:val="20"/>
+                <w:szCs w:val="20"/>
+              </w:rPr>
+              <w:t>35%</w:t>
+            </w:r>
+          </w:p>
+        </w:tc>
+        <w:tc>
+          <w:tcPr>
+            <w:tcW w:w="0" w:type="auto"/>
+            <w:tcBorders>
+              <w:top w:val="single" w:sz="4" w:space="0" w:color="D9A300"/>
+              <w:left w:val="single" w:sz="4" w:space="0" w:color="D9A300"/>
+              <w:bottom w:val="single" w:sz="4" w:space="0" w:color="D9A300"/>
+              <w:right w:val="single" w:sz="4" w:space="0" w:color="D9A300"/>
+            </w:tcBorders>
+            <w:shd w:val="clear" w:color="auto" w:fill="FFF2CC"/>
+            <w:tcMar>
+              <w:top w:w="0" w:type="dxa"/>
+              <w:left w:w="108" w:type="dxa"/>
+              <w:bottom w:w="0" w:type="dxa"/>
+              <w:right w:w="108" w:type="dxa"/>
+            </w:tcMar>
+            <w:hideMark/>
+          </w:tcPr>
+          <w:p>
+            <w:pPr>
+              <w:cnfStyle w:val="000000000000" w:firstRow="0" w:lastRow="0" w:firstColumn="0" w:lastColumn="0" w:oddVBand="0" w:evenVBand="0" w:oddHBand="0" w:evenHBand="0" w:firstRowFirstColumn="0" w:firstRowLastColumn="0" w:lastRowFirstColumn="0" w:lastRowLastColumn="0"/>
+              <w:rPr>
+                <w:sz w:val="20"/>
+                <w:szCs w:val="20"/>
               </w:rPr>
             </w:pPr>
             <w:r>
               <w:rPr>
                 <w:b/>
                 <w:bCs/>
-                <w:sz w:val="18"/>
-                <w:szCs w:val="18"/>
-              </w:rPr>
-              <w:t>Microsoft 365 backup and recovery</w:t>
-            </w:r>
-          </w:p>
-        </w:tc>
-        <w:tc>
-          <w:tcPr>
-            <w:tcW w:w="0" w:type="auto"/>
-            <w:hideMark/>
-          </w:tcPr>
-          <w:p>
-            <w:pPr>
-              <w:spacing w:after="160"/>
-              <w:cnfStyle w:val="000000100000" w:firstRow="0" w:lastRow="0" w:firstColumn="0" w:lastColumn="0" w:oddVBand="0" w:evenVBand="0" w:oddHBand="1" w:evenHBand="0" w:firstRowFirstColumn="0" w:firstRowLastColumn="0" w:lastRowFirstColumn="0" w:lastRowLastColumn="0"/>
-              <w:rPr>
-                <w:sz w:val="18"/>
-                <w:szCs w:val="18"/>
-              </w:rPr>
-            </w:pPr>
-            <w:r>
-              <w:rPr>
-                <w:sz w:val="18"/>
-                <w:szCs w:val="18"/>
-              </w:rPr>
-              <w:t>No dedicated Microsoft 365 backup is in place. Recovery depends on retention and versioning, creating critical exposure if email, Teams, SharePoint, OneDrive or Dynamics data is deleted, corrupted or encrypted.</w:t>
-            </w:r>
-          </w:p>
-        </w:tc>
-        <w:tc>
-          <w:tcPr>
-            <w:tcW w:w="0" w:type="auto"/>
-            <w:hideMark/>
-          </w:tcPr>
-          <w:p>
-            <w:pPr>
-              <w:spacing w:after="160"/>
-              <w:cnfStyle w:val="000000100000" w:firstRow="0" w:lastRow="0" w:firstColumn="0" w:lastColumn="0" w:oddVBand="0" w:evenVBand="0" w:oddHBand="1" w:evenHBand="0" w:firstRowFirstColumn="0" w:firstRowLastColumn="0" w:lastRowFirstColumn="0" w:lastRowLastColumn="0"/>
-              <w:rPr>
-                <w:sz w:val="18"/>
-                <w:szCs w:val="18"/>
-              </w:rPr>
-            </w:pPr>
-            <w:r>
-              <w:rPr>
-                <w:sz w:val="18"/>
-                <w:szCs w:val="18"/>
-              </w:rPr>
-              <w:t>Define workload recovery requirements, agree RTO/RPO targets, evaluate Microsoft 365 backup options and test representative restores.</w:t>
-            </w:r>
-          </w:p>
-        </w:tc>
-      </w:tr>
-      <w:tr>
-        <w:tc>
-          <w:tcPr>
-            <w:cnfStyle w:val="001000000000" w:firstRow="0" w:lastRow="0" w:firstColumn="1" w:lastColumn="0" w:oddVBand="0" w:evenVBand="0" w:oddHBand="0" w:evenHBand="0" w:firstRowFirstColumn="0" w:firstRowLastColumn="0" w:lastRowFirstColumn="0" w:lastRowLastColumn="0"/>
-            <w:tcW w:w="0" w:type="auto"/>
-            <w:hideMark/>
-          </w:tcPr>
-          <w:p>
-            <w:pPr>
-              <w:spacing w:after="160"/>
-              <w:jc w:val="center"/>
-              <w:rPr>
                 <w:color w:val="000000"/>
-                <w:sz w:val="18"/>
-                <w:szCs w:val="18"/>
+                <w:sz w:val="20"/>
+                <w:szCs w:val="20"/>
+              </w:rPr>
+              <w:t>Incident and recovery readiness</w:t>
+            </w:r>
+          </w:p>
+        </w:tc>
+        <w:tc>
+          <w:tcPr>
+            <w:tcW w:w="0" w:type="auto"/>
+            <w:tcBorders>
+              <w:top w:val="single" w:sz="4" w:space="0" w:color="D9A300"/>
+              <w:left w:val="single" w:sz="4" w:space="0" w:color="D9A300"/>
+              <w:bottom w:val="single" w:sz="4" w:space="0" w:color="D9A300"/>
+              <w:right w:val="single" w:sz="4" w:space="0" w:color="D9A300"/>
+            </w:tcBorders>
+            <w:shd w:val="clear" w:color="auto" w:fill="FFF2CC"/>
+            <w:tcMar>
+              <w:top w:w="0" w:type="dxa"/>
+              <w:left w:w="108" w:type="dxa"/>
+              <w:bottom w:w="0" w:type="dxa"/>
+              <w:right w:w="108" w:type="dxa"/>
+            </w:tcMar>
+            <w:hideMark/>
+          </w:tcPr>
+          <w:p>
+            <w:pPr>
+              <w:cnfStyle w:val="000000000000" w:firstRow="0" w:lastRow="0" w:firstColumn="0" w:lastColumn="0" w:oddVBand="0" w:evenVBand="0" w:oddHBand="0" w:evenHBand="0" w:firstRowFirstColumn="0" w:firstRowLastColumn="0" w:lastRowFirstColumn="0" w:lastRowLastColumn="0"/>
+              <w:rPr>
+                <w:sz w:val="20"/>
+                <w:szCs w:val="20"/>
               </w:rPr>
             </w:pPr>
             <w:r>
               <w:rPr>
                 <w:color w:val="000000"/>
-                <w:sz w:val="18"/>
-                <w:szCs w:val="18"/>
-              </w:rPr>
-              <w:t>AMBER</w:t>
-            </w:r>
-          </w:p>
-        </w:tc>
-        <w:tc>
-          <w:tcPr>
-            <w:tcW w:w="0" w:type="auto"/>
-            <w:hideMark/>
-          </w:tcPr>
-          <w:p>
-            <w:pPr>
-              <w:spacing w:after="160"/>
-              <w:jc w:val="center"/>
+                <w:sz w:val="20"/>
+                <w:szCs w:val="20"/>
+              </w:rPr>
+              <w:t xml:space="preserve">Incident-response documentation is in progress, but it has not yet been validated with directors and business </w:t>
+            </w:r>
+            <w:proofErr w:type="gramStart"/>
+            <w:r>
+              <w:rPr>
+                <w:color w:val="000000"/>
+                <w:sz w:val="20"/>
+                <w:szCs w:val="20"/>
+              </w:rPr>
+              <w:t>decision-makers</w:t>
+            </w:r>
+            <w:proofErr w:type="gramEnd"/>
+            <w:r>
+              <w:rPr>
+                <w:color w:val="000000"/>
+                <w:sz w:val="20"/>
+                <w:szCs w:val="20"/>
+              </w:rPr>
+              <w:t>. Recovery order, supplier escalation, insurer engagement and customer communication decisions need to be rehearsed before a live incident.</w:t>
+            </w:r>
+          </w:p>
+        </w:tc>
+        <w:tc>
+          <w:tcPr>
+            <w:tcW w:w="0" w:type="auto"/>
+            <w:tcBorders>
+              <w:top w:val="single" w:sz="4" w:space="0" w:color="D9A300"/>
+              <w:left w:val="single" w:sz="4" w:space="0" w:color="D9A300"/>
+              <w:bottom w:val="single" w:sz="4" w:space="0" w:color="D9A300"/>
+              <w:right w:val="single" w:sz="4" w:space="0" w:color="D9A300"/>
+            </w:tcBorders>
+            <w:shd w:val="clear" w:color="auto" w:fill="FFF2CC"/>
+            <w:tcMar>
+              <w:top w:w="0" w:type="dxa"/>
+              <w:left w:w="108" w:type="dxa"/>
+              <w:bottom w:w="0" w:type="dxa"/>
+              <w:right w:w="108" w:type="dxa"/>
+            </w:tcMar>
+            <w:hideMark/>
+          </w:tcPr>
+          <w:p>
+            <w:pPr>
               <w:cnfStyle w:val="000000000000" w:firstRow="0" w:lastRow="0" w:firstColumn="0" w:lastColumn="0" w:oddVBand="0" w:evenVBand="0" w:oddHBand="0" w:evenHBand="0" w:firstRowFirstColumn="0" w:firstRowLastColumn="0" w:lastRowFirstColumn="0" w:lastRowLastColumn="0"/>
               <w:rPr>
-                <w:sz w:val="18"/>
-                <w:szCs w:val="18"/>
-              </w:rPr>
-            </w:pPr>
-            <w:r>
-              <w:rPr>
-                <w:b/>
-                <w:bCs/>
-                <w:sz w:val="18"/>
-                <w:szCs w:val="18"/>
-              </w:rPr>
-              <w:t>35%</w:t>
-            </w:r>
-          </w:p>
-        </w:tc>
-        <w:tc>
-          <w:tcPr>
-            <w:tcW w:w="0" w:type="auto"/>
-            <w:hideMark/>
-          </w:tcPr>
-          <w:p>
-            <w:pPr>
-              <w:spacing w:after="160"/>
-              <w:cnfStyle w:val="000000000000" w:firstRow="0" w:lastRow="0" w:firstColumn="0" w:lastColumn="0" w:oddVBand="0" w:evenVBand="0" w:oddHBand="0" w:evenHBand="0" w:firstRowFirstColumn="0" w:firstRowLastColumn="0" w:lastRowFirstColumn="0" w:lastRowLastColumn="0"/>
-              <w:rPr>
-                <w:sz w:val="18"/>
-                <w:szCs w:val="18"/>
-              </w:rPr>
-            </w:pPr>
-            <w:r>
-              <w:rPr>
-                <w:b/>
-                <w:bCs/>
-                <w:sz w:val="18"/>
-                <w:szCs w:val="18"/>
-              </w:rPr>
-              <w:t>Phishing and identity compromise</w:t>
-            </w:r>
-          </w:p>
-        </w:tc>
-        <w:tc>
-          <w:tcPr>
-            <w:tcW w:w="0" w:type="auto"/>
-            <w:hideMark/>
-          </w:tcPr>
-          <w:p>
-            <w:pPr>
-              <w:spacing w:after="160"/>
-              <w:cnfStyle w:val="000000000000" w:firstRow="0" w:lastRow="0" w:firstColumn="0" w:lastColumn="0" w:oddVBand="0" w:evenVBand="0" w:oddHBand="0" w:evenHBand="0" w:firstRowFirstColumn="0" w:firstRowLastColumn="0" w:lastRowFirstColumn="0" w:lastRowLastColumn="0"/>
-              <w:rPr>
-                <w:sz w:val="18"/>
-                <w:szCs w:val="18"/>
-              </w:rPr>
-            </w:pPr>
-            <w:r>
-              <w:rPr>
-                <w:sz w:val="18"/>
-                <w:szCs w:val="18"/>
-              </w:rPr>
-              <w:t xml:space="preserve">MFA and conditional access are progressing, but phishing emails are reaching </w:t>
-            </w:r>
-            <w:proofErr w:type="gramStart"/>
-            <w:r>
-              <w:rPr>
-                <w:sz w:val="18"/>
-                <w:szCs w:val="18"/>
-              </w:rPr>
-              <w:t>users</w:t>
-            </w:r>
-            <w:proofErr w:type="gramEnd"/>
-            <w:r>
-              <w:rPr>
-                <w:sz w:val="18"/>
-                <w:szCs w:val="18"/>
-              </w:rPr>
-              <w:t xml:space="preserve"> and some SaaS, OAuth and mailbox controls require further assurance.</w:t>
-            </w:r>
-          </w:p>
-        </w:tc>
-        <w:tc>
-          <w:tcPr>
-            <w:tcW w:w="0" w:type="auto"/>
-            <w:hideMark/>
-          </w:tcPr>
-          <w:p>
-            <w:pPr>
-              <w:spacing w:after="160"/>
-              <w:cnfStyle w:val="000000000000" w:firstRow="0" w:lastRow="0" w:firstColumn="0" w:lastColumn="0" w:oddVBand="0" w:evenVBand="0" w:oddHBand="0" w:evenHBand="0" w:firstRowFirstColumn="0" w:firstRowLastColumn="0" w:lastRowFirstColumn="0" w:lastRowLastColumn="0"/>
-              <w:rPr>
-                <w:sz w:val="18"/>
-                <w:szCs w:val="18"/>
-              </w:rPr>
-            </w:pPr>
-            <w:r>
-              <w:rPr>
-                <w:sz w:val="18"/>
-                <w:szCs w:val="18"/>
-              </w:rPr>
-              <w:t>Review Defender settings, complete the MFA audit, strengthen OAuth/mailbox controls and compare email security options.</w:t>
+                <w:sz w:val="20"/>
+                <w:szCs w:val="20"/>
+              </w:rPr>
+            </w:pPr>
+            <w:r>
+              <w:rPr>
+                <w:color w:val="000000"/>
+                <w:sz w:val="20"/>
+                <w:szCs w:val="20"/>
+              </w:rPr>
+              <w:t>Run an executive tabletop exercise, agree decision owners and recovery priorities, create practical playbooks and use downtime-cost modelling to support the MDR business case.</w:t>
             </w:r>
           </w:p>
         </w:tc>
@@ -802,6 +1090,19 @@
           <w:tcPr>
             <w:cnfStyle w:val="001000000000" w:firstRow="0" w:lastRow="0" w:firstColumn="1" w:lastColumn="0" w:oddVBand="0" w:evenVBand="0" w:oddHBand="0" w:evenHBand="0" w:firstRowFirstColumn="0" w:firstRowLastColumn="0" w:lastRowFirstColumn="0" w:lastRowLastColumn="0"/>
             <w:tcW w:w="0" w:type="auto"/>
+            <w:tcBorders>
+              <w:top w:val="single" w:sz="4" w:space="0" w:color="D9A300"/>
+              <w:left w:val="single" w:sz="4" w:space="0" w:color="D9A300"/>
+              <w:bottom w:val="single" w:sz="4" w:space="0" w:color="D9A300"/>
+              <w:right w:val="single" w:sz="4" w:space="0" w:color="D9A300"/>
+            </w:tcBorders>
+            <w:shd w:val="clear" w:color="auto" w:fill="FFC000"/>
+            <w:tcMar>
+              <w:top w:w="0" w:type="dxa"/>
+              <w:left w:w="108" w:type="dxa"/>
+              <w:bottom w:w="0" w:type="dxa"/>
+              <w:right w:w="108" w:type="dxa"/>
+            </w:tcMar>
             <w:hideMark/>
           </w:tcPr>
           <w:p>
@@ -810,15 +1111,15 @@
               <w:jc w:val="center"/>
               <w:rPr>
                 <w:color w:val="000000"/>
-                <w:sz w:val="18"/>
-                <w:szCs w:val="18"/>
+                <w:sz w:val="20"/>
+                <w:szCs w:val="20"/>
               </w:rPr>
             </w:pPr>
             <w:r>
               <w:rPr>
                 <w:color w:val="000000"/>
-                <w:sz w:val="18"/>
-                <w:szCs w:val="18"/>
+                <w:sz w:val="20"/>
+                <w:szCs w:val="20"/>
               </w:rPr>
               <w:t>AMBER</w:t>
             </w:r>
@@ -827,6 +1128,19 @@
         <w:tc>
           <w:tcPr>
             <w:tcW w:w="0" w:type="auto"/>
+            <w:tcBorders>
+              <w:top w:val="single" w:sz="4" w:space="0" w:color="D9A300"/>
+              <w:left w:val="single" w:sz="4" w:space="0" w:color="D9A300"/>
+              <w:bottom w:val="single" w:sz="4" w:space="0" w:color="D9A300"/>
+              <w:right w:val="single" w:sz="4" w:space="0" w:color="D9A300"/>
+            </w:tcBorders>
+            <w:shd w:val="clear" w:color="auto" w:fill="FFF2CC"/>
+            <w:tcMar>
+              <w:top w:w="0" w:type="dxa"/>
+              <w:left w:w="108" w:type="dxa"/>
+              <w:bottom w:w="0" w:type="dxa"/>
+              <w:right w:w="108" w:type="dxa"/>
+            </w:tcMar>
             <w:hideMark/>
           </w:tcPr>
           <w:p>
@@ -835,16 +1149,17 @@
               <w:jc w:val="center"/>
               <w:cnfStyle w:val="000000100000" w:firstRow="0" w:lastRow="0" w:firstColumn="0" w:lastColumn="0" w:oddVBand="0" w:evenVBand="0" w:oddHBand="1" w:evenHBand="0" w:firstRowFirstColumn="0" w:firstRowLastColumn="0" w:lastRowFirstColumn="0" w:lastRowLastColumn="0"/>
               <w:rPr>
-                <w:sz w:val="18"/>
-                <w:szCs w:val="18"/>
+                <w:sz w:val="20"/>
+                <w:szCs w:val="20"/>
               </w:rPr>
             </w:pPr>
             <w:r>
               <w:rPr>
                 <w:b/>
                 <w:bCs/>
-                <w:sz w:val="18"/>
-                <w:szCs w:val="18"/>
+                <w:color w:val="000000"/>
+                <w:sz w:val="20"/>
+                <w:szCs w:val="20"/>
               </w:rPr>
               <w:t>25%</w:t>
             </w:r>
@@ -853,71 +1168,110 @@
         <w:tc>
           <w:tcPr>
             <w:tcW w:w="0" w:type="auto"/>
-            <w:hideMark/>
-          </w:tcPr>
-          <w:p>
-            <w:pPr>
-              <w:spacing w:after="160"/>
+            <w:tcBorders>
+              <w:top w:val="single" w:sz="4" w:space="0" w:color="D9A300"/>
+              <w:left w:val="single" w:sz="4" w:space="0" w:color="D9A300"/>
+              <w:bottom w:val="single" w:sz="4" w:space="0" w:color="D9A300"/>
+              <w:right w:val="single" w:sz="4" w:space="0" w:color="D9A300"/>
+            </w:tcBorders>
+            <w:shd w:val="clear" w:color="auto" w:fill="FFF2CC"/>
+            <w:tcMar>
+              <w:top w:w="0" w:type="dxa"/>
+              <w:left w:w="108" w:type="dxa"/>
+              <w:bottom w:w="0" w:type="dxa"/>
+              <w:right w:w="108" w:type="dxa"/>
+            </w:tcMar>
+            <w:hideMark/>
+          </w:tcPr>
+          <w:p>
+            <w:pPr>
               <w:cnfStyle w:val="000000100000" w:firstRow="0" w:lastRow="0" w:firstColumn="0" w:lastColumn="0" w:oddVBand="0" w:evenVBand="0" w:oddHBand="1" w:evenHBand="0" w:firstRowFirstColumn="0" w:firstRowLastColumn="0" w:lastRowFirstColumn="0" w:lastRowLastColumn="0"/>
               <w:rPr>
-                <w:sz w:val="18"/>
-                <w:szCs w:val="18"/>
+                <w:sz w:val="20"/>
+                <w:szCs w:val="20"/>
               </w:rPr>
             </w:pPr>
             <w:r>
               <w:rPr>
                 <w:b/>
                 <w:bCs/>
-                <w:sz w:val="18"/>
-                <w:szCs w:val="18"/>
-              </w:rPr>
-              <w:t>IR, DR and MDR readiness</w:t>
-            </w:r>
-          </w:p>
-        </w:tc>
-        <w:tc>
-          <w:tcPr>
-            <w:tcW w:w="0" w:type="auto"/>
-            <w:hideMark/>
-          </w:tcPr>
-          <w:p>
-            <w:pPr>
-              <w:spacing w:after="160"/>
+                <w:color w:val="000000"/>
+                <w:sz w:val="20"/>
+                <w:szCs w:val="20"/>
+              </w:rPr>
+              <w:t>FTP and privileged-access controls</w:t>
+            </w:r>
+          </w:p>
+        </w:tc>
+        <w:tc>
+          <w:tcPr>
+            <w:tcW w:w="0" w:type="auto"/>
+            <w:tcBorders>
+              <w:top w:val="single" w:sz="4" w:space="0" w:color="D9A300"/>
+              <w:left w:val="single" w:sz="4" w:space="0" w:color="D9A300"/>
+              <w:bottom w:val="single" w:sz="4" w:space="0" w:color="D9A300"/>
+              <w:right w:val="single" w:sz="4" w:space="0" w:color="D9A300"/>
+            </w:tcBorders>
+            <w:shd w:val="clear" w:color="auto" w:fill="FFF2CC"/>
+            <w:tcMar>
+              <w:top w:w="0" w:type="dxa"/>
+              <w:left w:w="108" w:type="dxa"/>
+              <w:bottom w:w="0" w:type="dxa"/>
+              <w:right w:w="108" w:type="dxa"/>
+            </w:tcMar>
+            <w:hideMark/>
+          </w:tcPr>
+          <w:p>
+            <w:pPr>
               <w:cnfStyle w:val="000000100000" w:firstRow="0" w:lastRow="0" w:firstColumn="0" w:lastColumn="0" w:oddVBand="0" w:evenVBand="0" w:oddHBand="1" w:evenHBand="0" w:firstRowFirstColumn="0" w:firstRowLastColumn="0" w:lastRowFirstColumn="0" w:lastRowLastColumn="0"/>
               <w:rPr>
-                <w:sz w:val="18"/>
-                <w:szCs w:val="18"/>
-              </w:rPr>
-            </w:pPr>
-            <w:r>
-              <w:rPr>
-                <w:sz w:val="18"/>
-                <w:szCs w:val="18"/>
-              </w:rPr>
-              <w:t>Response and recovery arrangements exist, but roles, escalation, supplier coordination and full recovery exercises are not yet consistently tested.</w:t>
-            </w:r>
-          </w:p>
-        </w:tc>
-        <w:tc>
-          <w:tcPr>
-            <w:tcW w:w="0" w:type="auto"/>
-            <w:hideMark/>
-          </w:tcPr>
-          <w:p>
-            <w:pPr>
-              <w:spacing w:after="160"/>
+                <w:sz w:val="20"/>
+                <w:szCs w:val="20"/>
+              </w:rPr>
+            </w:pPr>
+            <w:r>
+              <w:rPr>
+                <w:color w:val="000000"/>
+                <w:sz w:val="20"/>
+                <w:szCs w:val="20"/>
+              </w:rPr>
+              <w:t>Google SSO and MFA cover many supported services, but the internal FTP server remains a material MFA exception and local administrator-password renewal is not yet formalised. Compromised credentials could expose customer files and production data.</w:t>
+            </w:r>
+          </w:p>
+        </w:tc>
+        <w:tc>
+          <w:tcPr>
+            <w:tcW w:w="0" w:type="auto"/>
+            <w:tcBorders>
+              <w:top w:val="single" w:sz="4" w:space="0" w:color="D9A300"/>
+              <w:left w:val="single" w:sz="4" w:space="0" w:color="D9A300"/>
+              <w:bottom w:val="single" w:sz="4" w:space="0" w:color="D9A300"/>
+              <w:right w:val="single" w:sz="4" w:space="0" w:color="D9A300"/>
+            </w:tcBorders>
+            <w:shd w:val="clear" w:color="auto" w:fill="FFF2CC"/>
+            <w:tcMar>
+              <w:top w:w="0" w:type="dxa"/>
+              <w:left w:w="108" w:type="dxa"/>
+              <w:bottom w:w="0" w:type="dxa"/>
+              <w:right w:w="108" w:type="dxa"/>
+            </w:tcMar>
+            <w:hideMark/>
+          </w:tcPr>
+          <w:p>
+            <w:pPr>
               <w:cnfStyle w:val="000000100000" w:firstRow="0" w:lastRow="0" w:firstColumn="0" w:lastColumn="0" w:oddVBand="0" w:evenVBand="0" w:oddHBand="1" w:evenHBand="0" w:firstRowFirstColumn="0" w:firstRowLastColumn="0" w:lastRowFirstColumn="0" w:lastRowLastColumn="0"/>
               <w:rPr>
-                <w:sz w:val="18"/>
-                <w:szCs w:val="18"/>
-              </w:rPr>
-            </w:pPr>
-            <w:r>
-              <w:rPr>
-                <w:sz w:val="18"/>
-                <w:szCs w:val="18"/>
-              </w:rPr>
-              <w:t>Create practical playbooks, run a tabletop exercise, validate telemetry and evaluate MDR for 24/7 guided response.</w:t>
+                <w:sz w:val="20"/>
+                <w:szCs w:val="20"/>
+              </w:rPr>
+            </w:pPr>
+            <w:r>
+              <w:rPr>
+                <w:color w:val="000000"/>
+                <w:sz w:val="20"/>
+                <w:szCs w:val="20"/>
+              </w:rPr>
+              <w:t>Secure or replace the FTP route, formalise administrator-password renewal, document SaaS MFA exceptions and include privileged-access review within the security improvement register.</w:t>
             </w:r>
           </w:p>
         </w:tc>
@@ -926,10 +1280,284 @@
     <w:p>
       <w:pPr>
         <w:rPr>
+          <w:sz w:val="21"/>
+          <w:szCs w:val="32"/>
+        </w:rPr>
+      </w:pPr>
+    </w:p>
+    <w:p>
+      <w:pPr>
+        <w:rPr>
+          <w:sz w:val="21"/>
+          <w:szCs w:val="32"/>
+        </w:rPr>
+      </w:pPr>
+    </w:p>
+    <w:p>
+      <w:pPr>
+        <w:rPr>
+          <w:sz w:val="21"/>
+          <w:szCs w:val="32"/>
+        </w:rPr>
+      </w:pPr>
+    </w:p>
+    <w:tbl>
+      <w:tblPr>
+        <w:tblStyle w:val="GridTable4-Accent1"/>
+        <w:tblW w:w="5000" w:type="pct"/>
+        <w:tblLook w:val="04A0" w:firstRow="1" w:lastRow="0" w:firstColumn="1" w:lastColumn="0" w:noHBand="0" w:noVBand="1"/>
+      </w:tblPr>
+      <w:tblGrid>
+        <w:gridCol w:w="465"/>
+        <w:gridCol w:w="3220"/>
+        <w:gridCol w:w="709"/>
+        <w:gridCol w:w="2874"/>
+        <w:gridCol w:w="700"/>
+        <w:gridCol w:w="2488"/>
+      </w:tblGrid>
+      <w:tr>
+        <w:trPr>
+          <w:cnfStyle w:val="100000000000" w:firstRow="1" w:lastRow="0" w:firstColumn="0" w:lastColumn="0" w:oddVBand="0" w:evenVBand="0" w:oddHBand="0" w:evenHBand="0" w:firstRowFirstColumn="0" w:firstRowLastColumn="0" w:lastRowFirstColumn="0" w:lastRowLastColumn="0"/>
+        </w:trPr>
+        <w:tc>
+          <w:tcPr>
+            <w:cnfStyle w:val="001000000000" w:firstRow="0" w:lastRow="0" w:firstColumn="1" w:lastColumn="0" w:oddVBand="0" w:evenVBand="0" w:oddHBand="0" w:evenHBand="0" w:firstRowFirstColumn="0" w:firstRowLastColumn="0" w:lastRowFirstColumn="0" w:lastRowLastColumn="0"/>
+            <w:tcW w:w="0" w:type="auto"/>
+            <w:tcBorders>
+              <w:top w:val="single" w:sz="4" w:space="0" w:color="7F0000"/>
+              <w:left w:val="single" w:sz="4" w:space="0" w:color="7F0000"/>
+              <w:bottom w:val="single" w:sz="4" w:space="0" w:color="7F0000"/>
+              <w:right w:val="single" w:sz="4" w:space="0" w:color="7F0000"/>
+            </w:tcBorders>
+            <w:shd w:val="clear" w:color="auto" w:fill="C00000"/>
+            <w:tcMar>
+              <w:top w:w="0" w:type="dxa"/>
+              <w:left w:w="60" w:type="dxa"/>
+              <w:bottom w:w="0" w:type="dxa"/>
+              <w:right w:w="60" w:type="dxa"/>
+            </w:tcMar>
+            <w:hideMark/>
+          </w:tcPr>
+          <w:p>
+            <w:pPr>
+              <w:spacing w:after="0" w:line="160" w:lineRule="atLeast"/>
+              <w:rPr>
+                <w:kern w:val="0"/>
+                <w:sz w:val="21"/>
+                <w:szCs w:val="21"/>
+                <w:lang w:eastAsia="en-GB"/>
+                <w14:ligatures w14:val="none"/>
+              </w:rPr>
+            </w:pPr>
+            <w:r>
+              <w:rPr>
+                <w:color w:val="FFFFFF"/>
+                <w:szCs w:val="18"/>
+              </w:rPr>
+              <w:t>RED</w:t>
+            </w:r>
+          </w:p>
+        </w:tc>
+        <w:tc>
+          <w:tcPr>
+            <w:tcW w:w="0" w:type="auto"/>
+            <w:tcBorders>
+              <w:top w:val="single" w:sz="4" w:space="0" w:color="7F0000"/>
+              <w:left w:val="single" w:sz="4" w:space="0" w:color="7F0000"/>
+              <w:bottom w:val="single" w:sz="4" w:space="0" w:color="7F0000"/>
+              <w:right w:val="single" w:sz="4" w:space="0" w:color="7F0000"/>
+            </w:tcBorders>
+            <w:shd w:val="clear" w:color="auto" w:fill="F4CCCC"/>
+            <w:tcMar>
+              <w:top w:w="0" w:type="dxa"/>
+              <w:left w:w="60" w:type="dxa"/>
+              <w:bottom w:w="0" w:type="dxa"/>
+              <w:right w:w="60" w:type="dxa"/>
+            </w:tcMar>
+            <w:hideMark/>
+          </w:tcPr>
+          <w:p>
+            <w:pPr>
+              <w:spacing w:after="0" w:line="160" w:lineRule="atLeast"/>
+              <w:cnfStyle w:val="100000000000" w:firstRow="1" w:lastRow="0" w:firstColumn="0" w:lastColumn="0" w:oddVBand="0" w:evenVBand="0" w:oddHBand="0" w:evenHBand="0" w:firstRowFirstColumn="0" w:firstRowLastColumn="0" w:lastRowFirstColumn="0" w:lastRowLastColumn="0"/>
+              <w:rPr>
+                <w:sz w:val="21"/>
+                <w:szCs w:val="32"/>
+              </w:rPr>
+            </w:pPr>
+            <w:r>
+              <w:rPr>
+                <w:color w:val="000000"/>
+                <w:szCs w:val="18"/>
+              </w:rPr>
+              <w:t>Immediate executive attention required; risk could materially affect containment, recovery or customer confidence.</w:t>
+            </w:r>
+          </w:p>
+        </w:tc>
+        <w:tc>
+          <w:tcPr>
+            <w:tcW w:w="0" w:type="auto"/>
+            <w:tcBorders>
+              <w:top w:val="single" w:sz="4" w:space="0" w:color="D9A300"/>
+              <w:left w:val="single" w:sz="4" w:space="0" w:color="D9A300"/>
+              <w:bottom w:val="single" w:sz="4" w:space="0" w:color="D9A300"/>
+              <w:right w:val="single" w:sz="4" w:space="0" w:color="D9A300"/>
+            </w:tcBorders>
+            <w:shd w:val="clear" w:color="auto" w:fill="FFC000"/>
+            <w:tcMar>
+              <w:top w:w="0" w:type="dxa"/>
+              <w:left w:w="60" w:type="dxa"/>
+              <w:bottom w:w="0" w:type="dxa"/>
+              <w:right w:w="60" w:type="dxa"/>
+            </w:tcMar>
+            <w:hideMark/>
+          </w:tcPr>
+          <w:p>
+            <w:pPr>
+              <w:spacing w:after="0" w:line="160" w:lineRule="atLeast"/>
+              <w:cnfStyle w:val="100000000000" w:firstRow="1" w:lastRow="0" w:firstColumn="0" w:lastColumn="0" w:oddVBand="0" w:evenVBand="0" w:oddHBand="0" w:evenHBand="0" w:firstRowFirstColumn="0" w:firstRowLastColumn="0" w:lastRowFirstColumn="0" w:lastRowLastColumn="0"/>
+              <w:rPr>
+                <w:sz w:val="21"/>
+                <w:szCs w:val="32"/>
+              </w:rPr>
+            </w:pPr>
+            <w:r>
+              <w:rPr>
+                <w:color w:val="000000"/>
+                <w:szCs w:val="18"/>
+              </w:rPr>
+              <w:t>AMBER</w:t>
+            </w:r>
+          </w:p>
+        </w:tc>
+        <w:tc>
+          <w:tcPr>
+            <w:tcW w:w="0" w:type="auto"/>
+            <w:tcBorders>
+              <w:top w:val="single" w:sz="4" w:space="0" w:color="D9A300"/>
+              <w:left w:val="single" w:sz="4" w:space="0" w:color="D9A300"/>
+              <w:bottom w:val="single" w:sz="4" w:space="0" w:color="D9A300"/>
+              <w:right w:val="single" w:sz="4" w:space="0" w:color="D9A300"/>
+            </w:tcBorders>
+            <w:shd w:val="clear" w:color="auto" w:fill="FFF2CC"/>
+            <w:tcMar>
+              <w:top w:w="0" w:type="dxa"/>
+              <w:left w:w="60" w:type="dxa"/>
+              <w:bottom w:w="0" w:type="dxa"/>
+              <w:right w:w="60" w:type="dxa"/>
+            </w:tcMar>
+            <w:hideMark/>
+          </w:tcPr>
+          <w:p>
+            <w:pPr>
+              <w:spacing w:after="0" w:line="160" w:lineRule="atLeast"/>
+              <w:cnfStyle w:val="100000000000" w:firstRow="1" w:lastRow="0" w:firstColumn="0" w:lastColumn="0" w:oddVBand="0" w:evenVBand="0" w:oddHBand="0" w:evenHBand="0" w:firstRowFirstColumn="0" w:firstRowLastColumn="0" w:lastRowFirstColumn="0" w:lastRowLastColumn="0"/>
+              <w:rPr>
+                <w:sz w:val="21"/>
+                <w:szCs w:val="32"/>
+              </w:rPr>
+            </w:pPr>
+            <w:r>
+              <w:rPr>
+                <w:color w:val="000000"/>
+                <w:szCs w:val="18"/>
+              </w:rPr>
+              <w:t>Prioritised improvement required; risk is manageable but needs ownership, evidence or validation.</w:t>
+            </w:r>
+          </w:p>
+        </w:tc>
+        <w:tc>
+          <w:tcPr>
+            <w:tcW w:w="0" w:type="auto"/>
+            <w:tcBorders>
+              <w:top w:val="single" w:sz="4" w:space="0" w:color="548235"/>
+              <w:left w:val="single" w:sz="4" w:space="0" w:color="548235"/>
+              <w:bottom w:val="single" w:sz="4" w:space="0" w:color="548235"/>
+              <w:right w:val="single" w:sz="4" w:space="0" w:color="548235"/>
+            </w:tcBorders>
+            <w:shd w:val="clear" w:color="auto" w:fill="70AD47"/>
+            <w:tcMar>
+              <w:top w:w="0" w:type="dxa"/>
+              <w:left w:w="60" w:type="dxa"/>
+              <w:bottom w:w="0" w:type="dxa"/>
+              <w:right w:w="60" w:type="dxa"/>
+            </w:tcMar>
+            <w:hideMark/>
+          </w:tcPr>
+          <w:p>
+            <w:pPr>
+              <w:spacing w:after="0" w:line="160" w:lineRule="atLeast"/>
+              <w:cnfStyle w:val="100000000000" w:firstRow="1" w:lastRow="0" w:firstColumn="0" w:lastColumn="0" w:oddVBand="0" w:evenVBand="0" w:oddHBand="0" w:evenHBand="0" w:firstRowFirstColumn="0" w:firstRowLastColumn="0" w:lastRowFirstColumn="0" w:lastRowLastColumn="0"/>
+              <w:rPr>
+                <w:sz w:val="21"/>
+                <w:szCs w:val="32"/>
+              </w:rPr>
+            </w:pPr>
+            <w:r>
+              <w:rPr>
+                <w:color w:val="FFFFFF"/>
+                <w:szCs w:val="18"/>
+              </w:rPr>
+              <w:t>GREEN</w:t>
+            </w:r>
+          </w:p>
+        </w:tc>
+        <w:tc>
+          <w:tcPr>
+            <w:tcW w:w="0" w:type="auto"/>
+            <w:tcBorders>
+              <w:top w:val="single" w:sz="4" w:space="0" w:color="548235"/>
+              <w:left w:val="single" w:sz="4" w:space="0" w:color="548235"/>
+              <w:bottom w:val="single" w:sz="4" w:space="0" w:color="548235"/>
+              <w:right w:val="single" w:sz="4" w:space="0" w:color="548235"/>
+            </w:tcBorders>
+            <w:shd w:val="clear" w:color="auto" w:fill="E2F0D9"/>
+            <w:tcMar>
+              <w:top w:w="0" w:type="dxa"/>
+              <w:left w:w="60" w:type="dxa"/>
+              <w:bottom w:w="0" w:type="dxa"/>
+              <w:right w:w="60" w:type="dxa"/>
+            </w:tcMar>
+            <w:hideMark/>
+          </w:tcPr>
+          <w:p>
+            <w:pPr>
+              <w:spacing w:after="0" w:line="160" w:lineRule="atLeast"/>
+              <w:cnfStyle w:val="100000000000" w:firstRow="1" w:lastRow="0" w:firstColumn="0" w:lastColumn="0" w:oddVBand="0" w:evenVBand="0" w:oddHBand="0" w:evenHBand="0" w:firstRowFirstColumn="0" w:firstRowLastColumn="0" w:lastRowFirstColumn="0" w:lastRowLastColumn="0"/>
+              <w:rPr>
+                <w:sz w:val="21"/>
+                <w:szCs w:val="32"/>
+              </w:rPr>
+            </w:pPr>
+            <w:r>
+              <w:rPr>
+                <w:color w:val="000000"/>
+                <w:szCs w:val="18"/>
+              </w:rPr>
+              <w:t>Control is broadly established; monitoring or periodic assurance should continue.</w:t>
+            </w:r>
+          </w:p>
+        </w:tc>
+      </w:tr>
+    </w:tbl>
+    <w:p>
+      <w:pPr>
+        <w:rPr>
+          <w:kern w:val="0"/>
+          <w:sz w:val="21"/>
+          <w:szCs w:val="21"/>
+          <w:lang w:eastAsia="en-GB"/>
+          <w14:ligatures w14:val="none"/>
+        </w:rPr>
+      </w:pPr>
+    </w:p>
+    <w:p>
+      <w:pPr>
+        <w:rPr>
           <w:color w:val="595959"/>
           <w:kern w:val="0"/>
-          <w:sz w:val="16"/>
-          <w:szCs w:val="16"/>
+          <w:sz w:val="20"/>
+          <w:szCs w:val="20"/>
           <w:lang w:eastAsia="en-GB"/>
           <w14:ligatures w14:val="none"/>
         </w:rPr>
@@ -939,90 +1567,50 @@
           <w:b/>
           <w:bCs/>
           <w:color w:val="595959"/>
-          <w:sz w:val="16"/>
-          <w:szCs w:val="16"/>
+          <w:sz w:val="20"/>
+          <w:szCs w:val="20"/>
         </w:rPr>
         <w:t>Weighting methodology:</w:t>
       </w:r>
       <w:r>
         <w:rPr>
           <w:color w:val="595959"/>
-          <w:sz w:val="16"/>
-          <w:szCs w:val="16"/>
-        </w:rPr>
-        <w:t xml:space="preserve"> </w:t>
+          <w:sz w:val="20"/>
+          <w:szCs w:val="20"/>
+        </w:rPr>
+        <w:t xml:space="preserve"> weighting reflects business criticality, likelihood, </w:t>
       </w:r>
       <w:r>
         <w:rPr>
           <w:color w:val="595959"/>
-          <w:sz w:val="16"/>
-          <w:szCs w:val="16"/>
-        </w:rPr>
-        <w:t xml:space="preserve">weighting </w:t>
+          <w:sz w:val="20"/>
+          <w:szCs w:val="20"/>
+        </w:rPr>
+        <w:t>incident-containment value, customer-data exposure</w:t>
       </w:r>
       <w:r>
         <w:rPr>
           <w:color w:val="595959"/>
-          <w:sz w:val="16"/>
-          <w:szCs w:val="16"/>
-        </w:rPr>
-        <w:t xml:space="preserve">reflects </w:t>
+          <w:sz w:val="20"/>
+          <w:szCs w:val="20"/>
+        </w:rPr>
+        <w:t xml:space="preserve">, recovery uncertainty and current assurance. The total weighting is 100% and is used to sequence </w:t>
       </w:r>
       <w:r>
         <w:rPr>
           <w:color w:val="595959"/>
-          <w:sz w:val="16"/>
-          <w:szCs w:val="16"/>
-        </w:rPr>
-        <w:t xml:space="preserve">business criticality, </w:t>
+          <w:sz w:val="20"/>
+          <w:szCs w:val="20"/>
+        </w:rPr>
+        <w:t>executive attention</w:t>
       </w:r>
       <w:r>
         <w:rPr>
           <w:color w:val="595959"/>
-          <w:sz w:val="16"/>
-          <w:szCs w:val="16"/>
-        </w:rPr>
-        <w:t>likelihood</w:t>
-      </w:r>
-      <w:r>
-        <w:rPr>
-          <w:color w:val="595959"/>
-          <w:sz w:val="16"/>
-          <w:szCs w:val="16"/>
-        </w:rPr>
-        <w:t>, impact</w:t>
-      </w:r>
-      <w:r>
-        <w:rPr>
-          <w:color w:val="595959"/>
-          <w:sz w:val="16"/>
-          <w:szCs w:val="16"/>
-        </w:rPr>
-        <w:t xml:space="preserve">, recovery uncertainty and </w:t>
-      </w:r>
-      <w:r>
-        <w:rPr>
-          <w:color w:val="595959"/>
-          <w:sz w:val="16"/>
-          <w:szCs w:val="16"/>
-        </w:rPr>
-        <w:t>current</w:t>
-      </w:r>
-      <w:r>
-        <w:rPr>
-          <w:color w:val="595959"/>
-          <w:sz w:val="16"/>
-          <w:szCs w:val="16"/>
-        </w:rPr>
-        <w:t xml:space="preserve"> assurance. </w:t>
-      </w:r>
-      <w:r>
-        <w:rPr>
-          <w:color w:val="595959"/>
-          <w:sz w:val="16"/>
-          <w:szCs w:val="16"/>
-        </w:rPr>
-        <w:t>The total weighting is 100% and is used to sequence investment where change is required.</w:t>
+          <w:sz w:val="20"/>
+          <w:szCs w:val="20"/>
+        </w:rPr>
+        <w:t xml:space="preserve"> where change is required.</w:t>
       </w:r>
     </w:p>
     <w:p>
@@ -1031,6 +1619,8 @@
         <w:rPr>
           <w:rFonts w:cstheme="minorBidi"/>
           <w:kern w:val="36"/>
+          <w:sz w:val="32"/>
+          <w:szCs w:val="32"/>
           <w:lang w:eastAsia="en-GB"/>
           <w14:ligatures w14:val="none"/>
         </w:rPr>
@@ -1038,9 +1628,10 @@
       <w:r>
         <w:rPr>
           <w:rFonts w:cstheme="minorBidi"/>
-        </w:rPr>
-        <w:lastRenderedPageBreak/>
-        <w:t>Scoring Matrix</w:t>
+          <w:sz w:val="32"/>
+          <w:szCs w:val="48"/>
+        </w:rPr>
+        <w:t>Board Decision Summary</w:t>
       </w:r>
     </w:p>
     <w:tbl>
@@ -1050,10 +1641,8 @@
         <w:tblLook w:val="04A0" w:firstRow="1" w:lastRow="0" w:firstColumn="1" w:lastColumn="0" w:noHBand="0" w:noVBand="1"/>
       </w:tblPr>
       <w:tblGrid>
-        <w:gridCol w:w="640"/>
-        <w:gridCol w:w="2683"/>
-        <w:gridCol w:w="3398"/>
-        <w:gridCol w:w="2295"/>
+        <w:gridCol w:w="1287"/>
+        <w:gridCol w:w="9169"/>
       </w:tblGrid>
       <w:tr>
         <w:trPr>
@@ -1063,17 +1652,28 @@
           <w:tcPr>
             <w:cnfStyle w:val="001000000000" w:firstRow="0" w:lastRow="0" w:firstColumn="1" w:lastColumn="0" w:oddVBand="0" w:evenVBand="0" w:oddHBand="0" w:evenHBand="0" w:firstRowFirstColumn="0" w:firstRowLastColumn="0" w:lastRowFirstColumn="0" w:lastRowLastColumn="0"/>
             <w:tcW w:w="0" w:type="auto"/>
+            <w:tcBorders>
+              <w:top w:val="single" w:sz="4" w:space="0" w:color="156082"/>
+              <w:left w:val="single" w:sz="4" w:space="0" w:color="156082"/>
+              <w:bottom w:val="single" w:sz="4" w:space="0" w:color="156082"/>
+              <w:right w:val="single" w:sz="4" w:space="0" w:color="156082"/>
+            </w:tcBorders>
             <w:shd w:val="clear" w:color="auto" w:fill="00516B"/>
-            <w:hideMark/>
-          </w:tcPr>
-          <w:p>
-            <w:pPr>
-              <w:spacing w:after="160"/>
-              <w:rPr>
-                <w:color w:val="FFFFFF"/>
+            <w:tcMar>
+              <w:top w:w="0" w:type="dxa"/>
+              <w:left w:w="60" w:type="dxa"/>
+              <w:bottom w:w="0" w:type="dxa"/>
+              <w:right w:w="60" w:type="dxa"/>
+            </w:tcMar>
+            <w:hideMark/>
+          </w:tcPr>
+          <w:p>
+            <w:pPr>
+              <w:spacing w:after="0" w:line="180" w:lineRule="atLeast"/>
+              <w:rPr>
                 <w:kern w:val="0"/>
-                <w:sz w:val="16"/>
-                <w:szCs w:val="16"/>
+                <w:sz w:val="21"/>
+                <w:szCs w:val="21"/>
                 <w:lang w:eastAsia="en-GB"/>
                 <w14:ligatures w14:val="none"/>
               </w:rPr>
@@ -1081,88 +1681,47 @@
             <w:r>
               <w:rPr>
                 <w:color w:val="FFFFFF"/>
-                <w:sz w:val="16"/>
-                <w:szCs w:val="16"/>
-              </w:rPr>
-              <w:t>Score</w:t>
-            </w:r>
-          </w:p>
-        </w:tc>
-        <w:tc>
-          <w:tcPr>
-            <w:tcW w:w="0" w:type="auto"/>
-            <w:shd w:val="clear" w:color="auto" w:fill="00516B"/>
-            <w:hideMark/>
-          </w:tcPr>
-          <w:p>
-            <w:pPr>
-              <w:spacing w:after="160"/>
+                <w:sz w:val="20"/>
+                <w:szCs w:val="20"/>
+              </w:rPr>
+              <w:t>Decision required</w:t>
+            </w:r>
+          </w:p>
+        </w:tc>
+        <w:tc>
+          <w:tcPr>
+            <w:tcW w:w="0" w:type="auto"/>
+            <w:tcBorders>
+              <w:top w:val="single" w:sz="4" w:space="0" w:color="156082"/>
+              <w:left w:val="single" w:sz="4" w:space="0" w:color="156082"/>
+              <w:bottom w:val="single" w:sz="4" w:space="0" w:color="156082"/>
+              <w:right w:val="single" w:sz="4" w:space="0" w:color="156082"/>
+            </w:tcBorders>
+            <w:shd w:val="clear" w:color="auto" w:fill="EAF3F8"/>
+            <w:tcMar>
+              <w:top w:w="0" w:type="dxa"/>
+              <w:left w:w="60" w:type="dxa"/>
+              <w:bottom w:w="0" w:type="dxa"/>
+              <w:right w:w="60" w:type="dxa"/>
+            </w:tcMar>
+            <w:hideMark/>
+          </w:tcPr>
+          <w:p>
+            <w:pPr>
+              <w:spacing w:after="0" w:line="180" w:lineRule="atLeast"/>
               <w:cnfStyle w:val="100000000000" w:firstRow="1" w:lastRow="0" w:firstColumn="0" w:lastColumn="0" w:oddVBand="0" w:evenVBand="0" w:oddHBand="0" w:evenHBand="0" w:firstRowFirstColumn="0" w:firstRowLastColumn="0" w:lastRowFirstColumn="0" w:lastRowLastColumn="0"/>
               <w:rPr>
-                <w:color w:val="FFFFFF"/>
-                <w:sz w:val="16"/>
-                <w:szCs w:val="16"/>
-              </w:rPr>
-            </w:pPr>
-            <w:r>
-              <w:rPr>
-                <w:color w:val="FFFFFF"/>
-                <w:sz w:val="16"/>
-                <w:szCs w:val="16"/>
-              </w:rPr>
-              <w:t>Likelihood</w:t>
-            </w:r>
-          </w:p>
-        </w:tc>
-        <w:tc>
-          <w:tcPr>
-            <w:tcW w:w="0" w:type="auto"/>
-            <w:shd w:val="clear" w:color="auto" w:fill="00516B"/>
-            <w:hideMark/>
-          </w:tcPr>
-          <w:p>
-            <w:pPr>
-              <w:spacing w:after="160"/>
-              <w:cnfStyle w:val="100000000000" w:firstRow="1" w:lastRow="0" w:firstColumn="0" w:lastColumn="0" w:oddVBand="0" w:evenVBand="0" w:oddHBand="0" w:evenHBand="0" w:firstRowFirstColumn="0" w:firstRowLastColumn="0" w:lastRowFirstColumn="0" w:lastRowLastColumn="0"/>
-              <w:rPr>
-                <w:color w:val="FFFFFF"/>
-                <w:sz w:val="16"/>
-                <w:szCs w:val="16"/>
-              </w:rPr>
-            </w:pPr>
-            <w:r>
-              <w:rPr>
-                <w:color w:val="FFFFFF"/>
-                <w:sz w:val="16"/>
-                <w:szCs w:val="16"/>
-              </w:rPr>
-              <w:t>Impact</w:t>
-            </w:r>
-          </w:p>
-        </w:tc>
-        <w:tc>
-          <w:tcPr>
-            <w:tcW w:w="0" w:type="auto"/>
-            <w:shd w:val="clear" w:color="auto" w:fill="00516B"/>
-            <w:hideMark/>
-          </w:tcPr>
-          <w:p>
-            <w:pPr>
-              <w:spacing w:after="160"/>
-              <w:cnfStyle w:val="100000000000" w:firstRow="1" w:lastRow="0" w:firstColumn="0" w:lastColumn="0" w:oddVBand="0" w:evenVBand="0" w:oddHBand="0" w:evenHBand="0" w:firstRowFirstColumn="0" w:firstRowLastColumn="0" w:lastRowFirstColumn="0" w:lastRowLastColumn="0"/>
-              <w:rPr>
-                <w:color w:val="FFFFFF"/>
-                <w:sz w:val="16"/>
-                <w:szCs w:val="16"/>
-              </w:rPr>
-            </w:pPr>
-            <w:r>
-              <w:rPr>
-                <w:color w:val="FFFFFF"/>
-                <w:sz w:val="16"/>
-                <w:szCs w:val="16"/>
-              </w:rPr>
-              <w:t>RAG Outcome</w:t>
+                <w:sz w:val="21"/>
+                <w:szCs w:val="32"/>
+              </w:rPr>
+            </w:pPr>
+            <w:r>
+              <w:rPr>
+                <w:color w:val="000000"/>
+                <w:sz w:val="20"/>
+                <w:szCs w:val="20"/>
+              </w:rPr>
+              <w:t>Approve a scoped discovery and remediation planning exercise for MDR readiness, incident-response rehearsal, FTP remediation, vulnerability visibility and Google Workspace recovery assurance.</w:t>
             </w:r>
           </w:p>
         </w:tc>
@@ -1175,105 +1734,87 @@
           <w:tcPr>
             <w:cnfStyle w:val="001000000000" w:firstRow="0" w:lastRow="0" w:firstColumn="1" w:lastColumn="0" w:oddVBand="0" w:evenVBand="0" w:oddHBand="0" w:evenHBand="0" w:firstRowFirstColumn="0" w:firstRowLastColumn="0" w:lastRowFirstColumn="0" w:lastRowLastColumn="0"/>
             <w:tcW w:w="0" w:type="auto"/>
-            <w:shd w:val="clear" w:color="auto" w:fill="E2F0D9"/>
-            <w:hideMark/>
-          </w:tcPr>
-          <w:p>
-            <w:pPr>
-              <w:spacing w:after="160"/>
-              <w:jc w:val="center"/>
-              <w:rPr>
-                <w:sz w:val="16"/>
-                <w:szCs w:val="16"/>
-              </w:rPr>
-            </w:pPr>
-            <w:r>
-              <w:rPr>
-                <w:sz w:val="16"/>
-                <w:szCs w:val="16"/>
-              </w:rPr>
-              <w:t>1–4</w:t>
-            </w:r>
-          </w:p>
-        </w:tc>
-        <w:tc>
-          <w:tcPr>
-            <w:tcW w:w="0" w:type="auto"/>
-            <w:shd w:val="clear" w:color="auto" w:fill="E2F0D9"/>
-            <w:hideMark/>
-          </w:tcPr>
-          <w:p>
-            <w:pPr>
-              <w:spacing w:after="160"/>
+            <w:tcBorders>
+              <w:top w:val="single" w:sz="4" w:space="0" w:color="156082"/>
+              <w:left w:val="single" w:sz="4" w:space="0" w:color="156082"/>
+              <w:bottom w:val="single" w:sz="4" w:space="0" w:color="156082"/>
+              <w:right w:val="single" w:sz="4" w:space="0" w:color="156082"/>
+            </w:tcBorders>
+            <w:shd w:val="clear" w:color="auto" w:fill="00516B"/>
+            <w:tcMar>
+              <w:top w:w="0" w:type="dxa"/>
+              <w:left w:w="60" w:type="dxa"/>
+              <w:bottom w:w="0" w:type="dxa"/>
+              <w:right w:w="60" w:type="dxa"/>
+            </w:tcMar>
+            <w:hideMark/>
+          </w:tcPr>
+          <w:p>
+            <w:pPr>
+              <w:spacing w:after="0" w:line="180" w:lineRule="atLeast"/>
+              <w:rPr>
+                <w:sz w:val="21"/>
+                <w:szCs w:val="32"/>
+              </w:rPr>
+            </w:pPr>
+            <w:r>
+              <w:rPr>
+                <w:color w:val="FFFFFF"/>
+                <w:sz w:val="20"/>
+                <w:szCs w:val="20"/>
+              </w:rPr>
+              <w:t>Why now</w:t>
+            </w:r>
+          </w:p>
+        </w:tc>
+        <w:tc>
+          <w:tcPr>
+            <w:tcW w:w="0" w:type="auto"/>
+            <w:tcBorders>
+              <w:top w:val="single" w:sz="4" w:space="0" w:color="156082"/>
+              <w:left w:val="single" w:sz="4" w:space="0" w:color="156082"/>
+              <w:bottom w:val="single" w:sz="4" w:space="0" w:color="156082"/>
+              <w:right w:val="single" w:sz="4" w:space="0" w:color="156082"/>
+            </w:tcBorders>
+            <w:tcMar>
+              <w:top w:w="0" w:type="dxa"/>
+              <w:left w:w="60" w:type="dxa"/>
+              <w:bottom w:w="0" w:type="dxa"/>
+              <w:right w:w="60" w:type="dxa"/>
+            </w:tcMar>
+            <w:hideMark/>
+          </w:tcPr>
+          <w:p>
+            <w:pPr>
+              <w:spacing w:after="0" w:line="180" w:lineRule="atLeast"/>
               <w:cnfStyle w:val="000000100000" w:firstRow="0" w:lastRow="0" w:firstColumn="0" w:lastColumn="0" w:oddVBand="0" w:evenVBand="0" w:oddHBand="1" w:evenHBand="0" w:firstRowFirstColumn="0" w:firstRowLastColumn="0" w:lastRowFirstColumn="0" w:lastRowLastColumn="0"/>
               <w:rPr>
-                <w:sz w:val="16"/>
-                <w:szCs w:val="16"/>
-              </w:rPr>
-            </w:pPr>
-            <w:r>
-              <w:rPr>
-                <w:sz w:val="16"/>
-                <w:szCs w:val="16"/>
-              </w:rPr>
-              <w:t>Unlikely or limited exposure.</w:t>
-            </w:r>
-          </w:p>
-        </w:tc>
-        <w:tc>
-          <w:tcPr>
-            <w:tcW w:w="0" w:type="auto"/>
-            <w:shd w:val="clear" w:color="auto" w:fill="E2F0D9"/>
-            <w:hideMark/>
-          </w:tcPr>
-          <w:p>
-            <w:pPr>
-              <w:spacing w:after="160"/>
-              <w:cnfStyle w:val="000000100000" w:firstRow="0" w:lastRow="0" w:firstColumn="0" w:lastColumn="0" w:oddVBand="0" w:evenVBand="0" w:oddHBand="1" w:evenHBand="0" w:firstRowFirstColumn="0" w:firstRowLastColumn="0" w:lastRowFirstColumn="0" w:lastRowLastColumn="0"/>
-              <w:rPr>
-                <w:sz w:val="16"/>
-                <w:szCs w:val="16"/>
-              </w:rPr>
-            </w:pPr>
-            <w:r>
-              <w:rPr>
-                <w:sz w:val="16"/>
-                <w:szCs w:val="16"/>
-              </w:rPr>
-              <w:t>Low business disruption or easily recoverable.</w:t>
-            </w:r>
-          </w:p>
-        </w:tc>
-        <w:tc>
-          <w:tcPr>
-            <w:tcW w:w="0" w:type="auto"/>
-            <w:shd w:val="clear" w:color="auto" w:fill="E2F0D9"/>
-            <w:hideMark/>
-          </w:tcPr>
-          <w:p>
-            <w:pPr>
-              <w:spacing w:after="160"/>
-              <w:cnfStyle w:val="000000100000" w:firstRow="0" w:lastRow="0" w:firstColumn="0" w:lastColumn="0" w:oddVBand="0" w:evenVBand="0" w:oddHBand="1" w:evenHBand="0" w:firstRowFirstColumn="0" w:firstRowLastColumn="0" w:lastRowFirstColumn="0" w:lastRowLastColumn="0"/>
-              <w:rPr>
-                <w:sz w:val="16"/>
-                <w:szCs w:val="16"/>
-              </w:rPr>
-            </w:pPr>
-            <w:r>
-              <w:rPr>
-                <w:b/>
-                <w:bCs/>
-                <w:sz w:val="16"/>
-                <w:szCs w:val="16"/>
-              </w:rPr>
-              <w:t>Green:</w:t>
-            </w:r>
-            <w:r>
-              <w:rPr>
-                <w:sz w:val="16"/>
-                <w:szCs w:val="16"/>
-              </w:rPr>
-              <w:t xml:space="preserve"> monitor through routine governance.</w:t>
+                <w:sz w:val="21"/>
+                <w:szCs w:val="32"/>
+              </w:rPr>
+            </w:pPr>
+            <w:r>
+              <w:rPr>
+                <w:sz w:val="20"/>
+                <w:szCs w:val="20"/>
+              </w:rPr>
+              <w:t xml:space="preserve">Current controls provide a credible baseline, but out-of-hours response, FTP authentication, incident rehearsal and recovery assurance remain the </w:t>
+            </w:r>
+            <w:proofErr w:type="spellStart"/>
+            <w:r>
+              <w:rPr>
+                <w:sz w:val="20"/>
+                <w:szCs w:val="20"/>
+              </w:rPr>
+              <w:t>areas</w:t>
+            </w:r>
+            <w:proofErr w:type="spellEnd"/>
+            <w:r>
+              <w:rPr>
+                <w:sz w:val="20"/>
+                <w:szCs w:val="20"/>
+              </w:rPr>
+              <w:t xml:space="preserve"> most likely to affect containment speed and customer confidence.</w:t>
             </w:r>
           </w:p>
         </w:tc>
@@ -1283,105 +1824,196 @@
           <w:tcPr>
             <w:cnfStyle w:val="001000000000" w:firstRow="0" w:lastRow="0" w:firstColumn="1" w:lastColumn="0" w:oddVBand="0" w:evenVBand="0" w:oddHBand="0" w:evenHBand="0" w:firstRowFirstColumn="0" w:firstRowLastColumn="0" w:lastRowFirstColumn="0" w:lastRowLastColumn="0"/>
             <w:tcW w:w="0" w:type="auto"/>
-            <w:shd w:val="clear" w:color="auto" w:fill="FFF2CC"/>
-            <w:hideMark/>
-          </w:tcPr>
-          <w:p>
-            <w:pPr>
-              <w:spacing w:after="160"/>
-              <w:jc w:val="center"/>
-              <w:rPr>
-                <w:sz w:val="16"/>
-                <w:szCs w:val="16"/>
-              </w:rPr>
-            </w:pPr>
-            <w:r>
-              <w:rPr>
-                <w:sz w:val="16"/>
-                <w:szCs w:val="16"/>
-              </w:rPr>
-              <w:t>5–9</w:t>
-            </w:r>
-          </w:p>
-        </w:tc>
-        <w:tc>
-          <w:tcPr>
-            <w:tcW w:w="0" w:type="auto"/>
-            <w:shd w:val="clear" w:color="auto" w:fill="FFF2CC"/>
-            <w:hideMark/>
-          </w:tcPr>
-          <w:p>
-            <w:pPr>
-              <w:spacing w:after="160"/>
+            <w:tcBorders>
+              <w:top w:val="single" w:sz="4" w:space="0" w:color="156082"/>
+              <w:left w:val="single" w:sz="4" w:space="0" w:color="156082"/>
+              <w:bottom w:val="single" w:sz="4" w:space="0" w:color="156082"/>
+              <w:right w:val="single" w:sz="4" w:space="0" w:color="156082"/>
+            </w:tcBorders>
+            <w:shd w:val="clear" w:color="auto" w:fill="00516B"/>
+            <w:tcMar>
+              <w:top w:w="0" w:type="dxa"/>
+              <w:left w:w="60" w:type="dxa"/>
+              <w:bottom w:w="0" w:type="dxa"/>
+              <w:right w:w="60" w:type="dxa"/>
+            </w:tcMar>
+            <w:hideMark/>
+          </w:tcPr>
+          <w:p>
+            <w:pPr>
+              <w:spacing w:after="0" w:line="180" w:lineRule="atLeast"/>
+              <w:rPr>
+                <w:sz w:val="21"/>
+                <w:szCs w:val="32"/>
+              </w:rPr>
+            </w:pPr>
+            <w:r>
+              <w:rPr>
+                <w:color w:val="FFFFFF"/>
+                <w:sz w:val="20"/>
+                <w:szCs w:val="20"/>
+              </w:rPr>
+              <w:t>Approval enables</w:t>
+            </w:r>
+          </w:p>
+        </w:tc>
+        <w:tc>
+          <w:tcPr>
+            <w:tcW w:w="0" w:type="auto"/>
+            <w:tcBorders>
+              <w:top w:val="single" w:sz="4" w:space="0" w:color="156082"/>
+              <w:left w:val="single" w:sz="4" w:space="0" w:color="156082"/>
+              <w:bottom w:val="single" w:sz="4" w:space="0" w:color="156082"/>
+              <w:right w:val="single" w:sz="4" w:space="0" w:color="156082"/>
+            </w:tcBorders>
+            <w:shd w:val="clear" w:color="auto" w:fill="EAF3F8"/>
+            <w:tcMar>
+              <w:top w:w="0" w:type="dxa"/>
+              <w:left w:w="60" w:type="dxa"/>
+              <w:bottom w:w="0" w:type="dxa"/>
+              <w:right w:w="60" w:type="dxa"/>
+            </w:tcMar>
+            <w:hideMark/>
+          </w:tcPr>
+          <w:p>
+            <w:pPr>
+              <w:spacing w:after="0" w:line="180" w:lineRule="atLeast"/>
               <w:cnfStyle w:val="000000000000" w:firstRow="0" w:lastRow="0" w:firstColumn="0" w:lastColumn="0" w:oddVBand="0" w:evenVBand="0" w:oddHBand="0" w:evenHBand="0" w:firstRowFirstColumn="0" w:firstRowLastColumn="0" w:lastRowFirstColumn="0" w:lastRowLastColumn="0"/>
               <w:rPr>
-                <w:sz w:val="16"/>
-                <w:szCs w:val="16"/>
-              </w:rPr>
-            </w:pPr>
-            <w:r>
-              <w:rPr>
-                <w:sz w:val="16"/>
-                <w:szCs w:val="16"/>
-              </w:rPr>
-              <w:t>Credible exposure or known control gap.</w:t>
-            </w:r>
-          </w:p>
-        </w:tc>
-        <w:tc>
-          <w:tcPr>
-            <w:tcW w:w="0" w:type="auto"/>
-            <w:shd w:val="clear" w:color="auto" w:fill="FFF2CC"/>
-            <w:hideMark/>
-          </w:tcPr>
-          <w:p>
-            <w:pPr>
-              <w:spacing w:after="160"/>
-              <w:cnfStyle w:val="000000000000" w:firstRow="0" w:lastRow="0" w:firstColumn="0" w:lastColumn="0" w:oddVBand="0" w:evenVBand="0" w:oddHBand="0" w:evenHBand="0" w:firstRowFirstColumn="0" w:firstRowLastColumn="0" w:lastRowFirstColumn="0" w:lastRowLastColumn="0"/>
-              <w:rPr>
-                <w:sz w:val="16"/>
-                <w:szCs w:val="16"/>
-              </w:rPr>
-            </w:pPr>
-            <w:r>
-              <w:rPr>
-                <w:sz w:val="16"/>
-                <w:szCs w:val="16"/>
-              </w:rPr>
-              <w:t>Material operational, compliance or recovery impact.</w:t>
-            </w:r>
-          </w:p>
-        </w:tc>
-        <w:tc>
-          <w:tcPr>
-            <w:tcW w:w="0" w:type="auto"/>
-            <w:shd w:val="clear" w:color="auto" w:fill="FFF2CC"/>
-            <w:hideMark/>
-          </w:tcPr>
-          <w:p>
-            <w:pPr>
-              <w:spacing w:after="160"/>
-              <w:cnfStyle w:val="000000000000" w:firstRow="0" w:lastRow="0" w:firstColumn="0" w:lastColumn="0" w:oddVBand="0" w:evenVBand="0" w:oddHBand="0" w:evenHBand="0" w:firstRowFirstColumn="0" w:firstRowLastColumn="0" w:lastRowFirstColumn="0" w:lastRowLastColumn="0"/>
-              <w:rPr>
-                <w:sz w:val="16"/>
-                <w:szCs w:val="16"/>
-              </w:rPr>
-            </w:pPr>
-            <w:r>
-              <w:rPr>
-                <w:b/>
-                <w:bCs/>
-                <w:sz w:val="16"/>
-                <w:szCs w:val="16"/>
-              </w:rPr>
-              <w:t>Amber:</w:t>
-            </w:r>
-            <w:r>
-              <w:rPr>
-                <w:sz w:val="16"/>
-                <w:szCs w:val="16"/>
-              </w:rPr>
-              <w:t xml:space="preserve"> prioritise remediation planning.</w:t>
+                <w:sz w:val="21"/>
+                <w:szCs w:val="32"/>
+              </w:rPr>
+            </w:pPr>
+            <w:r>
+              <w:rPr>
+                <w:color w:val="000000"/>
+                <w:sz w:val="20"/>
+                <w:szCs w:val="20"/>
+              </w:rPr>
+              <w:t>Confirmed scope, costs, owners, sequencing, supplier dependencies and evidence required for budget approval and phased delivery.</w:t>
+            </w:r>
+          </w:p>
+        </w:tc>
+      </w:tr>
+    </w:tbl>
+    <w:p>
+      <w:pPr>
+        <w:rPr>
+          <w:kern w:val="0"/>
+          <w:sz w:val="21"/>
+          <w:szCs w:val="21"/>
+          <w:lang w:eastAsia="en-GB"/>
+          <w14:ligatures w14:val="none"/>
+        </w:rPr>
+      </w:pPr>
+    </w:p>
+    <w:p>
+      <w:pPr>
+        <w:pStyle w:val="Heading1"/>
+        <w:rPr>
+          <w:rFonts w:cstheme="minorBidi"/>
+          <w:kern w:val="36"/>
+          <w:sz w:val="32"/>
+          <w:szCs w:val="32"/>
+          <w:lang w:eastAsia="en-GB"/>
+          <w14:ligatures w14:val="none"/>
+        </w:rPr>
+      </w:pPr>
+      <w:r>
+        <w:rPr>
+          <w:rFonts w:cstheme="minorBidi"/>
+          <w:sz w:val="32"/>
+          <w:szCs w:val="48"/>
+        </w:rPr>
+        <w:t>Expected Business Benefits</w:t>
+      </w:r>
+    </w:p>
+    <w:tbl>
+      <w:tblPr>
+        <w:tblStyle w:val="GridTable4-Accent1"/>
+        <w:tblW w:w="5000" w:type="pct"/>
+        <w:tblLook w:val="04A0" w:firstRow="1" w:lastRow="0" w:firstColumn="1" w:lastColumn="0" w:noHBand="0" w:noVBand="1"/>
+      </w:tblPr>
+      <w:tblGrid>
+        <w:gridCol w:w="5178"/>
+        <w:gridCol w:w="5278"/>
+      </w:tblGrid>
+      <w:tr>
+        <w:trPr>
+          <w:cnfStyle w:val="100000000000" w:firstRow="1" w:lastRow="0" w:firstColumn="0" w:lastColumn="0" w:oddVBand="0" w:evenVBand="0" w:oddHBand="0" w:evenHBand="0" w:firstRowFirstColumn="0" w:firstRowLastColumn="0" w:lastRowFirstColumn="0" w:lastRowLastColumn="0"/>
+        </w:trPr>
+        <w:tc>
+          <w:tcPr>
+            <w:cnfStyle w:val="001000000000" w:firstRow="0" w:lastRow="0" w:firstColumn="1" w:lastColumn="0" w:oddVBand="0" w:evenVBand="0" w:oddHBand="0" w:evenHBand="0" w:firstRowFirstColumn="0" w:firstRowLastColumn="0" w:lastRowFirstColumn="0" w:lastRowLastColumn="0"/>
+            <w:tcW w:w="0" w:type="auto"/>
+            <w:tcBorders>
+              <w:top w:val="single" w:sz="4" w:space="0" w:color="156082"/>
+              <w:left w:val="single" w:sz="4" w:space="0" w:color="156082"/>
+              <w:bottom w:val="single" w:sz="4" w:space="0" w:color="156082"/>
+              <w:right w:val="single" w:sz="4" w:space="0" w:color="156082"/>
+            </w:tcBorders>
+            <w:shd w:val="clear" w:color="auto" w:fill="EAF3F8"/>
+            <w:tcMar>
+              <w:top w:w="0" w:type="dxa"/>
+              <w:left w:w="60" w:type="dxa"/>
+              <w:bottom w:w="0" w:type="dxa"/>
+              <w:right w:w="60" w:type="dxa"/>
+            </w:tcMar>
+            <w:hideMark/>
+          </w:tcPr>
+          <w:p>
+            <w:pPr>
+              <w:spacing w:after="0" w:line="180" w:lineRule="atLeast"/>
+              <w:rPr>
+                <w:kern w:val="0"/>
+                <w:sz w:val="21"/>
+                <w:szCs w:val="21"/>
+                <w:lang w:eastAsia="en-GB"/>
+                <w14:ligatures w14:val="none"/>
+              </w:rPr>
+            </w:pPr>
+            <w:r>
+              <w:rPr>
+                <w:color w:val="000000"/>
+                <w:sz w:val="20"/>
+                <w:szCs w:val="20"/>
+              </w:rPr>
+              <w:t>Faster containment through clearer monitoring coverage, escalation routes and response authority.</w:t>
+            </w:r>
+          </w:p>
+        </w:tc>
+        <w:tc>
+          <w:tcPr>
+            <w:tcW w:w="0" w:type="auto"/>
+            <w:tcBorders>
+              <w:top w:val="single" w:sz="4" w:space="0" w:color="156082"/>
+              <w:left w:val="single" w:sz="4" w:space="0" w:color="156082"/>
+              <w:bottom w:val="single" w:sz="4" w:space="0" w:color="156082"/>
+              <w:right w:val="single" w:sz="4" w:space="0" w:color="156082"/>
+            </w:tcBorders>
+            <w:tcMar>
+              <w:top w:w="0" w:type="dxa"/>
+              <w:left w:w="60" w:type="dxa"/>
+              <w:bottom w:w="0" w:type="dxa"/>
+              <w:right w:w="60" w:type="dxa"/>
+            </w:tcMar>
+            <w:hideMark/>
+          </w:tcPr>
+          <w:p>
+            <w:pPr>
+              <w:spacing w:after="0" w:line="180" w:lineRule="atLeast"/>
+              <w:cnfStyle w:val="100000000000" w:firstRow="1" w:lastRow="0" w:firstColumn="0" w:lastColumn="0" w:oddVBand="0" w:evenVBand="0" w:oddHBand="0" w:evenHBand="0" w:firstRowFirstColumn="0" w:firstRowLastColumn="0" w:lastRowFirstColumn="0" w:lastRowLastColumn="0"/>
+              <w:rPr>
+                <w:sz w:val="21"/>
+                <w:szCs w:val="32"/>
+              </w:rPr>
+            </w:pPr>
+            <w:r>
+              <w:rPr>
+                <w:sz w:val="20"/>
+                <w:szCs w:val="20"/>
+              </w:rPr>
+              <w:t>Stronger recovery decisions through tested incident roles, supplier escalation and agreed system recovery priorities.</w:t>
             </w:r>
           </w:p>
         </w:tc>
@@ -1394,108 +2026,81 @@
           <w:tcPr>
             <w:cnfStyle w:val="001000000000" w:firstRow="0" w:lastRow="0" w:firstColumn="1" w:lastColumn="0" w:oddVBand="0" w:evenVBand="0" w:oddHBand="0" w:evenHBand="0" w:firstRowFirstColumn="0" w:firstRowLastColumn="0" w:lastRowFirstColumn="0" w:lastRowLastColumn="0"/>
             <w:tcW w:w="0" w:type="auto"/>
-            <w:shd w:val="clear" w:color="auto" w:fill="FCE4D6"/>
-            <w:hideMark/>
-          </w:tcPr>
-          <w:p>
-            <w:pPr>
-              <w:spacing w:after="160"/>
-              <w:jc w:val="center"/>
-              <w:rPr>
-                <w:sz w:val="16"/>
-                <w:szCs w:val="16"/>
-              </w:rPr>
-            </w:pPr>
-            <w:r>
-              <w:rPr>
-                <w:sz w:val="16"/>
-                <w:szCs w:val="16"/>
-              </w:rPr>
-              <w:t>10–15</w:t>
-            </w:r>
-          </w:p>
-        </w:tc>
-        <w:tc>
-          <w:tcPr>
-            <w:tcW w:w="0" w:type="auto"/>
-            <w:shd w:val="clear" w:color="auto" w:fill="FCE4D6"/>
-            <w:hideMark/>
-          </w:tcPr>
-          <w:p>
-            <w:pPr>
-              <w:spacing w:after="160"/>
+            <w:tcBorders>
+              <w:top w:val="single" w:sz="4" w:space="0" w:color="156082"/>
+              <w:left w:val="single" w:sz="4" w:space="0" w:color="156082"/>
+              <w:bottom w:val="single" w:sz="4" w:space="0" w:color="156082"/>
+              <w:right w:val="single" w:sz="4" w:space="0" w:color="156082"/>
+            </w:tcBorders>
+            <w:tcMar>
+              <w:top w:w="0" w:type="dxa"/>
+              <w:left w:w="60" w:type="dxa"/>
+              <w:bottom w:w="0" w:type="dxa"/>
+              <w:right w:w="60" w:type="dxa"/>
+            </w:tcMar>
+            <w:hideMark/>
+          </w:tcPr>
+          <w:p>
+            <w:pPr>
+              <w:spacing w:after="0" w:line="180" w:lineRule="atLeast"/>
+              <w:rPr>
+                <w:sz w:val="21"/>
+                <w:szCs w:val="32"/>
+              </w:rPr>
+            </w:pPr>
+            <w:r>
+              <w:rPr>
+                <w:sz w:val="20"/>
+                <w:szCs w:val="20"/>
+              </w:rPr>
+              <w:t>Reduced customer-data exposure by closing FTP and privileged-access gaps and strengthening file-sharing governance.</w:t>
+            </w:r>
+          </w:p>
+        </w:tc>
+        <w:tc>
+          <w:tcPr>
+            <w:tcW w:w="0" w:type="auto"/>
+            <w:tcBorders>
+              <w:top w:val="single" w:sz="4" w:space="0" w:color="156082"/>
+              <w:left w:val="single" w:sz="4" w:space="0" w:color="156082"/>
+              <w:bottom w:val="single" w:sz="4" w:space="0" w:color="156082"/>
+              <w:right w:val="single" w:sz="4" w:space="0" w:color="156082"/>
+            </w:tcBorders>
+            <w:shd w:val="clear" w:color="auto" w:fill="EAF3F8"/>
+            <w:tcMar>
+              <w:top w:w="0" w:type="dxa"/>
+              <w:left w:w="60" w:type="dxa"/>
+              <w:bottom w:w="0" w:type="dxa"/>
+              <w:right w:w="60" w:type="dxa"/>
+            </w:tcMar>
+            <w:hideMark/>
+          </w:tcPr>
+          <w:p>
+            <w:pPr>
+              <w:spacing w:after="0" w:line="180" w:lineRule="atLeast"/>
               <w:cnfStyle w:val="000000100000" w:firstRow="0" w:lastRow="0" w:firstColumn="0" w:lastColumn="0" w:oddVBand="0" w:evenVBand="0" w:oddHBand="1" w:evenHBand="0" w:firstRowFirstColumn="0" w:firstRowLastColumn="0" w:lastRowFirstColumn="0" w:lastRowLastColumn="0"/>
               <w:rPr>
-                <w:sz w:val="16"/>
-                <w:szCs w:val="16"/>
-              </w:rPr>
-            </w:pPr>
-            <w:r>
-              <w:rPr>
-                <w:sz w:val="16"/>
-                <w:szCs w:val="16"/>
-              </w:rPr>
-              <w:t>High exposure, active threat route or limited assurance.</w:t>
-            </w:r>
-          </w:p>
-        </w:tc>
-        <w:tc>
-          <w:tcPr>
-            <w:tcW w:w="0" w:type="auto"/>
-            <w:shd w:val="clear" w:color="auto" w:fill="FCE4D6"/>
-            <w:hideMark/>
-          </w:tcPr>
-          <w:p>
-            <w:pPr>
-              <w:spacing w:after="160"/>
-              <w:cnfStyle w:val="000000100000" w:firstRow="0" w:lastRow="0" w:firstColumn="0" w:lastColumn="0" w:oddVBand="0" w:evenVBand="0" w:oddHBand="1" w:evenHBand="0" w:firstRowFirstColumn="0" w:firstRowLastColumn="0" w:lastRowFirstColumn="0" w:lastRowLastColumn="0"/>
-              <w:rPr>
-                <w:sz w:val="16"/>
-                <w:szCs w:val="16"/>
-              </w:rPr>
-            </w:pPr>
-            <w:r>
-              <w:rPr>
-                <w:sz w:val="16"/>
-                <w:szCs w:val="16"/>
-              </w:rPr>
-              <w:t>Severe disruption, data loss, recovery uncertainty or stakeholder impact.</w:t>
-            </w:r>
-          </w:p>
-        </w:tc>
-        <w:tc>
-          <w:tcPr>
-            <w:tcW w:w="0" w:type="auto"/>
-            <w:shd w:val="clear" w:color="auto" w:fill="C00000"/>
-            <w:hideMark/>
-          </w:tcPr>
-          <w:p>
-            <w:pPr>
-              <w:spacing w:after="160"/>
-              <w:cnfStyle w:val="000000100000" w:firstRow="0" w:lastRow="0" w:firstColumn="0" w:lastColumn="0" w:oddVBand="0" w:evenVBand="0" w:oddHBand="1" w:evenHBand="0" w:firstRowFirstColumn="0" w:firstRowLastColumn="0" w:lastRowFirstColumn="0" w:lastRowLastColumn="0"/>
-              <w:rPr>
-                <w:color w:val="FFFFFF"/>
-                <w:sz w:val="16"/>
-                <w:szCs w:val="16"/>
+                <w:sz w:val="21"/>
+                <w:szCs w:val="32"/>
               </w:rPr>
             </w:pPr>
             <w:r>
               <w:rPr>
                 <w:b/>
                 <w:bCs/>
-                <w:color w:val="FFFFFF"/>
-                <w:sz w:val="16"/>
-                <w:szCs w:val="16"/>
-              </w:rPr>
-              <w:t>Red:</w:t>
-            </w:r>
-            <w:r>
-              <w:rPr>
-                <w:color w:val="FFFFFF"/>
-                <w:sz w:val="16"/>
-                <w:szCs w:val="16"/>
-              </w:rPr>
-              <w:t xml:space="preserve"> executive priority for funded action.</w:t>
+                <w:color w:val="000000"/>
+                <w:sz w:val="20"/>
+                <w:szCs w:val="20"/>
+              </w:rPr>
+              <w:t>Defensible investment case</w:t>
+            </w:r>
+            <w:r>
+              <w:rPr>
+                <w:color w:val="000000"/>
+                <w:sz w:val="20"/>
+                <w:szCs w:val="20"/>
+              </w:rPr>
+              <w:t xml:space="preserve"> with evidence-led cost, scope and sequencing for MDR, vulnerability scanning and recovery assurance.</w:t>
             </w:r>
           </w:p>
         </w:tc>
@@ -1505,15 +2110,8 @@
       <w:pPr>
         <w:rPr>
           <w:kern w:val="0"/>
-          <w:lang w:eastAsia="en-GB"/>
-          <w14:ligatures w14:val="none"/>
-        </w:rPr>
-      </w:pPr>
-    </w:p>
-    <w:p>
-      <w:pPr>
-        <w:rPr>
-          <w:kern w:val="0"/>
+          <w:sz w:val="21"/>
+          <w:szCs w:val="21"/>
           <w:lang w:eastAsia="en-GB"/>
           <w14:ligatures w14:val="none"/>
         </w:rPr>
@@ -1525,6 +2123,8 @@
         <w:rPr>
           <w:rFonts w:cstheme="minorBidi"/>
           <w:kern w:val="36"/>
+          <w:sz w:val="32"/>
+          <w:szCs w:val="32"/>
           <w:lang w:eastAsia="en-GB"/>
           <w14:ligatures w14:val="none"/>
         </w:rPr>
@@ -1532,6 +2132,8 @@
       <w:r>
         <w:rPr>
           <w:rFonts w:cstheme="minorBidi"/>
+          <w:sz w:val="32"/>
+          <w:szCs w:val="48"/>
         </w:rPr>
         <w:t>Indicative Costs</w:t>
       </w:r>
@@ -1543,9 +2145,9 @@
         <w:tblLook w:val="04A0" w:firstRow="1" w:lastRow="0" w:firstColumn="1" w:lastColumn="0" w:noHBand="0" w:noVBand="1"/>
       </w:tblPr>
       <w:tblGrid>
-        <w:gridCol w:w="2278"/>
-        <w:gridCol w:w="5683"/>
-        <w:gridCol w:w="1055"/>
+        <w:gridCol w:w="2249"/>
+        <w:gridCol w:w="6080"/>
+        <w:gridCol w:w="2127"/>
       </w:tblGrid>
       <w:tr>
         <w:trPr>
@@ -1564,8 +2166,8 @@
               <w:rPr>
                 <w:color w:val="FFFFFF"/>
                 <w:kern w:val="0"/>
-                <w:sz w:val="18"/>
-                <w:szCs w:val="18"/>
+                <w:sz w:val="21"/>
+                <w:szCs w:val="21"/>
                 <w:lang w:eastAsia="en-GB"/>
                 <w14:ligatures w14:val="none"/>
               </w:rPr>
@@ -1573,8 +2175,8 @@
             <w:r>
               <w:rPr>
                 <w:color w:val="FFFFFF"/>
-                <w:sz w:val="18"/>
-                <w:szCs w:val="18"/>
+                <w:sz w:val="21"/>
+                <w:szCs w:val="21"/>
               </w:rPr>
               <w:t>Workstream</w:t>
             </w:r>
@@ -1592,15 +2194,15 @@
               <w:cnfStyle w:val="100000000000" w:firstRow="1" w:lastRow="0" w:firstColumn="0" w:lastColumn="0" w:oddVBand="0" w:evenVBand="0" w:oddHBand="0" w:evenHBand="0" w:firstRowFirstColumn="0" w:firstRowLastColumn="0" w:lastRowFirstColumn="0" w:lastRowLastColumn="0"/>
               <w:rPr>
                 <w:color w:val="FFFFFF"/>
-                <w:sz w:val="18"/>
-                <w:szCs w:val="18"/>
+                <w:sz w:val="21"/>
+                <w:szCs w:val="21"/>
               </w:rPr>
             </w:pPr>
             <w:r>
               <w:rPr>
                 <w:color w:val="FFFFFF"/>
-                <w:sz w:val="18"/>
-                <w:szCs w:val="18"/>
+                <w:sz w:val="21"/>
+                <w:szCs w:val="21"/>
               </w:rPr>
               <w:t>Indicative Scope</w:t>
             </w:r>
@@ -1618,15 +2220,15 @@
               <w:cnfStyle w:val="100000000000" w:firstRow="1" w:lastRow="0" w:firstColumn="0" w:lastColumn="0" w:oddVBand="0" w:evenVBand="0" w:oddHBand="0" w:evenHBand="0" w:firstRowFirstColumn="0" w:firstRowLastColumn="0" w:lastRowFirstColumn="0" w:lastRowLastColumn="0"/>
               <w:rPr>
                 <w:color w:val="FFFFFF"/>
-                <w:sz w:val="18"/>
-                <w:szCs w:val="18"/>
+                <w:sz w:val="21"/>
+                <w:szCs w:val="21"/>
               </w:rPr>
             </w:pPr>
             <w:r>
               <w:rPr>
                 <w:color w:val="FFFFFF"/>
-                <w:sz w:val="18"/>
-                <w:szCs w:val="18"/>
+                <w:sz w:val="21"/>
+                <w:szCs w:val="21"/>
               </w:rPr>
               <w:t>Cost Range</w:t>
             </w:r>
@@ -1646,19 +2248,30 @@
           </w:tcPr>
           <w:p>
             <w:pPr>
-              <w:spacing w:after="160"/>
-              <w:rPr>
-                <w:sz w:val="18"/>
-                <w:szCs w:val="18"/>
-              </w:rPr>
-            </w:pPr>
-            <w:r>
-              <w:rPr>
-                <w:sz w:val="18"/>
-                <w:szCs w:val="18"/>
-              </w:rPr>
-              <w:t>Microsoft 365 recovery</w:t>
-            </w:r>
+              <w:rPr>
+                <w:b w:val="0"/>
+                <w:bCs w:val="0"/>
+                <w:color w:val="000000"/>
+                <w:sz w:val="21"/>
+                <w:szCs w:val="21"/>
+              </w:rPr>
+            </w:pPr>
+            <w:r>
+              <w:rPr>
+                <w:color w:val="000000"/>
+                <w:sz w:val="21"/>
+                <w:szCs w:val="21"/>
+              </w:rPr>
+              <w:t>MDR readiness and out-of-hours response</w:t>
+            </w:r>
+          </w:p>
+          <w:p>
+            <w:pPr>
+              <w:rPr>
+                <w:sz w:val="21"/>
+                <w:szCs w:val="21"/>
+              </w:rPr>
+            </w:pPr>
           </w:p>
         </w:tc>
         <w:tc>
@@ -1669,19 +2282,19 @@
           </w:tcPr>
           <w:p>
             <w:pPr>
-              <w:spacing w:after="160"/>
               <w:cnfStyle w:val="000000100000" w:firstRow="0" w:lastRow="0" w:firstColumn="0" w:lastColumn="0" w:oddVBand="0" w:evenVBand="0" w:oddHBand="1" w:evenHBand="0" w:firstRowFirstColumn="0" w:firstRowLastColumn="0" w:lastRowFirstColumn="0" w:lastRowLastColumn="0"/>
               <w:rPr>
-                <w:sz w:val="18"/>
-                <w:szCs w:val="18"/>
-              </w:rPr>
-            </w:pPr>
-            <w:r>
-              <w:rPr>
-                <w:sz w:val="18"/>
-                <w:szCs w:val="18"/>
-              </w:rPr>
-              <w:t>Recovery requirements, backup option review, retention model and restore testing.</w:t>
+                <w:sz w:val="21"/>
+                <w:szCs w:val="21"/>
+              </w:rPr>
+            </w:pPr>
+            <w:r>
+              <w:rPr>
+                <w:color w:val="000000"/>
+                <w:sz w:val="21"/>
+                <w:szCs w:val="21"/>
+              </w:rPr>
+              <w:t>Telemetry review across Webroot, Fortinet, Google Workspace, Freshdesk, email and cloud services; escalation model; containment authority; MDR options comparison.</w:t>
             </w:r>
           </w:p>
         </w:tc>
@@ -1693,19 +2306,19 @@
           </w:tcPr>
           <w:p>
             <w:pPr>
-              <w:spacing w:after="160"/>
               <w:cnfStyle w:val="000000100000" w:firstRow="0" w:lastRow="0" w:firstColumn="0" w:lastColumn="0" w:oddVBand="0" w:evenVBand="0" w:oddHBand="1" w:evenHBand="0" w:firstRowFirstColumn="0" w:firstRowLastColumn="0" w:lastRowFirstColumn="0" w:lastRowLastColumn="0"/>
               <w:rPr>
-                <w:sz w:val="18"/>
-                <w:szCs w:val="18"/>
-              </w:rPr>
-            </w:pPr>
-            <w:r>
-              <w:rPr>
-                <w:sz w:val="18"/>
-                <w:szCs w:val="18"/>
-              </w:rPr>
-              <w:t>£[x] – £[y]</w:t>
+                <w:sz w:val="21"/>
+                <w:szCs w:val="21"/>
+              </w:rPr>
+            </w:pPr>
+            <w:r>
+              <w:rPr>
+                <w:color w:val="000000"/>
+                <w:sz w:val="21"/>
+                <w:szCs w:val="21"/>
+              </w:rPr>
+              <w:t>High / TBC</w:t>
             </w:r>
           </w:p>
         </w:tc>
@@ -1719,64 +2332,61 @@
           </w:tcPr>
           <w:p>
             <w:pPr>
-              <w:spacing w:after="160"/>
-              <w:rPr>
-                <w:sz w:val="18"/>
-                <w:szCs w:val="18"/>
-              </w:rPr>
-            </w:pPr>
-            <w:r>
-              <w:rPr>
-                <w:sz w:val="18"/>
-                <w:szCs w:val="18"/>
-              </w:rPr>
-              <w:t>Email and identity assurance</w:t>
-            </w:r>
-          </w:p>
-        </w:tc>
-        <w:tc>
-          <w:tcPr>
-            <w:tcW w:w="0" w:type="auto"/>
-            <w:hideMark/>
-          </w:tcPr>
-          <w:p>
-            <w:pPr>
-              <w:spacing w:after="160"/>
+              <w:rPr>
+                <w:sz w:val="21"/>
+                <w:szCs w:val="21"/>
+              </w:rPr>
+            </w:pPr>
+            <w:r>
+              <w:rPr>
+                <w:sz w:val="21"/>
+                <w:szCs w:val="21"/>
+              </w:rPr>
+              <w:t>Incident and recovery readiness</w:t>
+            </w:r>
+          </w:p>
+        </w:tc>
+        <w:tc>
+          <w:tcPr>
+            <w:tcW w:w="0" w:type="auto"/>
+            <w:hideMark/>
+          </w:tcPr>
+          <w:p>
+            <w:pPr>
               <w:cnfStyle w:val="000000000000" w:firstRow="0" w:lastRow="0" w:firstColumn="0" w:lastColumn="0" w:oddVBand="0" w:evenVBand="0" w:oddHBand="0" w:evenHBand="0" w:firstRowFirstColumn="0" w:firstRowLastColumn="0" w:lastRowFirstColumn="0" w:lastRowLastColumn="0"/>
               <w:rPr>
-                <w:sz w:val="18"/>
-                <w:szCs w:val="18"/>
-              </w:rPr>
-            </w:pPr>
-            <w:r>
-              <w:rPr>
-                <w:sz w:val="18"/>
-                <w:szCs w:val="18"/>
-              </w:rPr>
-              <w:t>Defender review, MFA audit, OAuth/mailbox controls and email security comparison.</w:t>
-            </w:r>
-          </w:p>
-        </w:tc>
-        <w:tc>
-          <w:tcPr>
-            <w:tcW w:w="0" w:type="auto"/>
-            <w:hideMark/>
-          </w:tcPr>
-          <w:p>
-            <w:pPr>
-              <w:spacing w:after="160"/>
+                <w:sz w:val="21"/>
+                <w:szCs w:val="21"/>
+              </w:rPr>
+            </w:pPr>
+            <w:r>
+              <w:rPr>
+                <w:sz w:val="21"/>
+                <w:szCs w:val="21"/>
+              </w:rPr>
+              <w:t>Executive tabletop exercise, response-plan review, recovery-priority workshop and representative Google Workspace recovery test.</w:t>
+            </w:r>
+          </w:p>
+        </w:tc>
+        <w:tc>
+          <w:tcPr>
+            <w:tcW w:w="0" w:type="auto"/>
+            <w:hideMark/>
+          </w:tcPr>
+          <w:p>
+            <w:pPr>
               <w:cnfStyle w:val="000000000000" w:firstRow="0" w:lastRow="0" w:firstColumn="0" w:lastColumn="0" w:oddVBand="0" w:evenVBand="0" w:oddHBand="0" w:evenHBand="0" w:firstRowFirstColumn="0" w:firstRowLastColumn="0" w:lastRowFirstColumn="0" w:lastRowLastColumn="0"/>
               <w:rPr>
-                <w:sz w:val="18"/>
-                <w:szCs w:val="18"/>
-              </w:rPr>
-            </w:pPr>
-            <w:r>
-              <w:rPr>
-                <w:sz w:val="18"/>
-                <w:szCs w:val="18"/>
-              </w:rPr>
-              <w:t>£[x] – £[y]</w:t>
+                <w:sz w:val="21"/>
+                <w:szCs w:val="21"/>
+              </w:rPr>
+            </w:pPr>
+            <w:r>
+              <w:rPr>
+                <w:sz w:val="21"/>
+                <w:szCs w:val="21"/>
+              </w:rPr>
+              <w:t>Medium initially; High if backup licensing is added</w:t>
             </w:r>
           </w:p>
         </w:tc>
@@ -1794,19 +2404,30 @@
           </w:tcPr>
           <w:p>
             <w:pPr>
-              <w:spacing w:after="160"/>
-              <w:rPr>
-                <w:sz w:val="18"/>
-                <w:szCs w:val="18"/>
-              </w:rPr>
-            </w:pPr>
-            <w:r>
-              <w:rPr>
-                <w:sz w:val="18"/>
-                <w:szCs w:val="18"/>
-              </w:rPr>
-              <w:t>Response readiness</w:t>
-            </w:r>
+              <w:rPr>
+                <w:b w:val="0"/>
+                <w:bCs w:val="0"/>
+                <w:color w:val="000000"/>
+                <w:sz w:val="21"/>
+                <w:szCs w:val="21"/>
+              </w:rPr>
+            </w:pPr>
+            <w:r>
+              <w:rPr>
+                <w:color w:val="000000"/>
+                <w:sz w:val="21"/>
+                <w:szCs w:val="21"/>
+              </w:rPr>
+              <w:t>Vulnerability visibility and FTP remediation</w:t>
+            </w:r>
+          </w:p>
+          <w:p>
+            <w:pPr>
+              <w:rPr>
+                <w:sz w:val="21"/>
+                <w:szCs w:val="21"/>
+              </w:rPr>
+            </w:pPr>
           </w:p>
         </w:tc>
         <w:tc>
@@ -1817,19 +2438,37 @@
           </w:tcPr>
           <w:p>
             <w:pPr>
-              <w:spacing w:after="160"/>
               <w:cnfStyle w:val="000000100000" w:firstRow="0" w:lastRow="0" w:firstColumn="0" w:lastColumn="0" w:oddVBand="0" w:evenVBand="0" w:oddHBand="1" w:evenHBand="0" w:firstRowFirstColumn="0" w:firstRowLastColumn="0" w:lastRowFirstColumn="0" w:lastRowLastColumn="0"/>
               <w:rPr>
-                <w:sz w:val="18"/>
-                <w:szCs w:val="18"/>
-              </w:rPr>
-            </w:pPr>
-            <w:r>
-              <w:rPr>
-                <w:sz w:val="18"/>
-                <w:szCs w:val="18"/>
-              </w:rPr>
-              <w:t>IR/DR playbooks, tabletop exercise, telemetry validation and MDR readiness review.</w:t>
+                <w:sz w:val="21"/>
+                <w:szCs w:val="21"/>
+              </w:rPr>
+            </w:pPr>
+            <w:r>
+              <w:rPr>
+                <w:color w:val="000000"/>
+                <w:sz w:val="21"/>
+                <w:szCs w:val="21"/>
+              </w:rPr>
+              <w:t xml:space="preserve">Dedicated vulnerability scanning across endpoints, servers, </w:t>
+            </w:r>
+            <w:proofErr w:type="spellStart"/>
+            <w:r>
+              <w:rPr>
+                <w:color w:val="000000"/>
+                <w:sz w:val="21"/>
+                <w:szCs w:val="21"/>
+              </w:rPr>
+              <w:t>ESXi</w:t>
+            </w:r>
+            <w:proofErr w:type="spellEnd"/>
+            <w:r>
+              <w:rPr>
+                <w:color w:val="000000"/>
+                <w:sz w:val="21"/>
+                <w:szCs w:val="21"/>
+              </w:rPr>
+              <w:t xml:space="preserve"> hosts and external services; FTP access decision; remediation tracking and evidence register.</w:t>
             </w:r>
           </w:p>
         </w:tc>
@@ -1841,19 +2480,19 @@
           </w:tcPr>
           <w:p>
             <w:pPr>
-              <w:spacing w:after="160"/>
               <w:cnfStyle w:val="000000100000" w:firstRow="0" w:lastRow="0" w:firstColumn="0" w:lastColumn="0" w:oddVBand="0" w:evenVBand="0" w:oddHBand="1" w:evenHBand="0" w:firstRowFirstColumn="0" w:firstRowLastColumn="0" w:lastRowFirstColumn="0" w:lastRowLastColumn="0"/>
               <w:rPr>
-                <w:sz w:val="18"/>
-                <w:szCs w:val="18"/>
-              </w:rPr>
-            </w:pPr>
-            <w:r>
-              <w:rPr>
-                <w:sz w:val="18"/>
-                <w:szCs w:val="18"/>
-              </w:rPr>
-              <w:t>£[x] – £[y]</w:t>
+                <w:sz w:val="21"/>
+                <w:szCs w:val="21"/>
+              </w:rPr>
+            </w:pPr>
+            <w:r>
+              <w:rPr>
+                <w:color w:val="000000"/>
+                <w:sz w:val="21"/>
+                <w:szCs w:val="21"/>
+              </w:rPr>
+              <w:t>Medium to High / TBC</w:t>
             </w:r>
           </w:p>
         </w:tc>
@@ -1867,64 +2506,71 @@
           </w:tcPr>
           <w:p>
             <w:pPr>
-              <w:spacing w:after="160"/>
-              <w:rPr>
-                <w:sz w:val="18"/>
-                <w:szCs w:val="18"/>
-              </w:rPr>
-            </w:pPr>
-            <w:r>
-              <w:rPr>
-                <w:sz w:val="18"/>
-                <w:szCs w:val="18"/>
-              </w:rPr>
-              <w:t>Combined package</w:t>
-            </w:r>
-          </w:p>
-        </w:tc>
-        <w:tc>
-          <w:tcPr>
-            <w:tcW w:w="0" w:type="auto"/>
-            <w:hideMark/>
-          </w:tcPr>
-          <w:p>
-            <w:pPr>
-              <w:spacing w:after="160"/>
+              <w:rPr>
+                <w:b w:val="0"/>
+                <w:bCs w:val="0"/>
+                <w:sz w:val="21"/>
+                <w:szCs w:val="21"/>
+              </w:rPr>
+            </w:pPr>
+            <w:r>
+              <w:rPr>
+                <w:sz w:val="21"/>
+                <w:szCs w:val="21"/>
+              </w:rPr>
+              <w:t>Combined discovery and remediation plan</w:t>
+            </w:r>
+          </w:p>
+          <w:p>
+            <w:pPr>
+              <w:rPr>
+                <w:sz w:val="21"/>
+                <w:szCs w:val="21"/>
+              </w:rPr>
+            </w:pPr>
+          </w:p>
+        </w:tc>
+        <w:tc>
+          <w:tcPr>
+            <w:tcW w:w="0" w:type="auto"/>
+            <w:hideMark/>
+          </w:tcPr>
+          <w:p>
+            <w:pPr>
               <w:cnfStyle w:val="000000000000" w:firstRow="0" w:lastRow="0" w:firstColumn="0" w:lastColumn="0" w:oddVBand="0" w:evenVBand="0" w:oddHBand="0" w:evenHBand="0" w:firstRowFirstColumn="0" w:firstRowLastColumn="0" w:lastRowFirstColumn="0" w:lastRowLastColumn="0"/>
               <w:rPr>
-                <w:sz w:val="18"/>
-                <w:szCs w:val="18"/>
-              </w:rPr>
-            </w:pPr>
-            <w:r>
-              <w:rPr>
-                <w:sz w:val="18"/>
-                <w:szCs w:val="18"/>
-              </w:rPr>
-              <w:t>Coordinated delivery with governance check-ins and consolidated executive reporting.</w:t>
-            </w:r>
-          </w:p>
-        </w:tc>
-        <w:tc>
-          <w:tcPr>
-            <w:tcW w:w="0" w:type="auto"/>
-            <w:hideMark/>
-          </w:tcPr>
-          <w:p>
-            <w:pPr>
-              <w:spacing w:after="160"/>
+                <w:sz w:val="21"/>
+                <w:szCs w:val="21"/>
+              </w:rPr>
+            </w:pPr>
+            <w:r>
+              <w:rPr>
+                <w:sz w:val="21"/>
+                <w:szCs w:val="21"/>
+              </w:rPr>
+              <w:t>Coordinated delivery covering MDR readiness, tabletop exercise, FTP decision, vulnerability scanning scope, Google Workspace recovery requirements and ISO-aligned improvement tracking.</w:t>
+            </w:r>
+          </w:p>
+        </w:tc>
+        <w:tc>
+          <w:tcPr>
+            <w:tcW w:w="0" w:type="auto"/>
+            <w:hideMark/>
+          </w:tcPr>
+          <w:p>
+            <w:pPr>
               <w:cnfStyle w:val="000000000000" w:firstRow="0" w:lastRow="0" w:firstColumn="0" w:lastColumn="0" w:oddVBand="0" w:evenVBand="0" w:oddHBand="0" w:evenHBand="0" w:firstRowFirstColumn="0" w:firstRowLastColumn="0" w:lastRowFirstColumn="0" w:lastRowLastColumn="0"/>
               <w:rPr>
-                <w:sz w:val="18"/>
-                <w:szCs w:val="18"/>
-              </w:rPr>
-            </w:pPr>
-            <w:r>
-              <w:rPr>
-                <w:sz w:val="18"/>
-                <w:szCs w:val="18"/>
-              </w:rPr>
-              <w:t>£[x] – £[y]</w:t>
+                <w:sz w:val="21"/>
+                <w:szCs w:val="21"/>
+              </w:rPr>
+            </w:pPr>
+            <w:r>
+              <w:rPr>
+                <w:sz w:val="21"/>
+                <w:szCs w:val="21"/>
+              </w:rPr>
+              <w:t>TBC following discovery</w:t>
             </w:r>
           </w:p>
         </w:tc>
@@ -1942,8 +2588,8 @@
         <w:rPr>
           <w:color w:val="000000"/>
           <w:kern w:val="0"/>
-          <w:sz w:val="18"/>
-          <w:szCs w:val="18"/>
+          <w:sz w:val="21"/>
+          <w:szCs w:val="21"/>
           <w:lang w:eastAsia="en-GB"/>
           <w14:ligatures w14:val="none"/>
         </w:rPr>
@@ -1953,31 +2599,107 @@
           <w:b/>
           <w:bCs/>
           <w:color w:val="000000"/>
-          <w:sz w:val="18"/>
-          <w:szCs w:val="18"/>
+          <w:sz w:val="21"/>
+          <w:szCs w:val="21"/>
         </w:rPr>
         <w:t>Recommended next step:</w:t>
       </w:r>
       <w:r>
         <w:rPr>
           <w:color w:val="000000"/>
-          <w:sz w:val="18"/>
-          <w:szCs w:val="18"/>
-        </w:rPr>
-        <w:t xml:space="preserve"> approve a scoped discovery and remediation planning exercise covering Microsoft 365 backup, email and identity assurance, and incident response readiness. This should produce confirmed costs, delivery sequencing, ownership and decision points for funded change.</w:t>
+          <w:sz w:val="21"/>
+          <w:szCs w:val="21"/>
+        </w:rPr>
+        <w:t xml:space="preserve"> approve a scoped discovery and remediation planning exercise </w:t>
+      </w:r>
+      <w:r>
+        <w:rPr>
+          <w:color w:val="000000"/>
+          <w:sz w:val="21"/>
+          <w:szCs w:val="21"/>
+        </w:rPr>
+        <w:t>for the identified workstreams.</w:t>
+      </w:r>
+      <w:r>
+        <w:rPr>
+          <w:color w:val="000000"/>
+          <w:sz w:val="21"/>
+          <w:szCs w:val="21"/>
+        </w:rPr>
+        <w:t xml:space="preserve"> This should </w:t>
+      </w:r>
+      <w:r>
+        <w:rPr>
+          <w:color w:val="000000"/>
+          <w:sz w:val="21"/>
+          <w:szCs w:val="21"/>
+        </w:rPr>
+        <w:t>confirm</w:t>
+      </w:r>
+      <w:r>
+        <w:rPr>
+          <w:color w:val="000000"/>
+          <w:sz w:val="21"/>
+          <w:szCs w:val="21"/>
+        </w:rPr>
+        <w:t xml:space="preserve"> costs, </w:t>
+      </w:r>
+      <w:r>
+        <w:rPr>
+          <w:color w:val="000000"/>
+          <w:sz w:val="21"/>
+          <w:szCs w:val="21"/>
+        </w:rPr>
+        <w:t>sequencing, ownership</w:t>
+      </w:r>
+      <w:r>
+        <w:rPr>
+          <w:color w:val="000000"/>
+          <w:sz w:val="21"/>
+          <w:szCs w:val="21"/>
+        </w:rPr>
+        <w:t>, telemetry readiness, supplier dependencies</w:t>
+      </w:r>
+      <w:r>
+        <w:rPr>
+          <w:color w:val="000000"/>
+          <w:sz w:val="21"/>
+          <w:szCs w:val="21"/>
+        </w:rPr>
+        <w:t xml:space="preserve"> and decision points for funded change.</w:t>
       </w:r>
     </w:p>
     <w:p>
       <w:pPr>
         <w:rPr>
           <w:kern w:val="0"/>
+          <w:szCs w:val="18"/>
           <w:lang w:eastAsia="en-GB"/>
           <w14:ligatures w14:val="none"/>
         </w:rPr>
       </w:pPr>
+      <w:r>
+        <w:rPr>
+          <w:b/>
+          <w:bCs/>
+          <w:color w:val="595959"/>
+          <w:sz w:val="21"/>
+          <w:szCs w:val="21"/>
+        </w:rPr>
+        <w:t>Assumptions:</w:t>
+      </w:r>
+      <w:r>
+        <w:rPr>
+          <w:color w:val="595959"/>
+          <w:sz w:val="21"/>
+          <w:szCs w:val="21"/>
+        </w:rPr>
+        <w:t xml:space="preserve"> Cost bands are indicative planning categories rather than quotations. Final costs depend on asset scope, user count, telemetry availability, supplier pricing, licensing, response model and delivery sequencing. This snapshot summarises the full Northbridge Trading Ltd Cybersecurity Maturity Assessment and does not replace the supporting evidence base.</w:t>
+      </w:r>
     </w:p>
     <w:p>
       <w:pPr>
+        <w:jc w:val="center"/>
         <w:rPr>
           <w:color w:val="595959"/>
           <w:kern w:val="0"/>
@@ -1989,156 +2711,197 @@
       </w:pPr>
       <w:r>
         <w:rPr>
-          <w:b/>
           <w:color w:val="595959"/>
-          <w:sz w:val="18"/>
-          <w:szCs w:val="18"/>
-        </w:rPr>
-        <w:t>Assumptions:</w:t>
-      </w:r>
-      <w:r>
-        <w:rPr>
-          <w:color w:val="595959"/>
-          <w:sz w:val="18"/>
-          <w:szCs w:val="18"/>
-        </w:rPr>
-        <w:t xml:space="preserve"> </w:t>
-      </w:r>
-      <w:r>
-        <w:rPr>
-          <w:color w:val="595959"/>
-          <w:sz w:val="18"/>
-          <w:szCs w:val="18"/>
-        </w:rPr>
-        <w:t>Indicative costs</w:t>
-      </w:r>
-      <w:r>
-        <w:rPr>
-          <w:color w:val="595959"/>
-          <w:sz w:val="18"/>
-          <w:szCs w:val="18"/>
-        </w:rPr>
-        <w:t xml:space="preserve"> should be refined once </w:t>
-      </w:r>
-      <w:r>
-        <w:rPr>
-          <w:color w:val="595959"/>
-          <w:sz w:val="18"/>
-          <w:szCs w:val="18"/>
-        </w:rPr>
-        <w:t>scope, licensing</w:t>
-      </w:r>
-      <w:r>
-        <w:rPr>
-          <w:color w:val="595959"/>
-          <w:sz w:val="18"/>
-          <w:szCs w:val="18"/>
-        </w:rPr>
-        <w:t xml:space="preserve">, delivery model and </w:t>
-      </w:r>
-      <w:r>
-        <w:rPr>
-          <w:color w:val="595959"/>
-          <w:sz w:val="18"/>
-          <w:szCs w:val="18"/>
-        </w:rPr>
-        <w:t xml:space="preserve">dependencies </w:t>
-      </w:r>
-      <w:r>
-        <w:rPr>
-          <w:color w:val="595959"/>
-          <w:sz w:val="18"/>
-          <w:szCs w:val="18"/>
-        </w:rPr>
-        <w:t xml:space="preserve">are </w:t>
-      </w:r>
-      <w:r>
-        <w:rPr>
-          <w:color w:val="595959"/>
-          <w:sz w:val="18"/>
-          <w:szCs w:val="18"/>
-        </w:rPr>
-        <w:t xml:space="preserve">confirmed. </w:t>
-      </w:r>
-      <w:r>
-        <w:rPr>
-          <w:color w:val="595959"/>
-          <w:sz w:val="18"/>
-          <w:szCs w:val="18"/>
-        </w:rPr>
-        <w:t>This document summarises</w:t>
-      </w:r>
-      <w:r>
-        <w:rPr>
-          <w:color w:val="595959"/>
-          <w:sz w:val="18"/>
-          <w:szCs w:val="18"/>
-        </w:rPr>
-        <w:t xml:space="preserve"> the full assessment </w:t>
-      </w:r>
-      <w:r>
-        <w:rPr>
-          <w:color w:val="595959"/>
-          <w:sz w:val="18"/>
-          <w:szCs w:val="18"/>
-        </w:rPr>
-        <w:t>and does not</w:t>
-      </w:r>
-      <w:r>
-        <w:rPr>
-          <w:color w:val="595959"/>
-          <w:sz w:val="18"/>
-          <w:szCs w:val="18"/>
-        </w:rPr>
-        <w:t xml:space="preserve"> replace the </w:t>
-      </w:r>
-      <w:r>
-        <w:rPr>
-          <w:color w:val="595959"/>
-          <w:sz w:val="18"/>
-          <w:szCs w:val="18"/>
-        </w:rPr>
-        <w:t>supporting</w:t>
-      </w:r>
-      <w:r>
-        <w:rPr>
-          <w:color w:val="595959"/>
-          <w:sz w:val="18"/>
-          <w:szCs w:val="18"/>
-        </w:rPr>
-        <w:t xml:space="preserve"> evidence base.</w:t>
-      </w:r>
-    </w:p>
-    <w:p>
-      <w:pPr>
-        <w:jc w:val="center"/>
-        <w:rPr>
-          <w:color w:val="595959"/>
-          <w:kern w:val="0"/>
-          <w:sz w:val="16"/>
-          <w:szCs w:val="16"/>
-          <w:lang w:eastAsia="en-GB"/>
-          <w14:ligatures w14:val="none"/>
-        </w:rPr>
-      </w:pPr>
-      <w:r>
-        <w:rPr>
-          <w:color w:val="595959"/>
-          <w:sz w:val="16"/>
-          <w:szCs w:val="16"/>
+          <w:sz w:val="20"/>
+          <w:szCs w:val="20"/>
         </w:rPr>
         <w:t>Confidential | Executive Summary Extract | Planet IT</w:t>
       </w:r>
     </w:p>
-    <w:p/>
     <w:sectPr>
+      <w:headerReference w:type="even" r:id="rId7"/>
+      <w:headerReference w:type="default" r:id="rId8"/>
+      <w:footerReference w:type="even" r:id="rId9"/>
+      <w:footerReference w:type="default" r:id="rId10"/>
+      <w:headerReference w:type="first" r:id="rId11"/>
+      <w:footerReference w:type="first" r:id="rId12"/>
       <w:pgSz w:w="11906" w:h="16838"/>
-      <w:pgMar w:top="1440" w:right="1440" w:bottom="1440" w:left="1440" w:header="708" w:footer="708" w:gutter="0"/>
+      <w:pgMar w:top="1126" w:right="720" w:bottom="1079" w:left="720" w:header="400" w:footer="400" w:gutter="0"/>
       <w:cols w:space="708"/>
       <w:docGrid w:linePitch="360"/>
     </w:sectPr>
   </w:body>
 </w:document>
+</file>
+
+<file path=word/endnotes.xml><?xml version="1.0" encoding="utf-8"?>
+<w:endnotes xmlns:wpc="http://schemas.microsoft.com/office/word/2010/wordprocessingCanvas" xmlns:cx="http://schemas.microsoft.com/office/drawing/2014/chartex" xmlns:cx1="http://schemas.microsoft.com/office/drawing/2015/9/8/chartex" xmlns:cx2="http://schemas.microsoft.com/office/drawing/2015/10/21/chartex" xmlns:cx3="http://schemas.microsoft.com/office/drawing/2016/5/9/chartex" xmlns:cx4="http://schemas.microsoft.com/office/drawing/2016/5/10/chartex" xmlns:cx5="http://schemas.microsoft.com/office/drawing/2016/5/11/chartex" xmlns:cx6="http://schemas.microsoft.com/office/drawing/2016/5/12/chartex" xmlns:cx7="http://schemas.microsoft.com/office/drawing/2016/5/13/chartex" xmlns:cx8="http://schemas.microsoft.com/office/drawing/2016/5/14/chartex" xmlns:mc="http://schemas.openxmlformats.org/markup-compatibility/2006" xmlns:m="http://schemas.openxmlformats.org/officeDocument/2006/math" xmlns:aink="http://schemas.microsoft.com/office/drawing/2016/ink" xmlns:am3d="http://schemas.microsoft.com/office/drawing/2017/model3d" xmlns:oel="http://schemas.microsoft.com/office/2019/extlst" xmlns:r="http://schemas.openxmlformats.org/officeDocument/2006/relationships" xmlns:wp14="http://schemas.microsoft.com/office/word/2010/wordprocessingDrawing" xmlns:wp="http://schemas.openxmlformats.org/drawingml/2006/wordprocessingDrawing" xmlns:wpg="http://schemas.microsoft.com/office/word/2010/wordprocessingGroup" xmlns:wpi="http://schemas.microsoft.com/office/word/2010/wordprocessingInk" xmlns:wps="http://schemas.microsoft.com/office/word/2010/wordprocessingShape" xmlns:o="urn:schemas-microsoft-com:office:office" xmlns:v="urn:schemas-microsoft-com:vml" xmlns:w10="urn:schemas-microsoft-com:office:word" xmlns:w="http://schemas.openxmlformats.org/wordprocessingml/2006/main" xmlns:w14="http://schemas.microsoft.com/office/word/2010/wordml" xmlns:w15="http://schemas.microsoft.com/office/word/2012/wordml" xmlns:w16cex="http://schemas.microsoft.com/office/word/2018/wordml/cex" xmlns:w16cid="http://schemas.microsoft.com/office/word/2016/wordml/cid" xmlns:w16="http://schemas.microsoft.com/office/word/2018/wordml" xmlns:w16sdtdh="http://schemas.microsoft.com/office/word/2020/wordml/sdtdatahash" xmlns:w16sdtfl="http://schemas.microsoft.com/office/word/2024/wordml/sdtformatlock" xmlns:w16se="http://schemas.microsoft.com/office/word/2015/wordml/symex" xmlns:w16du="http://schemas.microsoft.com/office/word/2023/wordml/word16du" xmlns:wne="http://schemas.microsoft.com/office/word/2006/wordml" mc:Ignorable="w14 w15 w16se w16cid w16 w16cex w16sdtdh w16sdtfl w16du wp14">
+  <w:endnote w:type="separator" w:id="-1">
+    <w:p>
+      <w:pPr>
+        <w:spacing w:after="0" w:line="240" w:lineRule="auto"/>
+      </w:pPr>
+      <w:r>
+        <w:separator/>
+      </w:r>
+    </w:p>
+  </w:endnote>
+  <w:endnote w:type="continuationSeparator" w:id="0">
+    <w:p>
+      <w:pPr>
+        <w:spacing w:after="0" w:line="240" w:lineRule="auto"/>
+      </w:pPr>
+      <w:r>
+        <w:continuationSeparator/>
+      </w:r>
+    </w:p>
+  </w:endnote>
+</w:endnotes>
+</file>
+
+<file path=word/footer1.xml><?xml version="1.0" encoding="utf-8"?>
+<w:ftr xmlns:wpc="http://schemas.microsoft.com/office/word/2010/wordprocessingCanvas" xmlns:cx="http://schemas.microsoft.com/office/drawing/2014/chartex" xmlns:cx1="http://schemas.microsoft.com/office/drawing/2015/9/8/chartex" xmlns:cx2="http://schemas.microsoft.com/office/drawing/2015/10/21/chartex" xmlns:cx3="http://schemas.microsoft.com/office/drawing/2016/5/9/chartex" xmlns:cx4="http://schemas.microsoft.com/office/drawing/2016/5/10/chartex" xmlns:cx5="http://schemas.microsoft.com/office/drawing/2016/5/11/chartex" xmlns:cx6="http://schemas.microsoft.com/office/drawing/2016/5/12/chartex" xmlns:cx7="http://schemas.microsoft.com/office/drawing/2016/5/13/chartex" xmlns:cx8="http://schemas.microsoft.com/office/drawing/2016/5/14/chartex" xmlns:mc="http://schemas.openxmlformats.org/markup-compatibility/2006" xmlns:m="http://schemas.openxmlformats.org/officeDocument/2006/math" xmlns:aink="http://schemas.microsoft.com/office/drawing/2016/ink" xmlns:am3d="http://schemas.microsoft.com/office/drawing/2017/model3d" xmlns:oel="http://schemas.microsoft.com/office/2019/extlst" xmlns:r="http://schemas.openxmlformats.org/officeDocument/2006/relationships" xmlns:wp14="http://schemas.microsoft.com/office/word/2010/wordprocessingDrawing" xmlns:wp="http://schemas.openxmlformats.org/drawingml/2006/wordprocessingDrawing" xmlns:wpg="http://schemas.microsoft.com/office/word/2010/wordprocessingGroup" xmlns:wpi="http://schemas.microsoft.com/office/word/2010/wordprocessingInk" xmlns:wps="http://schemas.microsoft.com/office/word/2010/wordprocessingShape" xmlns:o="urn:schemas-microsoft-com:office:office" xmlns:v="urn:schemas-microsoft-com:vml" xmlns:w10="urn:schemas-microsoft-com:office:word" xmlns:w="http://schemas.openxmlformats.org/wordprocessingml/2006/main" xmlns:w14="http://schemas.microsoft.com/office/word/2010/wordml" xmlns:w15="http://schemas.microsoft.com/office/word/2012/wordml" xmlns:w16cex="http://schemas.microsoft.com/office/word/2018/wordml/cex" xmlns:w16cid="http://schemas.microsoft.com/office/word/2016/wordml/cid" xmlns:w16="http://schemas.microsoft.com/office/word/2018/wordml" xmlns:w16sdtdh="http://schemas.microsoft.com/office/word/2020/wordml/sdtdatahash" xmlns:w16sdtfl="http://schemas.microsoft.com/office/word/2024/wordml/sdtformatlock" xmlns:w16se="http://schemas.microsoft.com/office/word/2015/wordml/symex" xmlns:w16du="http://schemas.microsoft.com/office/word/2023/wordml/word16du" xmlns:wne="http://schemas.microsoft.com/office/word/2006/wordml" mc:Ignorable="w14 w15 w16se w16cid w16 w16cex w16sdtdh w16sdtfl w16du wp14">
+  <w:p>
+    <w:pPr>
+      <w:pStyle w:val="Footer"/>
+    </w:pPr>
+  </w:p>
+</w:ftr>
+</file>
+
+<file path=word/footer2.xml><?xml version="1.0" encoding="utf-8"?>
+<w:ftr xmlns:wpc="http://schemas.microsoft.com/office/word/2010/wordprocessingCanvas" xmlns:cx="http://schemas.microsoft.com/office/drawing/2014/chartex" xmlns:cx1="http://schemas.microsoft.com/office/drawing/2015/9/8/chartex" xmlns:cx2="http://schemas.microsoft.com/office/drawing/2015/10/21/chartex" xmlns:cx3="http://schemas.microsoft.com/office/drawing/2016/5/9/chartex" xmlns:cx4="http://schemas.microsoft.com/office/drawing/2016/5/10/chartex" xmlns:cx5="http://schemas.microsoft.com/office/drawing/2016/5/11/chartex" xmlns:cx6="http://schemas.microsoft.com/office/drawing/2016/5/12/chartex" xmlns:cx7="http://schemas.microsoft.com/office/drawing/2016/5/13/chartex" xmlns:cx8="http://schemas.microsoft.com/office/drawing/2016/5/14/chartex" xmlns:mc="http://schemas.openxmlformats.org/markup-compatibility/2006" xmlns:m="http://schemas.openxmlformats.org/officeDocument/2006/math" xmlns:aink="http://schemas.microsoft.com/office/drawing/2016/ink" xmlns:am3d="http://schemas.microsoft.com/office/drawing/2017/model3d" xmlns:oel="http://schemas.microsoft.com/office/2019/extlst" xmlns:r="http://schemas.openxmlformats.org/officeDocument/2006/relationships" xmlns:wp14="http://schemas.microsoft.com/office/word/2010/wordprocessingDrawing" xmlns:wp="http://schemas.openxmlformats.org/drawingml/2006/wordprocessingDrawing" xmlns:wpg="http://schemas.microsoft.com/office/word/2010/wordprocessingGroup" xmlns:wpi="http://schemas.microsoft.com/office/word/2010/wordprocessingInk" xmlns:wps="http://schemas.microsoft.com/office/word/2010/wordprocessingShape" xmlns:o="urn:schemas-microsoft-com:office:office" xmlns:v="urn:schemas-microsoft-com:vml" xmlns:w10="urn:schemas-microsoft-com:office:word" xmlns:w="http://schemas.openxmlformats.org/wordprocessingml/2006/main" xmlns:w14="http://schemas.microsoft.com/office/word/2010/wordml" xmlns:w15="http://schemas.microsoft.com/office/word/2012/wordml" xmlns:w16cex="http://schemas.microsoft.com/office/word/2018/wordml/cex" xmlns:w16cid="http://schemas.microsoft.com/office/word/2016/wordml/cid" xmlns:w16="http://schemas.microsoft.com/office/word/2018/wordml" xmlns:w16sdtdh="http://schemas.microsoft.com/office/word/2020/wordml/sdtdatahash" xmlns:w16sdtfl="http://schemas.microsoft.com/office/word/2024/wordml/sdtformatlock" xmlns:w16se="http://schemas.microsoft.com/office/word/2015/wordml/symex" xmlns:w16du="http://schemas.microsoft.com/office/word/2023/wordml/word16du" xmlns:wne="http://schemas.microsoft.com/office/word/2006/wordml" mc:Ignorable="w14 w15 w16se w16cid w16 w16cex w16sdtdh w16sdtfl w16du wp14">
+  <w:p>
+    <w:pPr>
+      <w:pStyle w:val="Footer"/>
+    </w:pPr>
+  </w:p>
+</w:ftr>
+</file>
+
+<file path=word/footer3.xml><?xml version="1.0" encoding="utf-8"?>
+<w:ftr xmlns:wpc="http://schemas.microsoft.com/office/word/2010/wordprocessingCanvas" xmlns:cx="http://schemas.microsoft.com/office/drawing/2014/chartex" xmlns:cx1="http://schemas.microsoft.com/office/drawing/2015/9/8/chartex" xmlns:cx2="http://schemas.microsoft.com/office/drawing/2015/10/21/chartex" xmlns:cx3="http://schemas.microsoft.com/office/drawing/2016/5/9/chartex" xmlns:cx4="http://schemas.microsoft.com/office/drawing/2016/5/10/chartex" xmlns:cx5="http://schemas.microsoft.com/office/drawing/2016/5/11/chartex" xmlns:cx6="http://schemas.microsoft.com/office/drawing/2016/5/12/chartex" xmlns:cx7="http://schemas.microsoft.com/office/drawing/2016/5/13/chartex" xmlns:cx8="http://schemas.microsoft.com/office/drawing/2016/5/14/chartex" xmlns:mc="http://schemas.openxmlformats.org/markup-compatibility/2006" xmlns:m="http://schemas.openxmlformats.org/officeDocument/2006/math" xmlns:aink="http://schemas.microsoft.com/office/drawing/2016/ink" xmlns:am3d="http://schemas.microsoft.com/office/drawing/2017/model3d" xmlns:oel="http://schemas.microsoft.com/office/2019/extlst" xmlns:r="http://schemas.openxmlformats.org/officeDocument/2006/relationships" xmlns:wp14="http://schemas.microsoft.com/office/word/2010/wordprocessingDrawing" xmlns:wp="http://schemas.openxmlformats.org/drawingml/2006/wordprocessingDrawing" xmlns:wpg="http://schemas.microsoft.com/office/word/2010/wordprocessingGroup" xmlns:wpi="http://schemas.microsoft.com/office/word/2010/wordprocessingInk" xmlns:wps="http://schemas.microsoft.com/office/word/2010/wordprocessingShape" xmlns:o="urn:schemas-microsoft-com:office:office" xmlns:v="urn:schemas-microsoft-com:vml" xmlns:w10="urn:schemas-microsoft-com:office:word" xmlns:w="http://schemas.openxmlformats.org/wordprocessingml/2006/main" xmlns:w14="http://schemas.microsoft.com/office/word/2010/wordml" xmlns:w15="http://schemas.microsoft.com/office/word/2012/wordml" xmlns:w16cex="http://schemas.microsoft.com/office/word/2018/wordml/cex" xmlns:w16cid="http://schemas.microsoft.com/office/word/2016/wordml/cid" xmlns:w16="http://schemas.microsoft.com/office/word/2018/wordml" xmlns:w16sdtdh="http://schemas.microsoft.com/office/word/2020/wordml/sdtdatahash" xmlns:w16sdtfl="http://schemas.microsoft.com/office/word/2024/wordml/sdtformatlock" xmlns:w16se="http://schemas.microsoft.com/office/word/2015/wordml/symex" xmlns:w16du="http://schemas.microsoft.com/office/word/2023/wordml/word16du" xmlns:wne="http://schemas.microsoft.com/office/word/2006/wordml" mc:Ignorable="w14 w15 w16se w16cid w16 w16cex w16sdtdh w16sdtfl w16du wp14">
+  <w:p>
+    <w:pPr>
+      <w:pStyle w:val="Footer"/>
+    </w:pPr>
+  </w:p>
+</w:ftr>
+</file>
+
+<file path=word/footnotes.xml><?xml version="1.0" encoding="utf-8"?>
+<w:footnotes xmlns:wpc="http://schemas.microsoft.com/office/word/2010/wordprocessingCanvas" xmlns:cx="http://schemas.microsoft.com/office/drawing/2014/chartex" xmlns:cx1="http://schemas.microsoft.com/office/drawing/2015/9/8/chartex" xmlns:cx2="http://schemas.microsoft.com/office/drawing/2015/10/21/chartex" xmlns:cx3="http://schemas.microsoft.com/office/drawing/2016/5/9/chartex" xmlns:cx4="http://schemas.microsoft.com/office/drawing/2016/5/10/chartex" xmlns:cx5="http://schemas.microsoft.com/office/drawing/2016/5/11/chartex" xmlns:cx6="http://schemas.microsoft.com/office/drawing/2016/5/12/chartex" xmlns:cx7="http://schemas.microsoft.com/office/drawing/2016/5/13/chartex" xmlns:cx8="http://schemas.microsoft.com/office/drawing/2016/5/14/chartex" xmlns:mc="http://schemas.openxmlformats.org/markup-compatibility/2006" xmlns:m="http://schemas.openxmlformats.org/officeDocument/2006/math" xmlns:aink="http://schemas.microsoft.com/office/drawing/2016/ink" xmlns:am3d="http://schemas.microsoft.com/office/drawing/2017/model3d" xmlns:oel="http://schemas.microsoft.com/office/2019/extlst" xmlns:r="http://schemas.openxmlformats.org/officeDocument/2006/relationships" xmlns:wp14="http://schemas.microsoft.com/office/word/2010/wordprocessingDrawing" xmlns:wp="http://schemas.openxmlformats.org/drawingml/2006/wordprocessingDrawing" xmlns:wpg="http://schemas.microsoft.com/office/word/2010/wordprocessingGroup" xmlns:wpi="http://schemas.microsoft.com/office/word/2010/wordprocessingInk" xmlns:wps="http://schemas.microsoft.com/office/word/2010/wordprocessingShape" xmlns:o="urn:schemas-microsoft-com:office:office" xmlns:v="urn:schemas-microsoft-com:vml" xmlns:w10="urn:schemas-microsoft-com:office:word" xmlns:w="http://schemas.openxmlformats.org/wordprocessingml/2006/main" xmlns:w14="http://schemas.microsoft.com/office/word/2010/wordml" xmlns:w15="http://schemas.microsoft.com/office/word/2012/wordml" xmlns:w16cex="http://schemas.microsoft.com/office/word/2018/wordml/cex" xmlns:w16cid="http://schemas.microsoft.com/office/word/2016/wordml/cid" xmlns:w16="http://schemas.microsoft.com/office/word/2018/wordml" xmlns:w16sdtdh="http://schemas.microsoft.com/office/word/2020/wordml/sdtdatahash" xmlns:w16sdtfl="http://schemas.microsoft.com/office/word/2024/wordml/sdtformatlock" xmlns:w16se="http://schemas.microsoft.com/office/word/2015/wordml/symex" xmlns:w16du="http://schemas.microsoft.com/office/word/2023/wordml/word16du" xmlns:wne="http://schemas.microsoft.com/office/word/2006/wordml" mc:Ignorable="w14 w15 w16se w16cid w16 w16cex w16sdtdh w16sdtfl w16du wp14">
+  <w:footnote w:type="separator" w:id="-1">
+    <w:p>
+      <w:pPr>
+        <w:spacing w:after="0" w:line="240" w:lineRule="auto"/>
+      </w:pPr>
+      <w:r>
+        <w:separator/>
+      </w:r>
+    </w:p>
+  </w:footnote>
+  <w:footnote w:type="continuationSeparator" w:id="0">
+    <w:p>
+      <w:pPr>
+        <w:spacing w:after="0" w:line="240" w:lineRule="auto"/>
+      </w:pPr>
+      <w:r>
+        <w:continuationSeparator/>
+      </w:r>
+    </w:p>
+  </w:footnote>
+</w:footnotes>
+</file>
+
+<file path=word/header1.xml><?xml version="1.0" encoding="utf-8"?>
+<w:hdr xmlns:wpc="http://schemas.microsoft.com/office/word/2010/wordprocessingCanvas" xmlns:cx="http://schemas.microsoft.com/office/drawing/2014/chartex" xmlns:cx1="http://schemas.microsoft.com/office/drawing/2015/9/8/chartex" xmlns:cx2="http://schemas.microsoft.com/office/drawing/2015/10/21/chartex" xmlns:cx3="http://schemas.microsoft.com/office/drawing/2016/5/9/chartex" xmlns:cx4="http://schemas.microsoft.com/office/drawing/2016/5/10/chartex" xmlns:cx5="http://schemas.microsoft.com/office/drawing/2016/5/11/chartex" xmlns:cx6="http://schemas.microsoft.com/office/drawing/2016/5/12/chartex" xmlns:cx7="http://schemas.microsoft.com/office/drawing/2016/5/13/chartex" xmlns:cx8="http://schemas.microsoft.com/office/drawing/2016/5/14/chartex" xmlns:mc="http://schemas.openxmlformats.org/markup-compatibility/2006" xmlns:m="http://schemas.openxmlformats.org/officeDocument/2006/math" xmlns:aink="http://schemas.microsoft.com/office/drawing/2016/ink" xmlns:am3d="http://schemas.microsoft.com/office/drawing/2017/model3d" xmlns:oel="http://schemas.microsoft.com/office/2019/extlst" xmlns:r="http://schemas.openxmlformats.org/officeDocument/2006/relationships" xmlns:wp14="http://schemas.microsoft.com/office/word/2010/wordprocessingDrawing" xmlns:wp="http://schemas.openxmlformats.org/drawingml/2006/wordprocessingDrawing" xmlns:wpg="http://schemas.microsoft.com/office/word/2010/wordprocessingGroup" xmlns:wpi="http://schemas.microsoft.com/office/word/2010/wordprocessingInk" xmlns:wps="http://schemas.microsoft.com/office/word/2010/wordprocessingShape" xmlns:o="urn:schemas-microsoft-com:office:office" xmlns:v="urn:schemas-microsoft-com:vml" xmlns:w10="urn:schemas-microsoft-com:office:word" xmlns:w="http://schemas.openxmlformats.org/wordprocessingml/2006/main" xmlns:w14="http://schemas.microsoft.com/office/word/2010/wordml" xmlns:w15="http://schemas.microsoft.com/office/word/2012/wordml" xmlns:w16cex="http://schemas.microsoft.com/office/word/2018/wordml/cex" xmlns:w16cid="http://schemas.microsoft.com/office/word/2016/wordml/cid" xmlns:w16="http://schemas.microsoft.com/office/word/2018/wordml" xmlns:w16sdtdh="http://schemas.microsoft.com/office/word/2020/wordml/sdtdatahash" xmlns:w16sdtfl="http://schemas.microsoft.com/office/word/2024/wordml/sdtformatlock" xmlns:w16se="http://schemas.microsoft.com/office/word/2015/wordml/symex" xmlns:w16du="http://schemas.microsoft.com/office/word/2023/wordml/word16du" xmlns:wne="http://schemas.microsoft.com/office/word/2006/wordml" mc:Ignorable="w14 w15 w16se w16cid w16 w16cex w16sdtdh w16sdtfl w16du wp14">
+  <w:p>
+    <w:pPr>
+      <w:pStyle w:val="Header"/>
+    </w:pPr>
+  </w:p>
+</w:hdr>
+</file>
+
+<file path=word/header2.xml><?xml version="1.0" encoding="utf-8"?>
+<w:hdr xmlns:wpc="http://schemas.microsoft.com/office/word/2010/wordprocessingCanvas" xmlns:cx="http://schemas.microsoft.com/office/drawing/2014/chartex" xmlns:cx1="http://schemas.microsoft.com/office/drawing/2015/9/8/chartex" xmlns:cx2="http://schemas.microsoft.com/office/drawing/2015/10/21/chartex" xmlns:cx3="http://schemas.microsoft.com/office/drawing/2016/5/9/chartex" xmlns:cx4="http://schemas.microsoft.com/office/drawing/2016/5/10/chartex" xmlns:cx5="http://schemas.microsoft.com/office/drawing/2016/5/11/chartex" xmlns:cx6="http://schemas.microsoft.com/office/drawing/2016/5/12/chartex" xmlns:cx7="http://schemas.microsoft.com/office/drawing/2016/5/13/chartex" xmlns:cx8="http://schemas.microsoft.com/office/drawing/2016/5/14/chartex" xmlns:mc="http://schemas.openxmlformats.org/markup-compatibility/2006" xmlns:m="http://schemas.openxmlformats.org/officeDocument/2006/math" xmlns:aink="http://schemas.microsoft.com/office/drawing/2016/ink" xmlns:am3d="http://schemas.microsoft.com/office/drawing/2017/model3d" xmlns:oel="http://schemas.microsoft.com/office/2019/extlst" xmlns:r="http://schemas.openxmlformats.org/officeDocument/2006/relationships" xmlns:wp14="http://schemas.microsoft.com/office/word/2010/wordprocessingDrawing" xmlns:wp="http://schemas.openxmlformats.org/drawingml/2006/wordprocessingDrawing" xmlns:wpg="http://schemas.microsoft.com/office/word/2010/wordprocessingGroup" xmlns:wpi="http://schemas.microsoft.com/office/word/2010/wordprocessingInk" xmlns:wps="http://schemas.microsoft.com/office/word/2010/wordprocessingShape" xmlns:o="urn:schemas-microsoft-com:office:office" xmlns:v="urn:schemas-microsoft-com:vml" xmlns:w10="urn:schemas-microsoft-com:office:word" xmlns:w="http://schemas.openxmlformats.org/wordprocessingml/2006/main" xmlns:w14="http://schemas.microsoft.com/office/word/2010/wordml" xmlns:w15="http://schemas.microsoft.com/office/word/2012/wordml" xmlns:w16cex="http://schemas.microsoft.com/office/word/2018/wordml/cex" xmlns:w16cid="http://schemas.microsoft.com/office/word/2016/wordml/cid" xmlns:w16="http://schemas.microsoft.com/office/word/2018/wordml" xmlns:w16sdtdh="http://schemas.microsoft.com/office/word/2020/wordml/sdtdatahash" xmlns:w16sdtfl="http://schemas.microsoft.com/office/word/2024/wordml/sdtformatlock" xmlns:w16se="http://schemas.microsoft.com/office/word/2015/wordml/symex" xmlns:w16du="http://schemas.microsoft.com/office/word/2023/wordml/word16du" xmlns:wne="http://schemas.microsoft.com/office/word/2006/wordml" mc:Ignorable="w14 w15 w16se w16cid w16 w16cex w16sdtdh w16sdtfl w16du wp14">
+  <w:p>
+    <w:pPr>
+      <w:pStyle w:val="Header"/>
+    </w:pPr>
+    <w:r>
+      <w:rPr>
+        <w:noProof/>
+      </w:rPr>
+      <w:drawing>
+        <wp:anchor distT="0" distB="0" distL="114300" distR="114300" simplePos="0" relativeHeight="251659264" behindDoc="1" locked="0" layoutInCell="1" allowOverlap="1" wp14:anchorId="23347F8F" wp14:editId="2318728C">
+          <wp:simplePos x="0" y="0"/>
+          <wp:positionH relativeFrom="column">
+            <wp:posOffset>-520065</wp:posOffset>
+          </wp:positionH>
+          <wp:positionV relativeFrom="paragraph">
+            <wp:posOffset>-359361</wp:posOffset>
+          </wp:positionV>
+          <wp:extent cx="7623016" cy="10755936"/>
+          <wp:effectExtent l="0" t="0" r="0" b="1270"/>
+          <wp:wrapNone/>
+          <wp:docPr id="613975664" name="Picture 613975664"/>
+          <wp:cNvGraphicFramePr>
+            <a:graphicFrameLocks xmlns:a="http://schemas.openxmlformats.org/drawingml/2006/main" noChangeAspect="1"/>
+          </wp:cNvGraphicFramePr>
+          <a:graphic xmlns:a="http://schemas.openxmlformats.org/drawingml/2006/main">
+            <a:graphicData uri="http://schemas.openxmlformats.org/drawingml/2006/picture">
+              <pic:pic xmlns:pic="http://schemas.openxmlformats.org/drawingml/2006/picture">
+                <pic:nvPicPr>
+                  <pic:cNvPr id="7" name="Picture 7"/>
+                  <pic:cNvPicPr/>
+                </pic:nvPicPr>
+                <pic:blipFill>
+                  <a:blip r:embed="rId1">
+                    <a:extLst>
+                      <a:ext uri="{28A0092B-C50C-407E-A947-70E740481C1C}">
+                        <a14:useLocalDpi xmlns:a14="http://schemas.microsoft.com/office/drawing/2010/main" val="0"/>
+                      </a:ext>
+                    </a:extLst>
+                  </a:blip>
+                  <a:stretch>
+                    <a:fillRect/>
+                  </a:stretch>
+                </pic:blipFill>
+                <pic:spPr>
+                  <a:xfrm>
+                    <a:off x="0" y="0"/>
+                    <a:ext cx="7623016" cy="10755936"/>
+                  </a:xfrm>
+                  <a:prstGeom prst="rect">
+                    <a:avLst/>
+                  </a:prstGeom>
+                </pic:spPr>
+              </pic:pic>
+            </a:graphicData>
+          </a:graphic>
+          <wp14:sizeRelH relativeFrom="page">
+            <wp14:pctWidth>0</wp14:pctWidth>
+          </wp14:sizeRelH>
+          <wp14:sizeRelV relativeFrom="page">
+            <wp14:pctHeight>0</wp14:pctHeight>
+          </wp14:sizeRelV>
+        </wp:anchor>
+      </w:drawing>
+    </w:r>
+  </w:p>
+</w:hdr>
+</file>
+
+<file path=word/header3.xml><?xml version="1.0" encoding="utf-8"?>
+<w:hdr xmlns:wpc="http://schemas.microsoft.com/office/word/2010/wordprocessingCanvas" xmlns:cx="http://schemas.microsoft.com/office/drawing/2014/chartex" xmlns:cx1="http://schemas.microsoft.com/office/drawing/2015/9/8/chartex" xmlns:cx2="http://schemas.microsoft.com/office/drawing/2015/10/21/chartex" xmlns:cx3="http://schemas.microsoft.com/office/drawing/2016/5/9/chartex" xmlns:cx4="http://schemas.microsoft.com/office/drawing/2016/5/10/chartex" xmlns:cx5="http://schemas.microsoft.com/office/drawing/2016/5/11/chartex" xmlns:cx6="http://schemas.microsoft.com/office/drawing/2016/5/12/chartex" xmlns:cx7="http://schemas.microsoft.com/office/drawing/2016/5/13/chartex" xmlns:cx8="http://schemas.microsoft.com/office/drawing/2016/5/14/chartex" xmlns:mc="http://schemas.openxmlformats.org/markup-compatibility/2006" xmlns:m="http://schemas.openxmlformats.org/officeDocument/2006/math" xmlns:aink="http://schemas.microsoft.com/office/drawing/2016/ink" xmlns:am3d="http://schemas.microsoft.com/office/drawing/2017/model3d" xmlns:oel="http://schemas.microsoft.com/office/2019/extlst" xmlns:r="http://schemas.openxmlformats.org/officeDocument/2006/relationships" xmlns:wp14="http://schemas.microsoft.com/office/word/2010/wordprocessingDrawing" xmlns:wp="http://schemas.openxmlformats.org/drawingml/2006/wordprocessingDrawing" xmlns:wpg="http://schemas.microsoft.com/office/word/2010/wordprocessingGroup" xmlns:wpi="http://schemas.microsoft.com/office/word/2010/wordprocessingInk" xmlns:wps="http://schemas.microsoft.com/office/word/2010/wordprocessingShape" xmlns:o="urn:schemas-microsoft-com:office:office" xmlns:v="urn:schemas-microsoft-com:vml" xmlns:w10="urn:schemas-microsoft-com:office:word" xmlns:w="http://schemas.openxmlformats.org/wordprocessingml/2006/main" xmlns:w14="http://schemas.microsoft.com/office/word/2010/wordml" xmlns:w15="http://schemas.microsoft.com/office/word/2012/wordml" xmlns:w16cex="http://schemas.microsoft.com/office/word/2018/wordml/cex" xmlns:w16cid="http://schemas.microsoft.com/office/word/2016/wordml/cid" xmlns:w16="http://schemas.microsoft.com/office/word/2018/wordml" xmlns:w16sdtdh="http://schemas.microsoft.com/office/word/2020/wordml/sdtdatahash" xmlns:w16sdtfl="http://schemas.microsoft.com/office/word/2024/wordml/sdtformatlock" xmlns:w16se="http://schemas.microsoft.com/office/word/2015/wordml/symex" xmlns:w16du="http://schemas.microsoft.com/office/word/2023/wordml/word16du" xmlns:wne="http://schemas.microsoft.com/office/word/2006/wordml" mc:Ignorable="w14 w15 w16se w16cid w16 w16cex w16sdtdh w16sdtfl w16du wp14">
+  <w:p>
+    <w:pPr>
+      <w:pStyle w:val="Header"/>
+    </w:pPr>
+  </w:p>
+</w:hdr>
 </file>
 
 <file path=word/styles.xml><?xml version="1.0" encoding="utf-8"?>
@@ -2541,6 +3304,13 @@
   <w:style w:type="paragraph" w:default="1" w:styleId="Normal">
     <w:name w:val="Normal"/>
     <w:qFormat/>
+    <w:pPr>
+      <w:spacing w:after="40" w:line="200" w:lineRule="atLeast"/>
+    </w:pPr>
+    <w:rPr>
+      <w:rFonts w:ascii="Aptos" w:hAnsi="Aptos"/>
+      <w:sz w:val="18"/>
+    </w:rPr>
   </w:style>
   <w:style w:type="paragraph" w:styleId="Heading1">
     <w:name w:val="heading 1"/>
@@ -2553,13 +3323,13 @@
     <w:pPr>
       <w:keepNext/>
       <w:keepLines/>
-      <w:spacing w:before="360" w:after="80"/>
+      <w:spacing w:before="80" w:line="240" w:lineRule="atLeast"/>
       <w:outlineLvl w:val="0"/>
     </w:pPr>
     <w:rPr>
-      <w:rFonts w:asciiTheme="majorHAnsi" w:eastAsiaTheme="majorEastAsia" w:hAnsiTheme="majorHAnsi" w:cstheme="majorBidi"/>
-      <w:color w:val="0F4761" w:themeColor="accent1" w:themeShade="BF"/>
-      <w:sz w:val="40"/>
+      <w:rFonts w:ascii="Aptos Display" w:eastAsiaTheme="majorEastAsia" w:hAnsi="Aptos Display" w:cstheme="majorBidi"/>
+      <w:color w:val="0F4761"/>
+      <w:sz w:val="26"/>
       <w:szCs w:val="40"/>
     </w:rPr>
   </w:style>
@@ -2576,13 +3346,13 @@
     <w:pPr>
       <w:keepNext/>
       <w:keepLines/>
-      <w:spacing w:before="160" w:after="80"/>
+      <w:spacing w:before="80" w:line="220" w:lineRule="atLeast"/>
       <w:outlineLvl w:val="1"/>
     </w:pPr>
     <w:rPr>
-      <w:rFonts w:asciiTheme="majorHAnsi" w:eastAsiaTheme="majorEastAsia" w:hAnsiTheme="majorHAnsi" w:cstheme="majorBidi"/>
-      <w:color w:val="0F4761" w:themeColor="accent1" w:themeShade="BF"/>
-      <w:sz w:val="32"/>
+      <w:rFonts w:ascii="Aptos Display" w:eastAsiaTheme="majorEastAsia" w:hAnsi="Aptos Display" w:cstheme="majorBidi"/>
+      <w:color w:val="0F4761"/>
+      <w:sz w:val="24"/>
       <w:szCs w:val="32"/>
     </w:rPr>
   </w:style>
@@ -2622,7 +3392,7 @@
     <w:pPr>
       <w:keepNext/>
       <w:keepLines/>
-      <w:spacing w:before="80" w:after="40"/>
+      <w:spacing w:before="80"/>
       <w:outlineLvl w:val="3"/>
     </w:pPr>
     <w:rPr>
@@ -2645,7 +3415,7 @@
     <w:pPr>
       <w:keepNext/>
       <w:keepLines/>
-      <w:spacing w:before="80" w:after="40"/>
+      <w:spacing w:before="80"/>
       <w:outlineLvl w:val="4"/>
     </w:pPr>
     <w:rPr>
@@ -2775,9 +3545,9 @@
     <w:uiPriority w:val="9"/>
     <w:rsid w:val="003264AD"/>
     <w:rPr>
-      <w:rFonts w:asciiTheme="majorHAnsi" w:eastAsiaTheme="majorEastAsia" w:hAnsiTheme="majorHAnsi" w:cstheme="majorBidi"/>
-      <w:color w:val="0F4761" w:themeColor="accent1" w:themeShade="BF"/>
-      <w:sz w:val="40"/>
+      <w:rFonts w:ascii="Aptos Display" w:eastAsiaTheme="majorEastAsia" w:hAnsi="Aptos Display" w:cstheme="majorBidi"/>
+      <w:color w:val="0F4761"/>
+      <w:sz w:val="26"/>
       <w:szCs w:val="40"/>
     </w:rPr>
   </w:style>
@@ -2789,9 +3559,8 @@
     <w:semiHidden/>
     <w:rsid w:val="003264AD"/>
     <w:rPr>
-      <w:rFonts w:asciiTheme="majorHAnsi" w:eastAsiaTheme="majorEastAsia" w:hAnsiTheme="majorHAnsi" w:cstheme="majorBidi"/>
-      <w:color w:val="0F4761" w:themeColor="accent1" w:themeShade="BF"/>
-      <w:sz w:val="32"/>
+      <w:rFonts w:ascii="Aptos Display" w:eastAsiaTheme="majorEastAsia" w:hAnsi="Aptos Display" w:cstheme="majorBidi"/>
+      <w:color w:val="0F4761"/>
       <w:szCs w:val="32"/>
     </w:rPr>
   </w:style>
@@ -3088,7 +3857,6 @@
       <w:i/>
       <w:iCs/>
       <w:color w:val="0E2841" w:themeColor="text2"/>
-      <w:sz w:val="18"/>
       <w:szCs w:val="18"/>
     </w:rPr>
   </w:style>
@@ -3256,6 +4024,50 @@
         <w:shd w:val="clear" w:color="auto" w:fill="C1E4F5" w:themeFill="accent1" w:themeFillTint="33"/>
       </w:tcPr>
     </w:tblStylePr>
+  </w:style>
+  <w:style w:type="paragraph" w:styleId="Header">
+    <w:name w:val="header"/>
+    <w:basedOn w:val="Normal"/>
+    <w:link w:val="HeaderChar"/>
+    <w:uiPriority w:val="99"/>
+    <w:unhideWhenUsed/>
+    <w:rsid w:val="007879C2"/>
+    <w:pPr>
+      <w:tabs>
+        <w:tab w:val="center" w:pos="4513"/>
+        <w:tab w:val="right" w:pos="9026"/>
+      </w:tabs>
+      <w:spacing w:after="0" w:line="240" w:lineRule="auto"/>
+    </w:pPr>
+  </w:style>
+  <w:style w:type="character" w:customStyle="1" w:styleId="HeaderChar">
+    <w:name w:val="Header Char"/>
+    <w:basedOn w:val="DefaultParagraphFont"/>
+    <w:link w:val="Header"/>
+    <w:uiPriority w:val="99"/>
+    <w:rsid w:val="007879C2"/>
+  </w:style>
+  <w:style w:type="paragraph" w:styleId="Footer">
+    <w:name w:val="footer"/>
+    <w:basedOn w:val="Normal"/>
+    <w:link w:val="FooterChar"/>
+    <w:uiPriority w:val="99"/>
+    <w:unhideWhenUsed/>
+    <w:rsid w:val="007879C2"/>
+    <w:pPr>
+      <w:tabs>
+        <w:tab w:val="center" w:pos="4513"/>
+        <w:tab w:val="right" w:pos="9026"/>
+      </w:tabs>
+      <w:spacing w:after="0" w:line="240" w:lineRule="auto"/>
+    </w:pPr>
+  </w:style>
+  <w:style w:type="character" w:customStyle="1" w:styleId="FooterChar">
+    <w:name w:val="Footer Char"/>
+    <w:basedOn w:val="DefaultParagraphFont"/>
+    <w:link w:val="Footer"/>
+    <w:uiPriority w:val="99"/>
+    <w:rsid w:val="007879C2"/>
   </w:style>
 </w:styles>
 </file>

</xml_diff>